<commit_message>
Fourth-round revision: code-basis scope, model-conditional wording, best-found optima
- rbo/limit_states.CODE_BASIS records the fixed AISC 360-16 / ASCE 7-05 basis
- make_figures: Table 3 model-factor row states the c.o.v. for each use
- manuscript: code-basis paragraph (360-22 and 7-22 cited as superseding
  editions), model-conditional intervals for the t3 residual, best-found
  wording for optima, mass baselines in the abstract, ten-design count in
  Table 1 and Fig. 3, uncalibrated cost index
- response_to_reviewers_R4

Co-Authored-By: Claude Opus 5.5 <noreply@anthropic.com>
Claude-Session: https://claude.ai/code/session_01GFzJmMfEsX3LJEx4o2YoAb
</commit_message>
<xml_diff>
--- a/Research/reliability_optimization/paper/main.docx
+++ b/Research/reliability_optimization/paper/main.docx
@@ -385,7 +385,91 @@
         <w:t xml:space="preserve"> </w:t>
       </w:r>
       <w:r>
-        <w:t xml:space="preserve">360-16.</w:t>
+        <w:t xml:space="preserve">360-16</w:t>
+      </w:r>
+      <w:r>
+        <w:t xml:space="preserve"> </w:t>
+      </w:r>
+      <w:r>
+        <w:t xml:space="preserve">under</w:t>
+      </w:r>
+      <w:r>
+        <w:t xml:space="preserve"> </w:t>
+      </w:r>
+      <w:r>
+        <w:t xml:space="preserve">the</w:t>
+      </w:r>
+      <w:r>
+        <w:t xml:space="preserve"> </w:t>
+      </w:r>
+      <w:r>
+        <w:t xml:space="preserve">ASCE</w:t>
+      </w:r>
+      <w:r>
+        <w:t xml:space="preserve"> </w:t>
+      </w:r>
+      <w:r>
+        <w:t xml:space="preserve">7-05</w:t>
+      </w:r>
+      <w:r>
+        <w:t xml:space="preserve"> </w:t>
+      </w:r>
+      <w:r>
+        <w:t xml:space="preserve">load</w:t>
+      </w:r>
+      <w:r>
+        <w:t xml:space="preserve"> </w:t>
+      </w:r>
+      <w:r>
+        <w:t xml:space="preserve">combinations,</w:t>
+      </w:r>
+      <w:r>
+        <w:t xml:space="preserve"> </w:t>
+      </w:r>
+      <w:r>
+        <w:t xml:space="preserve">a</w:t>
+      </w:r>
+      <w:r>
+        <w:t xml:space="preserve"> </w:t>
+      </w:r>
+      <w:r>
+        <w:t xml:space="preserve">fixed</w:t>
+      </w:r>
+      <w:r>
+        <w:t xml:space="preserve"> </w:t>
+      </w:r>
+      <w:r>
+        <w:t xml:space="preserve">code</w:t>
+      </w:r>
+      <w:r>
+        <w:t xml:space="preserve"> </w:t>
+      </w:r>
+      <w:r>
+        <w:t xml:space="preserve">basis</w:t>
+      </w:r>
+      <w:r>
+        <w:t xml:space="preserve"> </w:t>
+      </w:r>
+      <w:r>
+        <w:t xml:space="preserve">used</w:t>
+      </w:r>
+      <w:r>
+        <w:t xml:space="preserve"> </w:t>
+      </w:r>
+      <w:r>
+        <w:t xml:space="preserve">as</w:t>
+      </w:r>
+      <w:r>
+        <w:t xml:space="preserve"> </w:t>
+      </w:r>
+      <w:r>
+        <w:t xml:space="preserve">a</w:t>
+      </w:r>
+      <w:r>
+        <w:t xml:space="preserve"> </w:t>
+      </w:r>
+      <w:r>
+        <w:t xml:space="preserve">benchmark.</w:t>
       </w:r>
       <w:r>
         <w:t xml:space="preserve"> </w:t>
@@ -1353,7 +1437,37 @@
         <w:t xml:space="preserve"> </w:t>
       </w:r>
       <w:r>
-        <w:t xml:space="preserve">confidence,</w:t>
+        <w:t xml:space="preserve">confidence</w:t>
+      </w:r>
+      <w:r>
+        <w:t xml:space="preserve"> </w:t>
+      </w:r>
+      <w:r>
+        <w:t xml:space="preserve">in</w:t>
+      </w:r>
+      <w:r>
+        <w:t xml:space="preserve"> </w:t>
+      </w:r>
+      <w:r>
+        <w:t xml:space="preserve">the</w:t>
+      </w:r>
+      <w:r>
+        <w:t xml:space="preserve"> </w:t>
+      </w:r>
+      <w:r>
+        <w:t xml:space="preserve">baseline</w:t>
+      </w:r>
+      <w:r>
+        <w:t xml:space="preserve"> </w:t>
+      </w:r>
+      <w:r>
+        <w:t xml:space="preserve">surrogate</w:t>
+      </w:r>
+      <w:r>
+        <w:t xml:space="preserve"> </w:t>
+      </w:r>
+      <w:r>
+        <w:t xml:space="preserve">model,</w:t>
       </w:r>
       <w:r>
         <w:t xml:space="preserve"> </w:t>
@@ -1419,37 +1533,7 @@
         <w:t xml:space="preserve"> </w:t>
       </w:r>
       <w:r>
-        <w:t xml:space="preserve">so</w:t>
-      </w:r>
-      <w:r>
-        <w:t xml:space="preserve"> </w:t>
-      </w:r>
-      <w:r>
-        <w:t xml:space="preserve">in</w:t>
-      </w:r>
-      <w:r>
-        <w:t xml:space="preserve"> </w:t>
-      </w:r>
-      <w:r>
-        <w:t xml:space="preserve">the</w:t>
-      </w:r>
-      <w:r>
-        <w:t xml:space="preserve"> </w:t>
-      </w:r>
-      <w:r>
-        <w:t xml:space="preserve">baseline</w:t>
-      </w:r>
-      <w:r>
-        <w:t xml:space="preserve"> </w:t>
-      </w:r>
-      <w:r>
-        <w:t xml:space="preserve">surrogate</w:t>
-      </w:r>
-      <w:r>
-        <w:t xml:space="preserve"> </w:t>
-      </w:r>
-      <w:r>
-        <w:t xml:space="preserve">model,</w:t>
+        <w:t xml:space="preserve">so,</w:t>
       </w:r>
       <w:r>
         <w:t xml:space="preserve"> </w:t>
@@ -1723,6 +1807,66 @@
         <w:t xml:space="preserve"> </w:t>
       </w:r>
       <w:r>
+        <w:t xml:space="preserve">than</w:t>
+      </w:r>
+      <w:r>
+        <w:t xml:space="preserve"> </w:t>
+      </w:r>
+      <w:r>
+        <w:t xml:space="preserve">the</w:t>
+      </w:r>
+      <w:r>
+        <w:t xml:space="preserve"> </w:t>
+      </w:r>
+      <w:r>
+        <w:t xml:space="preserve">point-estimate</w:t>
+      </w:r>
+      <w:r>
+        <w:t xml:space="preserve"> </w:t>
+      </w:r>
+      <w:r>
+        <w:t xml:space="preserve">design</w:t>
+      </w:r>
+      <w:r>
+        <w:t xml:space="preserve"> </w:t>
+      </w:r>
+      <w:r>
+        <w:t xml:space="preserve">(5.2%</w:t>
+      </w:r>
+      <w:r>
+        <w:t xml:space="preserve"> </w:t>
+      </w:r>
+      <w:r>
+        <w:t xml:space="preserve">more</w:t>
+      </w:r>
+      <w:r>
+        <w:t xml:space="preserve"> </w:t>
+      </w:r>
+      <w:r>
+        <w:t xml:space="preserve">than</w:t>
+      </w:r>
+      <w:r>
+        <w:t xml:space="preserve"> </w:t>
+      </w:r>
+      <w:r>
+        <w:t xml:space="preserve">the</w:t>
+      </w:r>
+      <w:r>
+        <w:t xml:space="preserve"> </w:t>
+      </w:r>
+      <w:r>
+        <w:t xml:space="preserve">deterministic</w:t>
+      </w:r>
+      <w:r>
+        <w:t xml:space="preserve"> </w:t>
+      </w:r>
+      <w:r>
+        <w:t xml:space="preserve">optimum)</w:t>
+      </w:r>
+      <w:r>
+        <w:t xml:space="preserve"> </w:t>
+      </w:r>
+      <w:r>
         <w:t xml:space="preserve">met</w:t>
       </w:r>
       <w:r>
@@ -1849,18 +1993,42 @@
         <w:t xml:space="preserve"> </w:t>
       </w:r>
       <w:r>
+        <w:t xml:space="preserve">and</w:t>
+      </w:r>
+      <w:r>
+        <w:t xml:space="preserve"> </w:t>
+      </w:r>
+      <w:r>
+        <w:t xml:space="preserve">its</w:t>
+      </w:r>
+      <w:r>
+        <w:t xml:space="preserve"> </w:t>
+      </w:r>
+      <w:r>
+        <w:t xml:space="preserve">interval</w:t>
+      </w:r>
+      <w:r>
+        <w:t xml:space="preserve"> </w:t>
+      </w:r>
+      <w:r>
+        <w:t xml:space="preserve">is</w:t>
+      </w:r>
+      <w:r>
+        <w:t xml:space="preserve"> </w:t>
+      </w:r>
+      <w:r>
+        <w:t xml:space="preserve">model-conditional,</w:t>
+      </w:r>
+      <w:r>
+        <w:t xml:space="preserve"> </w:t>
+      </w:r>
+      <w:r>
         <w:t xml:space="preserve">not</w:t>
       </w:r>
       <w:r>
         <w:t xml:space="preserve"> </w:t>
       </w:r>
       <w:r>
-        <w:t xml:space="preserve">on</w:t>
-      </w:r>
-      <w:r>
-        <w:t xml:space="preserve"> </w:t>
-      </w:r>
-      <w:r>
         <w:t xml:space="preserve">a</w:t>
       </w:r>
       <w:r>
@@ -1939,13 +2107,13 @@
         <w:t xml:space="preserve"> </w:t>
       </w:r>
       <w:r>
-        <w:t xml:space="preserve">a</w:t>
-      </w:r>
-      <w:r>
-        <w:t xml:space="preserve"> </w:t>
-      </w:r>
-      <w:r>
-        <w:t xml:space="preserve">least-mass</w:t>
+        <w:t xml:space="preserve">the</w:t>
+      </w:r>
+      <w:r>
+        <w:t xml:space="preserve"> </w:t>
+      </w:r>
+      <w:r>
+        <w:t xml:space="preserve">lightest</w:t>
       </w:r>
       <w:r>
         <w:t xml:space="preserve"> </w:t>
@@ -1957,7 +2125,49 @@
         <w:t xml:space="preserve"> </w:t>
       </w:r>
       <w:r>
-        <w:t xml:space="preserve">at</w:t>
+        <w:t xml:space="preserve">found,</w:t>
+      </w:r>
+      <w:r>
+        <w:t xml:space="preserve"> </w:t>
+      </w:r>
+      <w:r>
+        <w:t xml:space="preserve">within</w:t>
+      </w:r>
+      <w:r>
+        <w:t xml:space="preserve"> </w:t>
+      </w:r>
+      <w:r>
+        <w:t xml:space="preserve">the</w:t>
+      </w:r>
+      <w:r>
+        <w:t xml:space="preserve"> </w:t>
+      </w:r>
+      <w:r>
+        <w:t xml:space="preserve">tested</w:t>
+      </w:r>
+      <w:r>
+        <w:t xml:space="preserve"> </w:t>
+      </w:r>
+      <w:r>
+        <w:t xml:space="preserve">search</w:t>
+      </w:r>
+      <w:r>
+        <w:t xml:space="preserve"> </w:t>
+      </w:r>
+      <w:r>
+        <w:t xml:space="preserve">budget,</w:t>
+      </w:r>
+      <w:r>
+        <w:t xml:space="preserve"> </w:t>
+      </w:r>
+      <w:r>
+        <w:t xml:space="preserve">that</w:t>
+      </w:r>
+      <w:r>
+        <w:t xml:space="preserve"> </w:t>
+      </w:r>
+      <w:r>
+        <w:t xml:space="preserve">meets</w:t>
       </w:r>
       <w:r>
         <w:t xml:space="preserve"> </w:t>
@@ -2742,7 +2952,13 @@
         <w:t xml:space="preserve"> </w:t>
       </w:r>
       <w:r>
-        <w:t xml:space="preserve">RBDO (RBDO-C) that also enforces every LRFD and serviceability check, and a</w:t>
+        <w:t xml:space="preserve">RBDO (RBDO-C) that also enforces every LRFD (AISC 360-16, ASCE 7-05) and</w:t>
+      </w:r>
+      <w:r>
+        <w:t xml:space="preserve"> </w:t>
+      </w:r>
+      <w:r>
+        <w:t xml:space="preserve">serviceability check, and a</w:t>
       </w:r>
       <w:r>
         <w:t xml:space="preserve"> </w:t>
@@ -4639,7 +4855,7 @@
               <w:rPr>
                 <w:sz w:val="16"/>
               </w:rPr>
-              <w:t xml:space="preserve">MC of 8 designs incl. tail strata</w:t>
+              <w:t xml:space="preserve">MC of 10 designs (8 principal + 2 three-storey variants) incl. tail strata</w:t>
             </w:r>
           </w:p>
         </w:tc>
@@ -9154,6 +9370,137 @@
       </w:r>
       <w:r>
         <w:t xml:space="preserve">span/360.</w:t>
+      </w:r>
+    </w:p>
+    <w:p>
+      <w:pPr>
+        <w:pStyle w:val="BodyText"/>
+      </w:pPr>
+      <w:r>
+        <w:rPr>
+          <w:iCs/>
+          <w:i/>
+        </w:rPr>
+        <w:t xml:space="preserve">Code basis.</w:t>
+      </w:r>
+      <w:r>
+        <w:t xml:space="preserve"> </w:t>
+      </w:r>
+      <w:r>
+        <w:t xml:space="preserve">AISC 360-16 and ASCE 7-05 are used as a fixed, internally consistent benchmark,</w:t>
+      </w:r>
+      <w:r>
+        <w:t xml:space="preserve"> </w:t>
+      </w:r>
+      <w:r>
+        <w:t xml:space="preserve">not as the current provisions. Both have since been superseded (AISC 360-22</w:t>
+      </w:r>
+      <w:r>
+        <w:t xml:space="preserve"> </w:t>
+      </w:r>
+      <w:r>
+        <w:t xml:space="preserve">(American Institute of Steel Construction 2022)</w:t>
+      </w:r>
+      <w:r>
+        <w:t xml:space="preserve"> </w:t>
+      </w:r>
+      <w:r>
+        <w:t xml:space="preserve">and</w:t>
+      </w:r>
+      <w:r>
+        <w:t xml:space="preserve"> </w:t>
+      </w:r>
+      <w:r>
+        <w:t xml:space="preserve">ASCE/SEI 7-22</w:t>
+      </w:r>
+      <w:r>
+        <w:t xml:space="preserve"> </w:t>
+      </w:r>
+      <w:r>
+        <w:t xml:space="preserve">(American Society of Civil Engineers 2022)</w:t>
+      </w:r>
+      <w:r>
+        <w:t xml:space="preserve">). From ASCE 7-10 onwards, wind loads are based on strength-level wind</w:t>
+      </w:r>
+      <w:r>
+        <w:t xml:space="preserve"> </w:t>
+      </w:r>
+      <w:r>
+        <w:t xml:space="preserve">speeds with a load factor of 1.0, so moving to a later edition would change the definition of the</w:t>
+      </w:r>
+      <w:r>
+        <w:t xml:space="preserve"> </w:t>
+      </w:r>
+      <w:r>
+        <w:t xml:space="preserve">nominal wind load</w:t>
+      </w:r>
+      <w:r>
+        <w:t xml:space="preserve"> </w:t>
+      </w:r>
+      <m:oMath>
+        <m:r>
+          <m:t>W</m:t>
+        </m:r>
+      </m:oMath>
+      <w:r>
+        <w:t xml:space="preserve"> </w:t>
+      </w:r>
+      <w:r>
+        <w:t xml:space="preserve">together with the wind-load statistics of Table 3, not only a load</w:t>
+      </w:r>
+      <w:r>
+        <w:t xml:space="preserve"> </w:t>
+      </w:r>
+      <w:r>
+        <w:t xml:space="preserve">factor. Throughout this paper,</w:t>
+      </w:r>
+      <w:r>
+        <w:t xml:space="preserve"> </w:t>
+      </w:r>
+      <w:r>
+        <w:t xml:space="preserve">“</w:t>
+      </w:r>
+      <w:r>
+        <w:t xml:space="preserve">code-compliant</w:t>
+      </w:r>
+      <w:r>
+        <w:t xml:space="preserve">”</w:t>
+      </w:r>
+      <w:r>
+        <w:t xml:space="preserve"> </w:t>
+      </w:r>
+      <w:r>
+        <w:t xml:space="preserve">and</w:t>
+      </w:r>
+      <w:r>
+        <w:t xml:space="preserve"> </w:t>
+      </w:r>
+      <w:r>
+        <w:t xml:space="preserve">“</w:t>
+      </w:r>
+      <w:r>
+        <w:t xml:space="preserve">code checks</w:t>
+      </w:r>
+      <w:r>
+        <w:t xml:space="preserve">”</w:t>
+      </w:r>
+      <w:r>
+        <w:t xml:space="preserve"> </w:t>
+      </w:r>
+      <w:r>
+        <w:t xml:space="preserve">mean compliance with the</w:t>
+      </w:r>
+      <w:r>
+        <w:t xml:space="preserve"> </w:t>
+      </w:r>
+      <w:r>
+        <w:t xml:space="preserve">AISC 360-16 checks listed above under the ASCE 7-05 combinations. The designs have not been checked</w:t>
+      </w:r>
+      <w:r>
+        <w:t xml:space="preserve"> </w:t>
+      </w:r>
+      <w:r>
+        <w:t xml:space="preserve">against AISC 360-22 or ASCE/SEI 7-22.</w:t>
       </w:r>
     </w:p>
     <w:p>
@@ -12004,7 +12351,7 @@
               <w:rPr>
                 <w:sz w:val="16"/>
               </w:rPr>
-              <w:t xml:space="preserve">sensitivity only</w:t>
+              <w:t xml:space="preserve">baseline: 0; sensitivity study: 0.05, 0.10; RBDO-C-MU (2 frames): 0.05</w:t>
             </w:r>
           </w:p>
         </w:tc>
@@ -15818,7 +16165,88 @@
         <w:t xml:space="preserve"> </w:t>
       </w:r>
       <w:r>
-        <w:t xml:space="preserve">optimality, which is checked only for the reduced problem by enumeration. The bi-objective</w:t>
+        <w:t xml:space="preserve">optimality, which is checked only for the reduced problem by enumeration. Accordingly,</w:t>
+      </w:r>
+      <w:r>
+        <w:t xml:space="preserve"> </w:t>
+      </w:r>
+      <w:r>
+        <w:t xml:space="preserve">“</w:t>
+      </w:r>
+      <w:r>
+        <w:t xml:space="preserve">optimum</w:t>
+      </w:r>
+      <w:r>
+        <w:t xml:space="preserve">”</w:t>
+      </w:r>
+      <w:r>
+        <w:t xml:space="preserve">,</w:t>
+      </w:r>
+      <w:r>
+        <w:t xml:space="preserve"> </w:t>
+      </w:r>
+      <w:r>
+        <w:t xml:space="preserve">“</w:t>
+      </w:r>
+      <w:r>
+        <w:t xml:space="preserve">optimal design</w:t>
+      </w:r>
+      <w:r>
+        <w:t xml:space="preserve">”</w:t>
+      </w:r>
+      <w:r>
+        <w:t xml:space="preserve"> </w:t>
+      </w:r>
+      <w:r>
+        <w:t xml:space="preserve">and</w:t>
+      </w:r>
+      <w:r>
+        <w:t xml:space="preserve"> </w:t>
+      </w:r>
+      <w:r>
+        <w:t xml:space="preserve">“</w:t>
+      </w:r>
+      <w:r>
+        <w:t xml:space="preserve">minimum-mass design</w:t>
+      </w:r>
+      <w:r>
+        <w:t xml:space="preserve">”</w:t>
+      </w:r>
+      <w:r>
+        <w:t xml:space="preserve"> </w:t>
+      </w:r>
+      <w:r>
+        <w:t xml:space="preserve">denote in this paper the best feasible design found</w:t>
+      </w:r>
+      <w:r>
+        <w:t xml:space="preserve"> </w:t>
+      </w:r>
+      <w:r>
+        <w:t xml:space="preserve">within the tested optimisation budget, not a proven global minimum;</w:t>
+      </w:r>
+      <w:r>
+        <w:t xml:space="preserve"> </w:t>
+      </w:r>
+      <w:r>
+        <w:t xml:space="preserve">“</w:t>
+      </w:r>
+      <w:r>
+        <w:t xml:space="preserve">minimum mass</w:t>
+      </w:r>
+      <w:r>
+        <w:t xml:space="preserve">”</w:t>
+      </w:r>
+      <w:r>
+        <w:t xml:space="preserve"> </w:t>
+      </w:r>
+      <w:r>
+        <w:t xml:space="preserve">in the title</w:t>
+      </w:r>
+      <w:r>
+        <w:t xml:space="preserve"> </w:t>
+      </w:r>
+      <w:r>
+        <w:t xml:space="preserve">names the objective of the optimisation problem. The bi-objective</w:t>
       </w:r>
       <w:r>
         <w:t xml:space="preserve"> </w:t>
@@ -22901,7 +23329,23 @@
         <w:t xml:space="preserve"> </w:t>
       </w:r>
       <w:r>
-        <w:t xml:space="preserve">model of the tail. A</w:t>
+        <w:t xml:space="preserve">model of the tail and are therefore called</w:t>
+      </w:r>
+      <w:r>
+        <w:t xml:space="preserve"> </w:t>
+      </w:r>
+      <w:r>
+        <w:rPr>
+          <w:iCs/>
+          <w:i/>
+        </w:rPr>
+        <w:t xml:space="preserve">model-conditional</w:t>
+      </w:r>
+      <w:r>
+        <w:t xml:space="preserve"> </w:t>
+      </w:r>
+      <w:r>
+        <w:t xml:space="preserve">confidence intervals and lower bounds. A</w:t>
       </w:r>
       <w:r>
         <w:t xml:space="preserve"> </w:t>
@@ -23354,7 +23798,7 @@
         <w:pStyle w:val="BodyText"/>
       </w:pPr>
       <w:r>
-        <w:t xml:space="preserve">Tables 7 and 6 also contain the two heavier three-storey designs of</w:t>
+        <w:t xml:space="preserve">Tables 7 and 6, and Fig. 3, also contain the two heavier three-storey designs of</w:t>
       </w:r>
       <w:r>
         <w:t xml:space="preserve"> </w:t>
@@ -24101,13 +24545,13 @@
         <w:t xml:space="preserve"> </w:t>
       </w:r>
       <w:r>
-        <w:t xml:space="preserve">bays. Including the bootstrap uncertainty of the fit, the combined intervals are 0.07–0.12 wide on</w:t>
-      </w:r>
-      <w:r>
-        <w:t xml:space="preserve"> </w:t>
-      </w:r>
-      <w:r>
-        <w:t xml:space="preserve">the lower side. Under the more extreme</w:t>
+        <w:t xml:space="preserve">bays. Including the bootstrap uncertainty of the fit, the model-conditional intervals are 0.07–0.12 wide</w:t>
+      </w:r>
+      <w:r>
+        <w:t xml:space="preserve"> </w:t>
+      </w:r>
+      <w:r>
+        <w:t xml:space="preserve">on the lower side. Under the more extreme</w:t>
       </w:r>
       <w:r>
         <w:t xml:space="preserve"> </w:t>
@@ -24174,7 +24618,7 @@
         <w:t xml:space="preserve"> </w:t>
       </w:r>
       <w:r>
-        <w:t xml:space="preserve">from the combined estimates, which also depend on the residual model.</w:t>
+        <w:t xml:space="preserve">from the model-conditional estimates, which also depend on the residual model.</w:t>
       </w:r>
     </w:p>
     <w:p>
@@ -24717,7 +25161,7 @@
         </m:d>
       </m:oMath>
       <w:r>
-        <w:t xml:space="preserve">; the interval and one-sided lower bound</w:t>
+        <w:t xml:space="preserve">; the model-conditional interval and one-sided lower bound</w:t>
       </w:r>
       <w:r>
         <w:t xml:space="preserve"> </w:t>
@@ -24812,7 +25256,7 @@
         <w:tblStyle w:val="Table"/>
         <w:tblLook w:firstRow="0" w:lastRow="0" w:firstColumn="0" w:lastColumn="0" w:noHBand="0" w:noVBand="0" w:val="0000"/>
         <w:jc w:val="start"/>
-        <w:tblCaption w:val="Table 6. Check of the samples excluded by the tail-stratified estimator (pool 2\times10^5). Stratum C: probability, full-model failures in 300 re-analysed samples, largest observed ratio. Sampled strata only: \hat\beta^{full}_{ULS} with threshold 0.85 (strata A, B) and 0.70 (A, B, C), with Jeffreys 95\% intervals. These are statistical statements about the analysed strata. Sampled strata + residual: R_{t_3} is the model-based failure probability of all unanalysed samples with U_s&lt;0.85 under a t_3 model of \ln(U_{full}/U_s); the interval and one-sided lower bound \beta^{lcb} also propagate the bootstrap uncertainty of the fit, and are conditional on the t_3 model (a stress-test assumption, not a validated tail). Last column: point estimate with a t_2 model."/>
+        <w:tblCaption w:val="Table 6. Check of the samples excluded by the tail-stratified estimator (pool 2\times10^5). Stratum C: probability, full-model failures in 300 re-analysed samples, largest observed ratio. Sampled strata only: \hat\beta^{full}_{ULS} with threshold 0.85 (strata A, B) and 0.70 (A, B, C), with Jeffreys 95\% intervals. These are statistical statements about the analysed strata. Sampled strata + residual: R_{t_3} is the model-based failure probability of all unanalysed samples with U_s&lt;0.85 under a t_3 model of \ln(U_{full}/U_s); the model-conditional interval and one-sided lower bound \beta^{lcb} also propagate the bootstrap uncertainty of the fit, and are conditional on the t_3 model (a stress-test assumption, not a validated tail). Last column: point estimate with a t_2 model."/>
         <w:tblW w:w="9360" w:type="dxa"/>
         <w:tblLayout w:type="fixed"/>
         <w:tblBorders>
@@ -30316,7 +30760,13 @@
         <w:t xml:space="preserve"> </w:t>
       </w:r>
       <w:r>
-        <w:t xml:space="preserve">re-analysis for eight designs: (a) system utilisation of</w:t>
+        <w:t xml:space="preserve">re-analysis for ten designs (the eight principal designs</w:t>
+      </w:r>
+      <w:r>
+        <w:t xml:space="preserve"> </w:t>
+      </w:r>
+      <w:r>
+        <w:t xml:space="preserve">and the two heavier three-storey designs of Section 4.6): (a) system utilisation of</w:t>
       </w:r>
       <w:r>
         <w:t xml:space="preserve"> </w:t>
@@ -39823,13 +40273,19 @@
         <w:t xml:space="preserve"> </w:t>
       </w:r>
       <w:r>
-        <w:t xml:space="preserve">the DDO design: the code-based optimum is also the</w:t>
-      </w:r>
-      <w:r>
-        <w:t xml:space="preserve"> </w:t>
-      </w:r>
-      <w:r>
-        <w:t xml:space="preserve">reliability-based optimum when the reliability levels it implicitly provides are required. Raising</w:t>
+        <w:t xml:space="preserve">the DDO design: the best code-based design found is</w:t>
+      </w:r>
+      <w:r>
+        <w:t xml:space="preserve"> </w:t>
+      </w:r>
+      <w:r>
+        <w:t xml:space="preserve">also the best reliability-based design found when the reliability levels it implicitly provides are</w:t>
+      </w:r>
+      <w:r>
+        <w:t xml:space="preserve"> </w:t>
+      </w:r>
+      <w:r>
+        <w:t xml:space="preserve">required. Raising</w:t>
       </w:r>
       <w:r>
         <w:t xml:space="preserve"> </w:t>
@@ -52281,7 +52737,33 @@
         <w:t xml:space="preserve"> </w:t>
       </w:r>
       <w:r>
-        <w:t xml:space="preserve">95% interval [3.41, 3.61] and lower bound 3.43, including the bootstrap uncertainty of the fit.</w:t>
+        <w:t xml:space="preserve">with a model-conditional</w:t>
+      </w:r>
+      <w:r>
+        <w:t xml:space="preserve"> </w:t>
+      </w:r>
+      <m:oMath>
+        <m:r>
+          <m:t>95</m:t>
+        </m:r>
+        <m:r>
+          <m:rPr>
+            <m:sty m:val="p"/>
+          </m:rPr>
+          <m:t>%</m:t>
+        </m:r>
+      </m:oMath>
+      <w:r>
+        <w:t xml:space="preserve"> </w:t>
+      </w:r>
+      <w:r>
+        <w:t xml:space="preserve">confidence interval [3.41, 3.61] and lower bound 3.43, including the</w:t>
+      </w:r>
+      <w:r>
+        <w:t xml:space="preserve"> </w:t>
+      </w:r>
+      <w:r>
+        <w:t xml:space="preserve">bootstrap uncertainty of the fit.</w:t>
       </w:r>
     </w:p>
     <w:p>
@@ -52349,27 +52831,13 @@
         <w:t xml:space="preserve"> </w:t>
       </w:r>
       <w:r>
-        <w:t xml:space="preserve">strata. For the complete full model, it is met with</w:t>
-      </w:r>
-      <w:r>
-        <w:t xml:space="preserve"> </w:t>
-      </w:r>
-      <m:oMath>
-        <m:r>
-          <m:t>95</m:t>
-        </m:r>
-        <m:r>
-          <m:rPr>
-            <m:sty m:val="p"/>
-          </m:rPr>
-          <m:t>%</m:t>
-        </m:r>
-      </m:oMath>
-      <w:r>
-        <w:t xml:space="preserve"> </w:t>
-      </w:r>
-      <w:r>
-        <w:t xml:space="preserve">confidence under the</w:t>
+        <w:t xml:space="preserve">strata. For the complete full model, the model-conditional lower bound (3.43) also exceeds the target, but</w:t>
+      </w:r>
+      <w:r>
+        <w:t xml:space="preserve"> </w:t>
+      </w:r>
+      <w:r>
+        <w:t xml:space="preserve">this holds only under the assumed</w:t>
       </w:r>
       <w:r>
         <w:t xml:space="preserve"> </w:t>
@@ -52392,13 +52860,33 @@
         <w:t xml:space="preserve"> </w:t>
       </w:r>
       <w:r>
-        <w:t xml:space="preserve">residual</w:t>
-      </w:r>
-      <w:r>
-        <w:t xml:space="preserve"> </w:t>
-      </w:r>
-      <w:r>
-        <w:t xml:space="preserve">model. This is not a distribution-free demonstration, because the tail of</w:t>
+        <w:t xml:space="preserve">residual model and not under every tail model (</w:t>
+      </w:r>
+      <m:oMath>
+        <m:sSub>
+          <m:e>
+            <m:r>
+              <m:t>t</m:t>
+            </m:r>
+          </m:e>
+          <m:sub>
+            <m:r>
+              <m:t>2</m:t>
+            </m:r>
+          </m:sub>
+        </m:sSub>
+      </m:oMath>
+      <w:r>
+        <w:t xml:space="preserve"> </w:t>
+      </w:r>
+      <w:r>
+        <w:t xml:space="preserve">gives</w:t>
+      </w:r>
+      <w:r>
+        <w:t xml:space="preserve"> </w:t>
+      </w:r>
+      <w:r>
+        <w:t xml:space="preserve">3.16). It is not a distribution-free bound, because the tail of</w:t>
       </w:r>
       <w:r>
         <w:t xml:space="preserve"> </w:t>
@@ -57205,13 +57693,13 @@
         <w:t xml:space="preserve"> </w:t>
       </w:r>
       <w:r>
-        <w:t xml:space="preserve">in any other case, so the conclusions drawn from steel mass carry over to this broader, although</w:t>
-      </w:r>
-      <w:r>
-        <w:t xml:space="preserve"> </w:t>
-      </w:r>
-      <w:r>
-        <w:t xml:space="preserve">uncalibrated, cost measure.</w:t>
+        <w:t xml:space="preserve">in any other case, so the conclusions drawn from steel mass carry over to this broader cost measure. The index is an</w:t>
+      </w:r>
+      <w:r>
+        <w:t xml:space="preserve"> </w:t>
+      </w:r>
+      <w:r>
+        <w:t xml:space="preserve">uncalibrated sensitivity model; it has not been validated against actual project costs.</w:t>
       </w:r>
     </w:p>
     <w:p>
@@ -63011,7 +63499,7 @@
         <w:t xml:space="preserve"> </w:t>
       </w:r>
       <w:r>
-        <w:t xml:space="preserve">(iii) code-compliant RBDO costs 1–12% more steel than DDO, depending on the frame and on whether</w:t>
+        <w:t xml:space="preserve">(iii) code-compliant RBDO (AISC 360-16, ASCE 7-05) costs 1–12% more steel than DDO, depending on the frame and on whether</w:t>
       </w:r>
       <w:r>
         <w:t xml:space="preserve"> </w:t>
@@ -63023,7 +63511,13 @@
         <w:t xml:space="preserve"> </w:t>
       </w:r>
       <w:r>
-        <w:t xml:space="preserve">(iv) it is generally the least-mass way to meet both targets. Not demonstrated: three-dimensional</w:t>
+        <w:t xml:space="preserve">(iv) among the designs compared, it generally gave the lowest mass that met both targets, with all</w:t>
+      </w:r>
+      <w:r>
+        <w:t xml:space="preserve"> </w:t>
+      </w:r>
+      <w:r>
+        <w:t xml:space="preserve">masses being best-found designs within the tested optimisation budget, not proven global minima. Not demonstrated: three-dimensional</w:t>
       </w:r>
       <w:r>
         <w:t xml:space="preserve"> </w:t>
@@ -63165,7 +63659,19 @@
         <w:t xml:space="preserve"> </w:t>
       </w:r>
       <w:r>
-        <w:t xml:space="preserve">structural and resistance models, and exclude model-form uncertainty unless this is stated. The</w:t>
+        <w:t xml:space="preserve">structural and resistance models, and exclude model-form uncertainty unless this is stated. Code</w:t>
+      </w:r>
+      <w:r>
+        <w:t xml:space="preserve"> </w:t>
+      </w:r>
+      <w:r>
+        <w:t xml:space="preserve">compliance refers to AISC 360-16 under the ASCE 7-05 load combinations, used as a fixed benchmark,</w:t>
+      </w:r>
+      <w:r>
+        <w:t xml:space="preserve"> </w:t>
+      </w:r>
+      <w:r>
+        <w:t xml:space="preserve">and all optima are the best designs found within the tested optimisation budget. The</w:t>
       </w:r>
       <w:r>
         <w:t xml:space="preserve"> </w:t>
@@ -63556,7 +64062,7 @@
         <w:t xml:space="preserve"> </w:t>
       </w:r>
       <w:r>
-        <w:t xml:space="preserve">confidence. For the seventh (three storeys) the interval contained</w:t>
+        <w:t xml:space="preserve">confidence in the baseline surrogate model. For the seventh (three storeys) the interval contained</w:t>
       </w:r>
       <w:r>
         <w:t xml:space="preserve"> </w:t>
@@ -63799,13 +64305,94 @@
         <w:t xml:space="preserve"> </w:t>
       </w:r>
       <w:r>
-        <w:t xml:space="preserve">residual model, it has a model-based estimate of 3.52 with a lower bound of 3.43. This is an</w:t>
-      </w:r>
-      <w:r>
-        <w:t xml:space="preserve"> </w:t>
-      </w:r>
-      <w:r>
-        <w:t xml:space="preserve">engineering estimate conditional on the residual model, not a distribution-free bound.</w:t>
+        <w:t xml:space="preserve">residual model, it has a model-based estimate of 3.52 with a model-conditional lower bound of</w:t>
+      </w:r>
+      <w:r>
+        <w:t xml:space="preserve"> </w:t>
+      </w:r>
+      <w:r>
+        <w:t xml:space="preserve">3.43 (3.16 under a</w:t>
+      </w:r>
+      <w:r>
+        <w:t xml:space="preserve"> </w:t>
+      </w:r>
+      <m:oMath>
+        <m:sSub>
+          <m:e>
+            <m:r>
+              <m:t>t</m:t>
+            </m:r>
+          </m:e>
+          <m:sub>
+            <m:r>
+              <m:t>2</m:t>
+            </m:r>
+          </m:sub>
+        </m:sSub>
+      </m:oMath>
+      <w:r>
+        <w:t xml:space="preserve"> </w:t>
+      </w:r>
+      <w:r>
+        <w:t xml:space="preserve">model). This is an engineering estimate conditional on the residual model,</w:t>
+      </w:r>
+      <w:r>
+        <w:t xml:space="preserve"> </w:t>
+      </w:r>
+      <w:r>
+        <w:t xml:space="preserve">not a distribution-free bound. The steel premium is</w:t>
+      </w:r>
+      <w:r>
+        <w:t xml:space="preserve"> </w:t>
+      </w:r>
+      <m:oMath>
+        <m:r>
+          <m:rPr>
+            <m:sty m:val="p"/>
+          </m:rPr>
+          <m:t>+</m:t>
+        </m:r>
+        <m:r>
+          <m:t>2.7</m:t>
+        </m:r>
+        <m:r>
+          <m:rPr>
+            <m:sty m:val="p"/>
+          </m:rPr>
+          <m:t>%</m:t>
+        </m:r>
+      </m:oMath>
+      <w:r>
+        <w:t xml:space="preserve"> </w:t>
+      </w:r>
+      <w:r>
+        <w:t xml:space="preserve">relative to RBDO-C and</w:t>
+      </w:r>
+      <w:r>
+        <w:t xml:space="preserve"> </w:t>
+      </w:r>
+      <m:oMath>
+        <m:r>
+          <m:rPr>
+            <m:sty m:val="p"/>
+          </m:rPr>
+          <m:t>+</m:t>
+        </m:r>
+        <m:r>
+          <m:t>5.2</m:t>
+        </m:r>
+        <m:r>
+          <m:rPr>
+            <m:sty m:val="p"/>
+          </m:rPr>
+          <m:t>%</m:t>
+        </m:r>
+      </m:oMath>
+      <w:r>
+        <w:t xml:space="preserve"> </w:t>
+      </w:r>
+      <w:r>
+        <w:t xml:space="preserve">relative to DDO.</w:t>
       </w:r>
     </w:p>
     <w:p>
@@ -63822,19 +64409,25 @@
         <w:t xml:space="preserve"> </w:t>
       </w:r>
       <w:r>
-        <w:t xml:space="preserve">optimisation. It delivered designs with a stated, uniform reliability, generally at less steel than</w:t>
-      </w:r>
-      <w:r>
-        <w:t xml:space="preserve"> </w:t>
-      </w:r>
-      <w:r>
-        <w:t xml:space="preserve">tightened deterministic drift limits that meet the same targets. Economic statements are limited to</w:t>
-      </w:r>
-      <w:r>
-        <w:t xml:space="preserve"> </w:t>
-      </w:r>
-      <w:r>
-        <w:t xml:space="preserve">steel mass and an illustrative, uncalibrated cost index.</w:t>
+        <w:t xml:space="preserve">optimisation. It delivered the lightest designs found that have a stated, uniform reliability, generally at less</w:t>
+      </w:r>
+      <w:r>
+        <w:t xml:space="preserve"> </w:t>
+      </w:r>
+      <w:r>
+        <w:t xml:space="preserve">steel than tightened deterministic drift limits that meet the same targets. Economic statements are limited to</w:t>
+      </w:r>
+      <w:r>
+        <w:t xml:space="preserve"> </w:t>
+      </w:r>
+      <w:r>
+        <w:t xml:space="preserve">steel mass and an illustrative, uncalibrated cost index used as a sensitivity model, not validated</w:t>
+      </w:r>
+      <w:r>
+        <w:t xml:space="preserve"> </w:t>
+      </w:r>
+      <w:r>
+        <w:t xml:space="preserve">against project costs.</w:t>
       </w:r>
     </w:p>
     <w:p>
@@ -64110,7 +64703,7 @@
       </w:r>
     </w:p>
     <w:bookmarkEnd w:id="88"/>
-    <w:bookmarkStart w:id="134" w:name="references"/>
+    <w:bookmarkStart w:id="136" w:name="references"/>
     <w:p>
       <w:pPr>
         <w:pStyle w:val="Heading1"/>
@@ -64119,7 +64712,7 @@
         <w:t xml:space="preserve">References</w:t>
       </w:r>
     </w:p>
-    <w:bookmarkStart w:id="133" w:name="refs"/>
+    <w:bookmarkStart w:id="135" w:name="refs"/>
     <w:bookmarkStart w:id="89" w:name="ref-AISC360"/>
     <w:p>
       <w:pPr>
@@ -64195,7 +64788,51 @@
       </w:r>
     </w:p>
     <w:bookmarkEnd w:id="90"/>
-    <w:bookmarkStart w:id="91" w:name="ref-ASCE705"/>
+    <w:bookmarkStart w:id="91" w:name="ref-AISC360_22"/>
+    <w:p>
+      <w:pPr>
+        <w:pStyle w:val="Bibliography"/>
+      </w:pPr>
+      <w:r>
+        <w:t xml:space="preserve">———. 2022.</w:t>
+      </w:r>
+      <w:r>
+        <w:t xml:space="preserve"> </w:t>
+      </w:r>
+      <w:r>
+        <w:rPr>
+          <w:iCs/>
+          <w:i/>
+        </w:rPr>
+        <w:t xml:space="preserve">Specification for Structural Steel Buildings (</w:t>
+      </w:r>
+      <w:r>
+        <w:rPr>
+          <w:iCs/>
+          <w:i/>
+        </w:rPr>
+        <w:t xml:space="preserve">ANSI/AISC</w:t>
+      </w:r>
+      <w:r>
+        <w:rPr>
+          <w:iCs/>
+          <w:i/>
+        </w:rPr>
+        <w:t xml:space="preserve"> </w:t>
+      </w:r>
+      <w:r>
+        <w:rPr>
+          <w:iCs/>
+          <w:i/>
+        </w:rPr>
+        <w:t xml:space="preserve">360-22)</w:t>
+      </w:r>
+      <w:r>
+        <w:t xml:space="preserve">. Chicago, IL: AISC.</w:t>
+      </w:r>
+    </w:p>
+    <w:bookmarkEnd w:id="91"/>
+    <w:bookmarkStart w:id="92" w:name="ref-ASCE705"/>
     <w:p>
       <w:pPr>
         <w:pStyle w:val="Bibliography"/>
@@ -64238,8 +64875,52 @@
         <w:t xml:space="preserve">. Reston, VA: ASCE.</w:t>
       </w:r>
     </w:p>
-    <w:bookmarkEnd w:id="91"/>
-    <w:bookmarkStart w:id="92" w:name="ref-Aoues2010"/>
+    <w:bookmarkEnd w:id="92"/>
+    <w:bookmarkStart w:id="93" w:name="ref-ASCE722"/>
+    <w:p>
+      <w:pPr>
+        <w:pStyle w:val="Bibliography"/>
+      </w:pPr>
+      <w:r>
+        <w:t xml:space="preserve">———. 2022.</w:t>
+      </w:r>
+      <w:r>
+        <w:t xml:space="preserve"> </w:t>
+      </w:r>
+      <w:r>
+        <w:rPr>
+          <w:iCs/>
+          <w:i/>
+        </w:rPr>
+        <w:t xml:space="preserve">Minimum Design Loads and Associated Criteria for Buildings and Other Structures (</w:t>
+      </w:r>
+      <w:r>
+        <w:rPr>
+          <w:iCs/>
+          <w:i/>
+        </w:rPr>
+        <w:t xml:space="preserve">ASCE/SEI</w:t>
+      </w:r>
+      <w:r>
+        <w:rPr>
+          <w:iCs/>
+          <w:i/>
+        </w:rPr>
+        <w:t xml:space="preserve"> </w:t>
+      </w:r>
+      <w:r>
+        <w:rPr>
+          <w:iCs/>
+          <w:i/>
+        </w:rPr>
+        <w:t xml:space="preserve">7-22)</w:t>
+      </w:r>
+      <w:r>
+        <w:t xml:space="preserve">. Reston, VA: ASCE.</w:t>
+      </w:r>
+    </w:p>
+    <w:bookmarkEnd w:id="93"/>
+    <w:bookmarkStart w:id="94" w:name="ref-Aoues2010"/>
     <w:p>
       <w:pPr>
         <w:pStyle w:val="Bibliography"/>
@@ -64270,8 +64951,8 @@
         <w:t xml:space="preserve">41 (2): 277–94.</w:t>
       </w:r>
     </w:p>
-    <w:bookmarkEnd w:id="92"/>
-    <w:bookmarkStart w:id="94" w:name="ref-PyNite"/>
+    <w:bookmarkEnd w:id="94"/>
+    <w:bookmarkStart w:id="96" w:name="ref-PyNite"/>
     <w:p>
       <w:pPr>
         <w:pStyle w:val="Bibliography"/>
@@ -64318,7 +64999,7 @@
       <w:r>
         <w:t xml:space="preserve"> </w:t>
       </w:r>
-      <w:hyperlink r:id="rId93">
+      <w:hyperlink r:id="rId95">
         <w:r>
           <w:rPr>
             <w:rStyle w:val="Hyperlink"/>
@@ -64330,8 +65011,8 @@
         <w:t xml:space="preserve">.</w:t>
       </w:r>
     </w:p>
-    <w:bookmarkEnd w:id="94"/>
-    <w:bookmarkStart w:id="96" w:name="ref-Buonopane2006"/>
+    <w:bookmarkEnd w:id="96"/>
+    <w:bookmarkStart w:id="98" w:name="ref-Buonopane2006"/>
     <w:p>
       <w:pPr>
         <w:pStyle w:val="Bibliography"/>
@@ -64364,7 +65045,7 @@
       <w:r>
         <w:t xml:space="preserve"> </w:t>
       </w:r>
-      <w:hyperlink r:id="rId95">
+      <w:hyperlink r:id="rId97">
         <w:r>
           <w:rPr>
             <w:rStyle w:val="Hyperlink"/>
@@ -64376,8 +65057,8 @@
         <w:t xml:space="preserve">.</w:t>
       </w:r>
     </w:p>
-    <w:bookmarkEnd w:id="96"/>
-    <w:bookmarkStart w:id="98" w:name="ref-Camp1998"/>
+    <w:bookmarkEnd w:id="98"/>
+    <w:bookmarkStart w:id="100" w:name="ref-Camp1998"/>
     <w:p>
       <w:pPr>
         <w:pStyle w:val="Bibliography"/>
@@ -64410,7 +65091,7 @@
       <w:r>
         <w:t xml:space="preserve"> </w:t>
       </w:r>
-      <w:hyperlink r:id="rId97">
+      <w:hyperlink r:id="rId99">
         <w:r>
           <w:rPr>
             <w:rStyle w:val="Hyperlink"/>
@@ -64422,8 +65103,8 @@
         <w:t xml:space="preserve">.</w:t>
       </w:r>
     </w:p>
-    <w:bookmarkEnd w:id="98"/>
-    <w:bookmarkStart w:id="99" w:name="ref-EN1990"/>
+    <w:bookmarkEnd w:id="100"/>
+    <w:bookmarkStart w:id="101" w:name="ref-EN1990"/>
     <w:p>
       <w:pPr>
         <w:pStyle w:val="Bibliography"/>
@@ -64459,8 +65140,8 @@
         <w:t xml:space="preserve">. Brussels: European Committee for Standardization.</w:t>
       </w:r>
     </w:p>
-    <w:bookmarkEnd w:id="99"/>
-    <w:bookmarkStart w:id="100" w:name="ref-Deb2000"/>
+    <w:bookmarkEnd w:id="101"/>
+    <w:bookmarkStart w:id="102" w:name="ref-Deb2000"/>
     <w:p>
       <w:pPr>
         <w:pStyle w:val="Bibliography"/>
@@ -64491,8 +65172,8 @@
         <w:t xml:space="preserve">186 (2–4): 311–38.</w:t>
       </w:r>
     </w:p>
-    <w:bookmarkEnd w:id="100"/>
-    <w:bookmarkStart w:id="101" w:name="ref-Deb2002"/>
+    <w:bookmarkEnd w:id="102"/>
+    <w:bookmarkStart w:id="103" w:name="ref-Deb2002"/>
     <w:p>
       <w:pPr>
         <w:pStyle w:val="Bibliography"/>
@@ -64532,8 +65213,8 @@
         <w:t xml:space="preserve">6 (2): 182–97.</w:t>
       </w:r>
     </w:p>
-    <w:bookmarkEnd w:id="101"/>
-    <w:bookmarkStart w:id="103" w:name="ref-Degertekin2008"/>
+    <w:bookmarkEnd w:id="103"/>
+    <w:bookmarkStart w:id="105" w:name="ref-Degertekin2008"/>
     <w:p>
       <w:pPr>
         <w:pStyle w:val="Bibliography"/>
@@ -64566,7 +65247,7 @@
       <w:r>
         <w:t xml:space="preserve"> </w:t>
       </w:r>
-      <w:hyperlink r:id="rId102">
+      <w:hyperlink r:id="rId104">
         <w:r>
           <w:rPr>
             <w:rStyle w:val="Hyperlink"/>
@@ -64578,8 +65259,8 @@
         <w:t xml:space="preserve">.</w:t>
       </w:r>
     </w:p>
-    <w:bookmarkEnd w:id="103"/>
-    <w:bookmarkStart w:id="104" w:name="ref-Ellingwood1980"/>
+    <w:bookmarkEnd w:id="105"/>
+    <w:bookmarkStart w:id="106" w:name="ref-Ellingwood1980"/>
     <w:p>
       <w:pPr>
         <w:pStyle w:val="Bibliography"/>
@@ -64609,8 +65290,8 @@
         <w:t xml:space="preserve">NBS Special Publication 577. Washington, DC: National Bureau of Standards.</w:t>
       </w:r>
     </w:p>
-    <w:bookmarkEnd w:id="104"/>
-    <w:bookmarkStart w:id="105" w:name="ref-Enevoldsen1994"/>
+    <w:bookmarkEnd w:id="106"/>
+    <w:bookmarkStart w:id="107" w:name="ref-Enevoldsen1994"/>
     <w:p>
       <w:pPr>
         <w:pStyle w:val="Bibliography"/>
@@ -64641,8 +65322,8 @@
         <w:t xml:space="preserve">15 (3): 169–96.</w:t>
       </w:r>
     </w:p>
-    <w:bookmarkEnd w:id="105"/>
-    <w:bookmarkStart w:id="107" w:name="ref-Foley2007"/>
+    <w:bookmarkEnd w:id="107"/>
+    <w:bookmarkStart w:id="109" w:name="ref-Foley2007"/>
     <w:p>
       <w:pPr>
         <w:pStyle w:val="Bibliography"/>
@@ -64684,7 +65365,7 @@
       <w:r>
         <w:t xml:space="preserve"> </w:t>
       </w:r>
-      <w:hyperlink r:id="rId106">
+      <w:hyperlink r:id="rId108">
         <w:r>
           <w:rPr>
             <w:rStyle w:val="Hyperlink"/>
@@ -64696,8 +65377,8 @@
         <w:t xml:space="preserve">.</w:t>
       </w:r>
     </w:p>
-    <w:bookmarkEnd w:id="107"/>
-    <w:bookmarkStart w:id="109" w:name="ref-Frangopol1985"/>
+    <w:bookmarkEnd w:id="109"/>
+    <w:bookmarkStart w:id="111" w:name="ref-Frangopol1985"/>
     <w:p>
       <w:pPr>
         <w:pStyle w:val="Bibliography"/>
@@ -64730,7 +65411,7 @@
       <w:r>
         <w:t xml:space="preserve"> </w:t>
       </w:r>
-      <w:hyperlink r:id="rId108">
+      <w:hyperlink r:id="rId110">
         <w:r>
           <w:rPr>
             <w:rStyle w:val="Hyperlink"/>
@@ -64742,8 +65423,8 @@
         <w:t xml:space="preserve">.</w:t>
       </w:r>
     </w:p>
-    <w:bookmarkEnd w:id="109"/>
-    <w:bookmarkStart w:id="110" w:name="ref-Galambos1982"/>
+    <w:bookmarkEnd w:id="111"/>
+    <w:bookmarkStart w:id="112" w:name="ref-Galambos1982"/>
     <w:p>
       <w:pPr>
         <w:pStyle w:val="Bibliography"/>
@@ -64774,8 +65455,8 @@
         <w:t xml:space="preserve">108 (5): 959–77.</w:t>
       </w:r>
     </w:p>
-    <w:bookmarkEnd w:id="110"/>
-    <w:bookmarkStart w:id="112" w:name="ref-JCSS2001"/>
+    <w:bookmarkEnd w:id="112"/>
+    <w:bookmarkStart w:id="114" w:name="ref-JCSS2001"/>
     <w:p>
       <w:pPr>
         <w:pStyle w:val="Bibliography"/>
@@ -64801,7 +65482,7 @@
       <w:r>
         <w:t xml:space="preserve"> </w:t>
       </w:r>
-      <w:hyperlink r:id="rId111">
+      <w:hyperlink r:id="rId113">
         <w:r>
           <w:rPr>
             <w:rStyle w:val="Hyperlink"/>
@@ -64813,8 +65494,8 @@
         <w:t xml:space="preserve">.</w:t>
       </w:r>
     </w:p>
-    <w:bookmarkEnd w:id="112"/>
-    <w:bookmarkStart w:id="113" w:name="ref-Kleywegt2002"/>
+    <w:bookmarkEnd w:id="114"/>
+    <w:bookmarkStart w:id="115" w:name="ref-Kleywegt2002"/>
     <w:p>
       <w:pPr>
         <w:pStyle w:val="Bibliography"/>
@@ -64845,8 +65526,8 @@
         <w:t xml:space="preserve">12 (2): 479–502.</w:t>
       </w:r>
     </w:p>
-    <w:bookmarkEnd w:id="113"/>
-    <w:bookmarkStart w:id="115" w:name="ref-LagarosPapadrakakis2007"/>
+    <w:bookmarkEnd w:id="115"/>
+    <w:bookmarkStart w:id="117" w:name="ref-LagarosPapadrakakis2007"/>
     <w:p>
       <w:pPr>
         <w:pStyle w:val="Bibliography"/>
@@ -64879,7 +65560,7 @@
       <w:r>
         <w:t xml:space="preserve"> </w:t>
       </w:r>
-      <w:hyperlink r:id="rId114">
+      <w:hyperlink r:id="rId116">
         <w:r>
           <w:rPr>
             <w:rStyle w:val="Hyperlink"/>
@@ -64891,8 +65572,8 @@
         <w:t xml:space="preserve">.</w:t>
       </w:r>
     </w:p>
-    <w:bookmarkEnd w:id="115"/>
-    <w:bookmarkStart w:id="116" w:name="ref-Mathakari2007"/>
+    <w:bookmarkEnd w:id="117"/>
+    <w:bookmarkStart w:id="118" w:name="ref-Mathakari2007"/>
     <w:p>
       <w:pPr>
         <w:pStyle w:val="Bibliography"/>
@@ -64923,8 +65604,8 @@
         <w:t xml:space="preserve">22 (4): 282–92.</w:t>
       </w:r>
     </w:p>
-    <w:bookmarkEnd w:id="116"/>
-    <w:bookmarkStart w:id="117" w:name="ref-McKenna2010"/>
+    <w:bookmarkEnd w:id="118"/>
+    <w:bookmarkStart w:id="119" w:name="ref-McKenna2010"/>
     <w:p>
       <w:pPr>
         <w:pStyle w:val="Bibliography"/>
@@ -64955,8 +65636,8 @@
         <w:t xml:space="preserve">24 (1): 95–107.</w:t>
       </w:r>
     </w:p>
-    <w:bookmarkEnd w:id="117"/>
-    <w:bookmarkStart w:id="119" w:name="ref-PapadrakakisLagaros2002"/>
+    <w:bookmarkEnd w:id="119"/>
+    <w:bookmarkStart w:id="121" w:name="ref-PapadrakakisLagaros2002"/>
     <w:p>
       <w:pPr>
         <w:pStyle w:val="Bibliography"/>
@@ -65001,7 +65682,7 @@
       <w:r>
         <w:t xml:space="preserve"> </w:t>
       </w:r>
-      <w:hyperlink r:id="rId118">
+      <w:hyperlink r:id="rId120">
         <w:r>
           <w:rPr>
             <w:rStyle w:val="Hyperlink"/>
@@ -65013,8 +65694,8 @@
         <w:t xml:space="preserve">.</w:t>
       </w:r>
     </w:p>
-    <w:bookmarkEnd w:id="119"/>
-    <w:bookmarkStart w:id="120" w:name="ref-Papadrakakis2004"/>
+    <w:bookmarkEnd w:id="121"/>
+    <w:bookmarkStart w:id="122" w:name="ref-Papadrakakis2004"/>
     <w:p>
       <w:pPr>
         <w:pStyle w:val="Bibliography"/>
@@ -65045,8 +65726,8 @@
         <w:t xml:space="preserve">42 (3): 585–608.</w:t>
       </w:r>
     </w:p>
-    <w:bookmarkEnd w:id="120"/>
-    <w:bookmarkStart w:id="122" w:name="ref-Pezeshk2000"/>
+    <w:bookmarkEnd w:id="122"/>
+    <w:bookmarkStart w:id="124" w:name="ref-Pezeshk2000"/>
     <w:p>
       <w:pPr>
         <w:pStyle w:val="Bibliography"/>
@@ -65079,7 +65760,7 @@
       <w:r>
         <w:t xml:space="preserve"> </w:t>
       </w:r>
-      <w:hyperlink r:id="rId121">
+      <w:hyperlink r:id="rId123">
         <w:r>
           <w:rPr>
             <w:rStyle w:val="Hyperlink"/>
@@ -65091,8 +65772,8 @@
         <w:t xml:space="preserve">.</w:t>
       </w:r>
     </w:p>
-    <w:bookmarkEnd w:id="122"/>
-    <w:bookmarkStart w:id="124" w:name="ref-SakaGeem2013"/>
+    <w:bookmarkEnd w:id="124"/>
+    <w:bookmarkStart w:id="126" w:name="ref-SakaGeem2013"/>
     <w:p>
       <w:pPr>
         <w:pStyle w:val="Bibliography"/>
@@ -65125,7 +65806,7 @@
       <w:r>
         <w:t xml:space="preserve"> </w:t>
       </w:r>
-      <w:hyperlink r:id="rId123">
+      <w:hyperlink r:id="rId125">
         <w:r>
           <w:rPr>
             <w:rStyle w:val="Hyperlink"/>
@@ -65137,8 +65818,8 @@
         <w:t xml:space="preserve">.</w:t>
       </w:r>
     </w:p>
-    <w:bookmarkEnd w:id="124"/>
-    <w:bookmarkStart w:id="126" w:name="ref-SurovekMaleck2004"/>
+    <w:bookmarkEnd w:id="126"/>
+    <w:bookmarkStart w:id="128" w:name="ref-SurovekMaleck2004"/>
     <w:p>
       <w:pPr>
         <w:pStyle w:val="Bibliography"/>
@@ -65180,7 +65861,7 @@
       <w:r>
         <w:t xml:space="preserve"> </w:t>
       </w:r>
-      <w:hyperlink r:id="rId125">
+      <w:hyperlink r:id="rId127">
         <w:r>
           <w:rPr>
             <w:rStyle w:val="Hyperlink"/>
@@ -65192,8 +65873,8 @@
         <w:t xml:space="preserve">.</w:t>
       </w:r>
     </w:p>
-    <w:bookmarkEnd w:id="126"/>
-    <w:bookmarkStart w:id="128" w:name="ref-TruongKim2017"/>
+    <w:bookmarkEnd w:id="128"/>
+    <w:bookmarkStart w:id="130" w:name="ref-TruongKim2017"/>
     <w:p>
       <w:pPr>
         <w:pStyle w:val="Bibliography"/>
@@ -65226,7 +65907,7 @@
       <w:r>
         <w:t xml:space="preserve"> </w:t>
       </w:r>
-      <w:hyperlink r:id="rId127">
+      <w:hyperlink r:id="rId129">
         <w:r>
           <w:rPr>
             <w:rStyle w:val="Hyperlink"/>
@@ -65238,8 +65919,8 @@
         <w:t xml:space="preserve">.</w:t>
       </w:r>
     </w:p>
-    <w:bookmarkEnd w:id="128"/>
-    <w:bookmarkStart w:id="129" w:name="ref-TurkstraMadsen1980"/>
+    <w:bookmarkEnd w:id="130"/>
+    <w:bookmarkStart w:id="131" w:name="ref-TurkstraMadsen1980"/>
     <w:p>
       <w:pPr>
         <w:pStyle w:val="Bibliography"/>
@@ -65270,8 +65951,8 @@
         <w:t xml:space="preserve">106 (12): 2527–43.</w:t>
       </w:r>
     </w:p>
-    <w:bookmarkEnd w:id="129"/>
-    <w:bookmarkStart w:id="130" w:name="ref-Valdebenito2010"/>
+    <w:bookmarkEnd w:id="131"/>
+    <w:bookmarkStart w:id="132" w:name="ref-Valdebenito2010"/>
     <w:p>
       <w:pPr>
         <w:pStyle w:val="Bibliography"/>
@@ -65302,8 +65983,8 @@
         <w:t xml:space="preserve">42 (5): 645–63.</w:t>
       </w:r>
     </w:p>
-    <w:bookmarkEnd w:id="130"/>
-    <w:bookmarkStart w:id="131" w:name="ref-Zhang2016"/>
+    <w:bookmarkEnd w:id="132"/>
+    <w:bookmarkStart w:id="133" w:name="ref-Zhang2016"/>
     <w:p>
       <w:pPr>
         <w:pStyle w:val="Bibliography"/>
@@ -65343,8 +66024,8 @@
         <w:t xml:space="preserve">123: 135–43.</w:t>
       </w:r>
     </w:p>
-    <w:bookmarkEnd w:id="131"/>
-    <w:bookmarkStart w:id="132" w:name="ref-Zhu2018"/>
+    <w:bookmarkEnd w:id="133"/>
+    <w:bookmarkStart w:id="134" w:name="ref-Zhu2018"/>
     <w:p>
       <w:pPr>
         <w:pStyle w:val="Bibliography"/>
@@ -65393,9 +66074,9 @@
         <w:t xml:space="preserve">7: 6–11.</w:t>
       </w:r>
     </w:p>
-    <w:bookmarkEnd w:id="132"/>
-    <w:bookmarkEnd w:id="133"/>
     <w:bookmarkEnd w:id="134"/>
+    <w:bookmarkEnd w:id="135"/>
+    <w:bookmarkEnd w:id="136"/>
     <w:sectPr/>
   </w:body>
 </w:document>

</xml_diff>

<commit_message>
Record results commit ccfd4ce7c014 in the fifth-revision manuscript
Co-Authored-By: Claude Opus 5.5 <noreply@anthropic.com>
Claude-Session: https://claude.ai/code/session_01GFzJmMfEsX3LJEx4o2YoAb
</commit_message>
<xml_diff>
--- a/Research/reliability_optimization/paper/main.docx
+++ b/Research/reliability_optimization/paper/main.docx
@@ -2797,7 +2797,7 @@
         </w:numPr>
       </w:pPr>
       <w:r>
-        <w:t xml:space="preserve">an exact superposition surrogate that turns five linear analyses per design (PyNite</w:t>
+        <w:t xml:space="preserve">a superposition surrogate that turns five linear analyses per design (PyNite</w:t>
       </w:r>
       <w:r>
         <w:t xml:space="preserve"> </w:t>
@@ -2907,7 +2907,59 @@
         <w:t xml:space="preserve"> </w:t>
       </w:r>
       <w:r>
-        <w:t xml:space="preserve">samples per design, combined with a sample average approximation (SAA)</w:t>
+        <w:t xml:space="preserve">samples per design (the superposition of the linear unit-case responses</w:t>
+      </w:r>
+      <w:r>
+        <w:t xml:space="preserve"> </w:t>
+      </w:r>
+      <w:r>
+        <w:t xml:space="preserve">is exact within the linear analysis, whereas the</w:t>
+      </w:r>
+      <w:r>
+        <w:t xml:space="preserve"> </w:t>
+      </w:r>
+      <m:oMath>
+        <m:sSub>
+          <m:e>
+            <m:r>
+              <m:t>B</m:t>
+            </m:r>
+          </m:e>
+          <m:sub>
+            <m:r>
+              <m:t>1</m:t>
+            </m:r>
+          </m:sub>
+        </m:sSub>
+      </m:oMath>
+      <w:r>
+        <w:t xml:space="preserve">–</w:t>
+      </w:r>
+      <m:oMath>
+        <m:sSub>
+          <m:e>
+            <m:r>
+              <m:t>B</m:t>
+            </m:r>
+          </m:e>
+          <m:sub>
+            <m:r>
+              <m:t>2</m:t>
+            </m:r>
+          </m:sub>
+        </m:sSub>
+      </m:oMath>
+      <w:r>
+        <w:t xml:space="preserve"> </w:t>
+      </w:r>
+      <w:r>
+        <w:t xml:space="preserve">amplification approximates the full</w:t>
+      </w:r>
+      <w:r>
+        <w:t xml:space="preserve"> </w:t>
+      </w:r>
+      <w:r>
+        <w:t xml:space="preserve">second-order response; Section 3.3), combined with a sample average approximation (SAA)</w:t>
       </w:r>
       <w:r>
         <w:t xml:space="preserve"> </w:t>
@@ -7367,6 +7419,83 @@
       </w:r>
       <w:r>
         <w:t xml:space="preserve">chord; and floor-average inter-storey drifts.</w:t>
+      </w:r>
+    </w:p>
+    <w:p>
+      <w:pPr>
+        <w:pStyle w:val="BodyText"/>
+      </w:pPr>
+      <w:r>
+        <w:t xml:space="preserve">Equation (1) is exact for the first-order linear analysis: it reproduces the</w:t>
+      </w:r>
+      <w:r>
+        <w:t xml:space="preserve"> </w:t>
+      </w:r>
+      <w:r>
+        <w:t xml:space="preserve">linear response of any realisation without approximation. This exactness does not extend to the</w:t>
+      </w:r>
+      <w:r>
+        <w:t xml:space="preserve"> </w:t>
+      </w:r>
+      <w:r>
+        <w:t xml:space="preserve">second-order response. The</w:t>
+      </w:r>
+      <w:r>
+        <w:t xml:space="preserve"> </w:t>
+      </w:r>
+      <m:oMath>
+        <m:sSub>
+          <m:e>
+            <m:r>
+              <m:t>B</m:t>
+            </m:r>
+          </m:e>
+          <m:sub>
+            <m:r>
+              <m:t>1</m:t>
+            </m:r>
+          </m:sub>
+        </m:sSub>
+      </m:oMath>
+      <w:r>
+        <w:t xml:space="preserve">–</w:t>
+      </w:r>
+      <m:oMath>
+        <m:sSub>
+          <m:e>
+            <m:r>
+              <m:t>B</m:t>
+            </m:r>
+          </m:e>
+          <m:sub>
+            <m:r>
+              <m:t>2</m:t>
+            </m:r>
+          </m:sub>
+        </m:sSub>
+      </m:oMath>
+      <w:r>
+        <w:t xml:space="preserve"> </w:t>
+      </w:r>
+      <w:r>
+        <w:t xml:space="preserve">amplification below is an approximation of the full</w:t>
+      </w:r>
+      <w:r>
+        <w:t xml:space="preserve"> </w:t>
+      </w:r>
+      <w:r>
+        <w:t xml:space="preserve">P-</w:t>
+      </w:r>
+      <m:oMath>
+        <m:r>
+          <m:t>Δ</m:t>
+        </m:r>
+      </m:oMath>
+      <w:r>
+        <w:t xml:space="preserve"> </w:t>
+      </w:r>
+      <w:r>
+        <w:t xml:space="preserve">analysis, and its error is quantified in Section 3.3.</w:t>
       </w:r>
     </w:p>
     <w:p>
@@ -23365,7 +23494,13 @@
         <w:t xml:space="preserve"> </w:t>
       </w:r>
       <w:r>
-        <w:t xml:space="preserve">degrees of freedom is used as a further, more extreme case.</w:t>
+        <w:t xml:space="preserve">degrees of freedom is used as a further, more extreme case, for which only point estimates are</w:t>
+      </w:r>
+      <w:r>
+        <w:t xml:space="preserve"> </w:t>
+      </w:r>
+      <w:r>
+        <w:t xml:space="preserve">reported.</w:t>
       </w:r>
     </w:p>
     <w:p>
@@ -24574,7 +24709,7 @@
         <w:t xml:space="preserve"> </w:t>
       </w:r>
       <w:r>
-        <w:t xml:space="preserve">model the indices fall by a further 0.1–0.5. The target</w:t>
+        <w:t xml:space="preserve">model the point estimates fall by a further 0.1–0.5. The target</w:t>
       </w:r>
       <w:r>
         <w:t xml:space="preserve"> </w:t>
@@ -25265,20 +25400,20 @@
         </w:tblBorders>
       </w:tblPr>
       <w:tblGrid>
-        <w:gridCol w:w="1144"/>
-        <w:gridCol w:w="936"/>
-        <w:gridCol w:w="936"/>
-        <w:gridCol w:w="936"/>
-        <w:gridCol w:w="1144"/>
-        <w:gridCol w:w="1144"/>
-        <w:gridCol w:w="1040"/>
-        <w:gridCol w:w="1040"/>
-        <w:gridCol w:w="1040"/>
+        <w:gridCol w:w="1095"/>
+        <w:gridCol w:w="896"/>
+        <w:gridCol w:w="896"/>
+        <w:gridCol w:w="896"/>
+        <w:gridCol w:w="1095"/>
+        <w:gridCol w:w="1095"/>
+        <w:gridCol w:w="995"/>
+        <w:gridCol w:w="1394"/>
+        <w:gridCol w:w="995"/>
       </w:tblGrid>
       <w:tr>
         <w:tc>
           <w:tcPr>
-            <w:tcW w:type="dxa" w:w="1144"/>
+            <w:tcW w:type="dxa" w:w="1095"/>
             <w:tcBorders>
               <w:bottom w:val="single" w:sz="4" w:color="000000"/>
             </w:tcBorders>
@@ -25291,7 +25426,7 @@
         </w:tc>
         <w:tc>
           <w:tcPr>
-            <w:tcW w:type="dxa" w:w="2808"/>
+            <w:tcW w:type="dxa" w:w="2688"/>
             <w:gridSpan w:val="3"/>
             <w:tcBorders>
               <w:bottom w:val="single" w:sz="4" w:color="000000"/>
@@ -25367,7 +25502,7 @@
         </w:tc>
         <w:tc>
           <w:tcPr>
-            <w:tcW w:type="dxa" w:w="2288"/>
+            <w:tcW w:type="dxa" w:w="2190"/>
             <w:gridSpan w:val="2"/>
             <w:tcBorders>
               <w:bottom w:val="single" w:sz="4" w:color="000000"/>
@@ -25388,7 +25523,7 @@
         </w:tc>
         <w:tc>
           <w:tcPr>
-            <w:tcW w:type="dxa" w:w="3120"/>
+            <w:tcW w:type="dxa" w:w="3384"/>
             <w:gridSpan w:val="3"/>
             <w:tcBorders>
               <w:bottom w:val="single" w:sz="4" w:color="000000"/>
@@ -25457,7 +25592,7 @@
       <w:tr>
         <w:tc>
           <w:tcPr>
-            <w:tcW w:type="dxa" w:w="1144"/>
+            <w:tcW w:type="dxa" w:w="1095"/>
           </w:tcPr>
           <w:p>
             <w:pPr>
@@ -25474,7 +25609,7 @@
         </w:tc>
         <w:tc>
           <w:tcPr>
-            <w:tcW w:type="dxa" w:w="936"/>
+            <w:tcW w:type="dxa" w:w="896"/>
           </w:tcPr>
           <w:p>
             <w:pPr>
@@ -25503,7 +25638,7 @@
         </w:tc>
         <w:tc>
           <w:tcPr>
-            <w:tcW w:type="dxa" w:w="936"/>
+            <w:tcW w:type="dxa" w:w="896"/>
           </w:tcPr>
           <w:p>
             <w:pPr>
@@ -25546,7 +25681,7 @@
         </w:tc>
         <w:tc>
           <w:tcPr>
-            <w:tcW w:type="dxa" w:w="936"/>
+            <w:tcW w:type="dxa" w:w="896"/>
           </w:tcPr>
           <w:p>
             <w:pPr>
@@ -25601,7 +25736,7 @@
         </w:tc>
         <w:tc>
           <w:tcPr>
-            <w:tcW w:type="dxa" w:w="1144"/>
+            <w:tcW w:type="dxa" w:w="1095"/>
           </w:tcPr>
           <w:p>
             <w:pPr>
@@ -25626,7 +25761,7 @@
         </w:tc>
         <w:tc>
           <w:tcPr>
-            <w:tcW w:type="dxa" w:w="1144"/>
+            <w:tcW w:type="dxa" w:w="1095"/>
           </w:tcPr>
           <w:p>
             <w:pPr>
@@ -25660,7 +25795,7 @@
         </w:tc>
         <w:tc>
           <w:tcPr>
-            <w:tcW w:type="dxa" w:w="1040"/>
+            <w:tcW w:type="dxa" w:w="995"/>
           </w:tcPr>
           <w:p>
             <w:pPr>
@@ -25694,7 +25829,7 @@
         </w:tc>
         <w:tc>
           <w:tcPr>
-            <w:tcW w:type="dxa" w:w="1040"/>
+            <w:tcW w:type="dxa" w:w="1394"/>
           </w:tcPr>
           <w:p>
             <w:pPr>
@@ -25723,7 +25858,7 @@
               <w:rPr>
                 <w:sz w:val="16"/>
               </w:rPr>
-              <w:t xml:space="preserve">[95% CI] (</w:t>
+              <w:t xml:space="preserve">[model-cond. 95% CI] (</w:t>
             </w:r>
             <m:oMath>
               <m:sSup>
@@ -25775,7 +25910,7 @@
         </w:tc>
         <w:tc>
           <w:tcPr>
-            <w:tcW w:type="dxa" w:w="1040"/>
+            <w:tcW w:type="dxa" w:w="995"/>
           </w:tcPr>
           <w:p>
             <w:pPr>
@@ -25798,7 +25933,13 @@
               <w:rPr>
                 <w:sz w:val="16"/>
               </w:rPr>
-              <w:t xml:space="preserve">,</w:t>
+              <w:t xml:space="preserve"> </w:t>
+            </w:r>
+            <w:r>
+              <w:rPr>
+                <w:sz w:val="16"/>
+              </w:rPr>
+              <w:t xml:space="preserve">(point est.),</w:t>
             </w:r>
             <w:r>
               <w:rPr>
@@ -25826,7 +25967,7 @@
       <w:tr>
         <w:tc>
           <w:tcPr>
-            <w:tcW w:type="dxa" w:w="1144"/>
+            <w:tcW w:type="dxa" w:w="1095"/>
           </w:tcPr>
           <w:p>
             <w:pPr>
@@ -25843,7 +25984,7 @@
         </w:tc>
         <w:tc>
           <w:tcPr>
-            <w:tcW w:type="dxa" w:w="936"/>
+            <w:tcW w:type="dxa" w:w="896"/>
           </w:tcPr>
           <w:p>
             <w:pPr>
@@ -25860,7 +26001,7 @@
         </w:tc>
         <w:tc>
           <w:tcPr>
-            <w:tcW w:type="dxa" w:w="936"/>
+            <w:tcW w:type="dxa" w:w="896"/>
           </w:tcPr>
           <w:p>
             <w:pPr>
@@ -25877,7 +26018,7 @@
         </w:tc>
         <w:tc>
           <w:tcPr>
-            <w:tcW w:type="dxa" w:w="936"/>
+            <w:tcW w:type="dxa" w:w="896"/>
           </w:tcPr>
           <w:p>
             <w:pPr>
@@ -25894,7 +26035,7 @@
         </w:tc>
         <w:tc>
           <w:tcPr>
-            <w:tcW w:type="dxa" w:w="1144"/>
+            <w:tcW w:type="dxa" w:w="1095"/>
           </w:tcPr>
           <w:p>
             <w:pPr>
@@ -25911,7 +26052,7 @@
         </w:tc>
         <w:tc>
           <w:tcPr>
-            <w:tcW w:type="dxa" w:w="1144"/>
+            <w:tcW w:type="dxa" w:w="1095"/>
           </w:tcPr>
           <w:p>
             <w:pPr>
@@ -25928,7 +26069,7 @@
         </w:tc>
         <w:tc>
           <w:tcPr>
-            <w:tcW w:type="dxa" w:w="1040"/>
+            <w:tcW w:type="dxa" w:w="995"/>
           </w:tcPr>
           <w:p>
             <w:pPr>
@@ -25968,7 +26109,7 @@
         </w:tc>
         <w:tc>
           <w:tcPr>
-            <w:tcW w:type="dxa" w:w="1040"/>
+            <w:tcW w:type="dxa" w:w="1394"/>
           </w:tcPr>
           <w:p>
             <w:pPr>
@@ -25985,7 +26126,7 @@
         </w:tc>
         <w:tc>
           <w:tcPr>
-            <w:tcW w:type="dxa" w:w="1040"/>
+            <w:tcW w:type="dxa" w:w="995"/>
           </w:tcPr>
           <w:p>
             <w:pPr>
@@ -26004,7 +26145,7 @@
       <w:tr>
         <w:tc>
           <w:tcPr>
-            <w:tcW w:type="dxa" w:w="1144"/>
+            <w:tcW w:type="dxa" w:w="1095"/>
           </w:tcPr>
           <w:p>
             <w:pPr>
@@ -26021,7 +26162,7 @@
         </w:tc>
         <w:tc>
           <w:tcPr>
-            <w:tcW w:type="dxa" w:w="936"/>
+            <w:tcW w:type="dxa" w:w="896"/>
           </w:tcPr>
           <w:p>
             <w:pPr>
@@ -26038,7 +26179,7 @@
         </w:tc>
         <w:tc>
           <w:tcPr>
-            <w:tcW w:type="dxa" w:w="936"/>
+            <w:tcW w:type="dxa" w:w="896"/>
           </w:tcPr>
           <w:p>
             <w:pPr>
@@ -26055,7 +26196,7 @@
         </w:tc>
         <w:tc>
           <w:tcPr>
-            <w:tcW w:type="dxa" w:w="936"/>
+            <w:tcW w:type="dxa" w:w="896"/>
           </w:tcPr>
           <w:p>
             <w:pPr>
@@ -26072,7 +26213,7 @@
         </w:tc>
         <w:tc>
           <w:tcPr>
-            <w:tcW w:type="dxa" w:w="1144"/>
+            <w:tcW w:type="dxa" w:w="1095"/>
           </w:tcPr>
           <w:p>
             <w:pPr>
@@ -26089,7 +26230,7 @@
         </w:tc>
         <w:tc>
           <w:tcPr>
-            <w:tcW w:type="dxa" w:w="1144"/>
+            <w:tcW w:type="dxa" w:w="1095"/>
           </w:tcPr>
           <w:p>
             <w:pPr>
@@ -26106,7 +26247,7 @@
         </w:tc>
         <w:tc>
           <w:tcPr>
-            <w:tcW w:type="dxa" w:w="1040"/>
+            <w:tcW w:type="dxa" w:w="995"/>
           </w:tcPr>
           <w:p>
             <w:pPr>
@@ -26146,7 +26287,7 @@
         </w:tc>
         <w:tc>
           <w:tcPr>
-            <w:tcW w:type="dxa" w:w="1040"/>
+            <w:tcW w:type="dxa" w:w="1394"/>
           </w:tcPr>
           <w:p>
             <w:pPr>
@@ -26163,7 +26304,7 @@
         </w:tc>
         <w:tc>
           <w:tcPr>
-            <w:tcW w:type="dxa" w:w="1040"/>
+            <w:tcW w:type="dxa" w:w="995"/>
           </w:tcPr>
           <w:p>
             <w:pPr>
@@ -26182,7 +26323,7 @@
       <w:tr>
         <w:tc>
           <w:tcPr>
-            <w:tcW w:type="dxa" w:w="1144"/>
+            <w:tcW w:type="dxa" w:w="1095"/>
           </w:tcPr>
           <w:p>
             <w:pPr>
@@ -26199,7 +26340,7 @@
         </w:tc>
         <w:tc>
           <w:tcPr>
-            <w:tcW w:type="dxa" w:w="936"/>
+            <w:tcW w:type="dxa" w:w="896"/>
           </w:tcPr>
           <w:p>
             <w:pPr>
@@ -26216,7 +26357,7 @@
         </w:tc>
         <w:tc>
           <w:tcPr>
-            <w:tcW w:type="dxa" w:w="936"/>
+            <w:tcW w:type="dxa" w:w="896"/>
           </w:tcPr>
           <w:p>
             <w:pPr>
@@ -26233,7 +26374,7 @@
         </w:tc>
         <w:tc>
           <w:tcPr>
-            <w:tcW w:type="dxa" w:w="936"/>
+            <w:tcW w:type="dxa" w:w="896"/>
           </w:tcPr>
           <w:p>
             <w:pPr>
@@ -26250,7 +26391,7 @@
         </w:tc>
         <w:tc>
           <w:tcPr>
-            <w:tcW w:type="dxa" w:w="1144"/>
+            <w:tcW w:type="dxa" w:w="1095"/>
           </w:tcPr>
           <w:p>
             <w:pPr>
@@ -26267,7 +26408,7 @@
         </w:tc>
         <w:tc>
           <w:tcPr>
-            <w:tcW w:type="dxa" w:w="1144"/>
+            <w:tcW w:type="dxa" w:w="1095"/>
           </w:tcPr>
           <w:p>
             <w:pPr>
@@ -26284,7 +26425,7 @@
         </w:tc>
         <w:tc>
           <w:tcPr>
-            <w:tcW w:type="dxa" w:w="1040"/>
+            <w:tcW w:type="dxa" w:w="995"/>
           </w:tcPr>
           <w:p>
             <w:pPr>
@@ -26324,7 +26465,7 @@
         </w:tc>
         <w:tc>
           <w:tcPr>
-            <w:tcW w:type="dxa" w:w="1040"/>
+            <w:tcW w:type="dxa" w:w="1394"/>
           </w:tcPr>
           <w:p>
             <w:pPr>
@@ -26341,7 +26482,7 @@
         </w:tc>
         <w:tc>
           <w:tcPr>
-            <w:tcW w:type="dxa" w:w="1040"/>
+            <w:tcW w:type="dxa" w:w="995"/>
           </w:tcPr>
           <w:p>
             <w:pPr>
@@ -26360,7 +26501,7 @@
       <w:tr>
         <w:tc>
           <w:tcPr>
-            <w:tcW w:type="dxa" w:w="1144"/>
+            <w:tcW w:type="dxa" w:w="1095"/>
           </w:tcPr>
           <w:p>
             <w:pPr>
@@ -26377,7 +26518,7 @@
         </w:tc>
         <w:tc>
           <w:tcPr>
-            <w:tcW w:type="dxa" w:w="936"/>
+            <w:tcW w:type="dxa" w:w="896"/>
           </w:tcPr>
           <w:p>
             <w:pPr>
@@ -26394,7 +26535,7 @@
         </w:tc>
         <w:tc>
           <w:tcPr>
-            <w:tcW w:type="dxa" w:w="936"/>
+            <w:tcW w:type="dxa" w:w="896"/>
           </w:tcPr>
           <w:p>
             <w:pPr>
@@ -26411,7 +26552,7 @@
         </w:tc>
         <w:tc>
           <w:tcPr>
-            <w:tcW w:type="dxa" w:w="936"/>
+            <w:tcW w:type="dxa" w:w="896"/>
           </w:tcPr>
           <w:p>
             <w:pPr>
@@ -26428,7 +26569,7 @@
         </w:tc>
         <w:tc>
           <w:tcPr>
-            <w:tcW w:type="dxa" w:w="1144"/>
+            <w:tcW w:type="dxa" w:w="1095"/>
           </w:tcPr>
           <w:p>
             <w:pPr>
@@ -26445,7 +26586,7 @@
         </w:tc>
         <w:tc>
           <w:tcPr>
-            <w:tcW w:type="dxa" w:w="1144"/>
+            <w:tcW w:type="dxa" w:w="1095"/>
           </w:tcPr>
           <w:p>
             <w:pPr>
@@ -26462,7 +26603,7 @@
         </w:tc>
         <w:tc>
           <w:tcPr>
-            <w:tcW w:type="dxa" w:w="1040"/>
+            <w:tcW w:type="dxa" w:w="995"/>
           </w:tcPr>
           <w:p>
             <w:pPr>
@@ -26502,7 +26643,7 @@
         </w:tc>
         <w:tc>
           <w:tcPr>
-            <w:tcW w:type="dxa" w:w="1040"/>
+            <w:tcW w:type="dxa" w:w="1394"/>
           </w:tcPr>
           <w:p>
             <w:pPr>
@@ -26519,7 +26660,7 @@
         </w:tc>
         <w:tc>
           <w:tcPr>
-            <w:tcW w:type="dxa" w:w="1040"/>
+            <w:tcW w:type="dxa" w:w="995"/>
           </w:tcPr>
           <w:p>
             <w:pPr>
@@ -26538,7 +26679,7 @@
       <w:tr>
         <w:tc>
           <w:tcPr>
-            <w:tcW w:type="dxa" w:w="1144"/>
+            <w:tcW w:type="dxa" w:w="1095"/>
           </w:tcPr>
           <w:p>
             <w:pPr>
@@ -26555,7 +26696,7 @@
         </w:tc>
         <w:tc>
           <w:tcPr>
-            <w:tcW w:type="dxa" w:w="936"/>
+            <w:tcW w:type="dxa" w:w="896"/>
           </w:tcPr>
           <w:p>
             <w:pPr>
@@ -26572,7 +26713,7 @@
         </w:tc>
         <w:tc>
           <w:tcPr>
-            <w:tcW w:type="dxa" w:w="936"/>
+            <w:tcW w:type="dxa" w:w="896"/>
           </w:tcPr>
           <w:p>
             <w:pPr>
@@ -26589,7 +26730,7 @@
         </w:tc>
         <w:tc>
           <w:tcPr>
-            <w:tcW w:type="dxa" w:w="936"/>
+            <w:tcW w:type="dxa" w:w="896"/>
           </w:tcPr>
           <w:p>
             <w:pPr>
@@ -26606,7 +26747,7 @@
         </w:tc>
         <w:tc>
           <w:tcPr>
-            <w:tcW w:type="dxa" w:w="1144"/>
+            <w:tcW w:type="dxa" w:w="1095"/>
           </w:tcPr>
           <w:p>
             <w:pPr>
@@ -26623,7 +26764,7 @@
         </w:tc>
         <w:tc>
           <w:tcPr>
-            <w:tcW w:type="dxa" w:w="1144"/>
+            <w:tcW w:type="dxa" w:w="1095"/>
           </w:tcPr>
           <w:p>
             <w:pPr>
@@ -26640,7 +26781,7 @@
         </w:tc>
         <w:tc>
           <w:tcPr>
-            <w:tcW w:type="dxa" w:w="1040"/>
+            <w:tcW w:type="dxa" w:w="995"/>
           </w:tcPr>
           <w:p>
             <w:pPr>
@@ -26680,7 +26821,7 @@
         </w:tc>
         <w:tc>
           <w:tcPr>
-            <w:tcW w:type="dxa" w:w="1040"/>
+            <w:tcW w:type="dxa" w:w="1394"/>
           </w:tcPr>
           <w:p>
             <w:pPr>
@@ -26697,7 +26838,7 @@
         </w:tc>
         <w:tc>
           <w:tcPr>
-            <w:tcW w:type="dxa" w:w="1040"/>
+            <w:tcW w:type="dxa" w:w="995"/>
           </w:tcPr>
           <w:p>
             <w:pPr>
@@ -26716,7 +26857,7 @@
       <w:tr>
         <w:tc>
           <w:tcPr>
-            <w:tcW w:type="dxa" w:w="1144"/>
+            <w:tcW w:type="dxa" w:w="1095"/>
           </w:tcPr>
           <w:p>
             <w:pPr>
@@ -26733,7 +26874,7 @@
         </w:tc>
         <w:tc>
           <w:tcPr>
-            <w:tcW w:type="dxa" w:w="936"/>
+            <w:tcW w:type="dxa" w:w="896"/>
           </w:tcPr>
           <w:p>
             <w:pPr>
@@ -26750,7 +26891,7 @@
         </w:tc>
         <w:tc>
           <w:tcPr>
-            <w:tcW w:type="dxa" w:w="936"/>
+            <w:tcW w:type="dxa" w:w="896"/>
           </w:tcPr>
           <w:p>
             <w:pPr>
@@ -26767,7 +26908,7 @@
         </w:tc>
         <w:tc>
           <w:tcPr>
-            <w:tcW w:type="dxa" w:w="936"/>
+            <w:tcW w:type="dxa" w:w="896"/>
           </w:tcPr>
           <w:p>
             <w:pPr>
@@ -26784,7 +26925,7 @@
         </w:tc>
         <w:tc>
           <w:tcPr>
-            <w:tcW w:type="dxa" w:w="1144"/>
+            <w:tcW w:type="dxa" w:w="1095"/>
           </w:tcPr>
           <w:p>
             <w:pPr>
@@ -26801,7 +26942,7 @@
         </w:tc>
         <w:tc>
           <w:tcPr>
-            <w:tcW w:type="dxa" w:w="1144"/>
+            <w:tcW w:type="dxa" w:w="1095"/>
           </w:tcPr>
           <w:p>
             <w:pPr>
@@ -26818,7 +26959,7 @@
         </w:tc>
         <w:tc>
           <w:tcPr>
-            <w:tcW w:type="dxa" w:w="1040"/>
+            <w:tcW w:type="dxa" w:w="995"/>
           </w:tcPr>
           <w:p>
             <w:pPr>
@@ -26858,7 +26999,7 @@
         </w:tc>
         <w:tc>
           <w:tcPr>
-            <w:tcW w:type="dxa" w:w="1040"/>
+            <w:tcW w:type="dxa" w:w="1394"/>
           </w:tcPr>
           <w:p>
             <w:pPr>
@@ -26875,7 +27016,7 @@
         </w:tc>
         <w:tc>
           <w:tcPr>
-            <w:tcW w:type="dxa" w:w="1040"/>
+            <w:tcW w:type="dxa" w:w="995"/>
           </w:tcPr>
           <w:p>
             <w:pPr>
@@ -26894,7 +27035,7 @@
       <w:tr>
         <w:tc>
           <w:tcPr>
-            <w:tcW w:type="dxa" w:w="1144"/>
+            <w:tcW w:type="dxa" w:w="1095"/>
           </w:tcPr>
           <w:p>
             <w:pPr>
@@ -26931,7 +27072,7 @@
         </w:tc>
         <w:tc>
           <w:tcPr>
-            <w:tcW w:type="dxa" w:w="936"/>
+            <w:tcW w:type="dxa" w:w="896"/>
           </w:tcPr>
           <w:p>
             <w:pPr>
@@ -26948,7 +27089,7 @@
         </w:tc>
         <w:tc>
           <w:tcPr>
-            <w:tcW w:type="dxa" w:w="936"/>
+            <w:tcW w:type="dxa" w:w="896"/>
           </w:tcPr>
           <w:p>
             <w:pPr>
@@ -26965,7 +27106,7 @@
         </w:tc>
         <w:tc>
           <w:tcPr>
-            <w:tcW w:type="dxa" w:w="936"/>
+            <w:tcW w:type="dxa" w:w="896"/>
           </w:tcPr>
           <w:p>
             <w:pPr>
@@ -26982,7 +27123,7 @@
         </w:tc>
         <w:tc>
           <w:tcPr>
-            <w:tcW w:type="dxa" w:w="1144"/>
+            <w:tcW w:type="dxa" w:w="1095"/>
           </w:tcPr>
           <w:p>
             <w:pPr>
@@ -26999,7 +27140,7 @@
         </w:tc>
         <w:tc>
           <w:tcPr>
-            <w:tcW w:type="dxa" w:w="1144"/>
+            <w:tcW w:type="dxa" w:w="1095"/>
           </w:tcPr>
           <w:p>
             <w:pPr>
@@ -27016,7 +27157,7 @@
         </w:tc>
         <w:tc>
           <w:tcPr>
-            <w:tcW w:type="dxa" w:w="1040"/>
+            <w:tcW w:type="dxa" w:w="995"/>
           </w:tcPr>
           <w:p>
             <w:pPr>
@@ -27056,7 +27197,7 @@
         </w:tc>
         <w:tc>
           <w:tcPr>
-            <w:tcW w:type="dxa" w:w="1040"/>
+            <w:tcW w:type="dxa" w:w="1394"/>
           </w:tcPr>
           <w:p>
             <w:pPr>
@@ -27073,7 +27214,7 @@
         </w:tc>
         <w:tc>
           <w:tcPr>
-            <w:tcW w:type="dxa" w:w="1040"/>
+            <w:tcW w:type="dxa" w:w="995"/>
           </w:tcPr>
           <w:p>
             <w:pPr>
@@ -27092,7 +27233,7 @@
       <w:tr>
         <w:tc>
           <w:tcPr>
-            <w:tcW w:type="dxa" w:w="1144"/>
+            <w:tcW w:type="dxa" w:w="1095"/>
           </w:tcPr>
           <w:p>
             <w:pPr>
@@ -27129,7 +27270,7 @@
         </w:tc>
         <w:tc>
           <w:tcPr>
-            <w:tcW w:type="dxa" w:w="936"/>
+            <w:tcW w:type="dxa" w:w="896"/>
           </w:tcPr>
           <w:p>
             <w:pPr>
@@ -27146,7 +27287,7 @@
         </w:tc>
         <w:tc>
           <w:tcPr>
-            <w:tcW w:type="dxa" w:w="936"/>
+            <w:tcW w:type="dxa" w:w="896"/>
           </w:tcPr>
           <w:p>
             <w:pPr>
@@ -27163,7 +27304,7 @@
         </w:tc>
         <w:tc>
           <w:tcPr>
-            <w:tcW w:type="dxa" w:w="936"/>
+            <w:tcW w:type="dxa" w:w="896"/>
           </w:tcPr>
           <w:p>
             <w:pPr>
@@ -27180,7 +27321,7 @@
         </w:tc>
         <w:tc>
           <w:tcPr>
-            <w:tcW w:type="dxa" w:w="1144"/>
+            <w:tcW w:type="dxa" w:w="1095"/>
           </w:tcPr>
           <w:p>
             <w:pPr>
@@ -27197,7 +27338,7 @@
         </w:tc>
         <w:tc>
           <w:tcPr>
-            <w:tcW w:type="dxa" w:w="1144"/>
+            <w:tcW w:type="dxa" w:w="1095"/>
           </w:tcPr>
           <w:p>
             <w:pPr>
@@ -27214,7 +27355,7 @@
         </w:tc>
         <w:tc>
           <w:tcPr>
-            <w:tcW w:type="dxa" w:w="1040"/>
+            <w:tcW w:type="dxa" w:w="995"/>
           </w:tcPr>
           <w:p>
             <w:pPr>
@@ -27254,7 +27395,7 @@
         </w:tc>
         <w:tc>
           <w:tcPr>
-            <w:tcW w:type="dxa" w:w="1040"/>
+            <w:tcW w:type="dxa" w:w="1394"/>
           </w:tcPr>
           <w:p>
             <w:pPr>
@@ -27271,7 +27412,7 @@
         </w:tc>
         <w:tc>
           <w:tcPr>
-            <w:tcW w:type="dxa" w:w="1040"/>
+            <w:tcW w:type="dxa" w:w="995"/>
           </w:tcPr>
           <w:p>
             <w:pPr>
@@ -27290,7 +27431,7 @@
       <w:tr>
         <w:tc>
           <w:tcPr>
-            <w:tcW w:type="dxa" w:w="1144"/>
+            <w:tcW w:type="dxa" w:w="1095"/>
           </w:tcPr>
           <w:p>
             <w:pPr>
@@ -27307,7 +27448,7 @@
         </w:tc>
         <w:tc>
           <w:tcPr>
-            <w:tcW w:type="dxa" w:w="936"/>
+            <w:tcW w:type="dxa" w:w="896"/>
           </w:tcPr>
           <w:p>
             <w:pPr>
@@ -27324,7 +27465,7 @@
         </w:tc>
         <w:tc>
           <w:tcPr>
-            <w:tcW w:type="dxa" w:w="936"/>
+            <w:tcW w:type="dxa" w:w="896"/>
           </w:tcPr>
           <w:p>
             <w:pPr>
@@ -27341,7 +27482,7 @@
         </w:tc>
         <w:tc>
           <w:tcPr>
-            <w:tcW w:type="dxa" w:w="936"/>
+            <w:tcW w:type="dxa" w:w="896"/>
           </w:tcPr>
           <w:p>
             <w:pPr>
@@ -27358,7 +27499,7 @@
         </w:tc>
         <w:tc>
           <w:tcPr>
-            <w:tcW w:type="dxa" w:w="1144"/>
+            <w:tcW w:type="dxa" w:w="1095"/>
           </w:tcPr>
           <w:p>
             <w:pPr>
@@ -27375,7 +27516,7 @@
         </w:tc>
         <w:tc>
           <w:tcPr>
-            <w:tcW w:type="dxa" w:w="1144"/>
+            <w:tcW w:type="dxa" w:w="1095"/>
           </w:tcPr>
           <w:p>
             <w:pPr>
@@ -27392,7 +27533,7 @@
         </w:tc>
         <w:tc>
           <w:tcPr>
-            <w:tcW w:type="dxa" w:w="1040"/>
+            <w:tcW w:type="dxa" w:w="995"/>
           </w:tcPr>
           <w:p>
             <w:pPr>
@@ -27432,7 +27573,7 @@
         </w:tc>
         <w:tc>
           <w:tcPr>
-            <w:tcW w:type="dxa" w:w="1040"/>
+            <w:tcW w:type="dxa" w:w="1394"/>
           </w:tcPr>
           <w:p>
             <w:pPr>
@@ -27449,7 +27590,7 @@
         </w:tc>
         <w:tc>
           <w:tcPr>
-            <w:tcW w:type="dxa" w:w="1040"/>
+            <w:tcW w:type="dxa" w:w="995"/>
           </w:tcPr>
           <w:p>
             <w:pPr>
@@ -27468,7 +27609,7 @@
       <w:tr>
         <w:tc>
           <w:tcPr>
-            <w:tcW w:type="dxa" w:w="1144"/>
+            <w:tcW w:type="dxa" w:w="1095"/>
           </w:tcPr>
           <w:p>
             <w:pPr>
@@ -27514,7 +27655,7 @@
         </w:tc>
         <w:tc>
           <w:tcPr>
-            <w:tcW w:type="dxa" w:w="936"/>
+            <w:tcW w:type="dxa" w:w="896"/>
           </w:tcPr>
           <w:p>
             <w:pPr>
@@ -27531,7 +27672,7 @@
         </w:tc>
         <w:tc>
           <w:tcPr>
-            <w:tcW w:type="dxa" w:w="936"/>
+            <w:tcW w:type="dxa" w:w="896"/>
           </w:tcPr>
           <w:p>
             <w:pPr>
@@ -27548,7 +27689,7 @@
         </w:tc>
         <w:tc>
           <w:tcPr>
-            <w:tcW w:type="dxa" w:w="936"/>
+            <w:tcW w:type="dxa" w:w="896"/>
           </w:tcPr>
           <w:p>
             <w:pPr>
@@ -27565,7 +27706,7 @@
         </w:tc>
         <w:tc>
           <w:tcPr>
-            <w:tcW w:type="dxa" w:w="1144"/>
+            <w:tcW w:type="dxa" w:w="1095"/>
           </w:tcPr>
           <w:p>
             <w:pPr>
@@ -27582,7 +27723,7 @@
         </w:tc>
         <w:tc>
           <w:tcPr>
-            <w:tcW w:type="dxa" w:w="1144"/>
+            <w:tcW w:type="dxa" w:w="1095"/>
           </w:tcPr>
           <w:p>
             <w:pPr>
@@ -27599,7 +27740,7 @@
         </w:tc>
         <w:tc>
           <w:tcPr>
-            <w:tcW w:type="dxa" w:w="1040"/>
+            <w:tcW w:type="dxa" w:w="995"/>
           </w:tcPr>
           <w:p>
             <w:pPr>
@@ -27639,7 +27780,7 @@
         </w:tc>
         <w:tc>
           <w:tcPr>
-            <w:tcW w:type="dxa" w:w="1040"/>
+            <w:tcW w:type="dxa" w:w="1394"/>
           </w:tcPr>
           <w:p>
             <w:pPr>
@@ -27656,7 +27797,7 @@
         </w:tc>
         <w:tc>
           <w:tcPr>
-            <w:tcW w:type="dxa" w:w="1040"/>
+            <w:tcW w:type="dxa" w:w="995"/>
           </w:tcPr>
           <w:p>
             <w:pPr>
@@ -52774,7 +52915,7 @@
         </w:numPr>
       </w:pPr>
       <w:r>
-        <w:t xml:space="preserve">Both lie above the target. Even the more extreme</w:t>
+        <w:t xml:space="preserve">Both lie above the target. With the more extreme</w:t>
       </w:r>
       <w:r>
         <w:t xml:space="preserve"> </w:t>
@@ -52797,7 +52938,36 @@
         <w:t xml:space="preserve"> </w:t>
       </w:r>
       <w:r>
-        <w:t xml:space="preserve">residual gives 3.16.</w:t>
+        <w:t xml:space="preserve">residual model, the point estimate is 3.16;</w:t>
+      </w:r>
+      <w:r>
+        <w:t xml:space="preserve"> </w:t>
+      </w:r>
+      <w:r>
+        <w:t xml:space="preserve">no confidence interval or lower bound was computed for the</w:t>
+      </w:r>
+      <w:r>
+        <w:t xml:space="preserve"> </w:t>
+      </w:r>
+      <m:oMath>
+        <m:sSub>
+          <m:e>
+            <m:r>
+              <m:t>t</m:t>
+            </m:r>
+          </m:e>
+          <m:sub>
+            <m:r>
+              <m:t>2</m:t>
+            </m:r>
+          </m:sub>
+        </m:sSub>
+      </m:oMath>
+      <w:r>
+        <w:t xml:space="preserve"> </w:t>
+      </w:r>
+      <w:r>
+        <w:t xml:space="preserve">model.</w:t>
       </w:r>
     </w:p>
     <w:p>
@@ -52860,7 +53030,10 @@
         <w:t xml:space="preserve"> </w:t>
       </w:r>
       <w:r>
-        <w:t xml:space="preserve">residual model and not under every tail model (</w:t>
+        <w:t xml:space="preserve">residual model and not under every tail model (the</w:t>
+      </w:r>
+      <w:r>
+        <w:t xml:space="preserve"> </w:t>
       </w:r>
       <m:oMath>
         <m:sSub>
@@ -52880,13 +53053,7 @@
         <w:t xml:space="preserve"> </w:t>
       </w:r>
       <w:r>
-        <w:t xml:space="preserve">gives</w:t>
-      </w:r>
-      <w:r>
-        <w:t xml:space="preserve"> </w:t>
-      </w:r>
-      <w:r>
-        <w:t xml:space="preserve">3.16). It is not a distribution-free bound, because the tail of</w:t>
+        <w:t xml:space="preserve">point estimate is 3.16). It is not a distribution-free bound, because the tail of</w:t>
       </w:r>
       <w:r>
         <w:t xml:space="preserve"> </w:t>
@@ -64311,7 +64478,7 @@
         <w:t xml:space="preserve"> </w:t>
       </w:r>
       <w:r>
-        <w:t xml:space="preserve">3.43 (3.16 under a</w:t>
+        <w:t xml:space="preserve">3.43. Under the more extreme</w:t>
       </w:r>
       <w:r>
         <w:t xml:space="preserve"> </w:t>
@@ -64334,7 +64501,13 @@
         <w:t xml:space="preserve"> </w:t>
       </w:r>
       <w:r>
-        <w:t xml:space="preserve">model). This is an engineering estimate conditional on the residual model,</w:t>
+        <w:t xml:space="preserve">residual model, the point estimate is 3.16 (no lower bound</w:t>
+      </w:r>
+      <w:r>
+        <w:t xml:space="preserve"> </w:t>
+      </w:r>
+      <w:r>
+        <w:t xml:space="preserve">was computed for that model). This is an engineering estimate conditional on the residual model,</w:t>
       </w:r>
       <w:r>
         <w:t xml:space="preserve"> </w:t>
@@ -64585,7 +64758,7 @@
         <w:rPr>
           <w:rStyle w:val="VerbatimChar"/>
         </w:rPr>
-        <w:t xml:space="preserve">c9122243242c</w:t>
+        <w:t xml:space="preserve">ccfd4ce7c014</w:t>
       </w:r>
       <w:r>
         <w:t xml:space="preserve"> </w:t>

</xml_diff>

<commit_message>
Record results commit c66d4fd3a8ae in the sixth-revision manuscript
Co-Authored-By: Claude Opus 5.5 <noreply@anthropic.com>
Claude-Session: https://claude.ai/code/session_01GFzJmMfEsX3LJEx4o2YoAb
</commit_message>
<xml_diff>
--- a/Research/reliability_optimization/paper/main.docx
+++ b/Research/reliability_optimization/paper/main.docx
@@ -1413,7 +1413,193 @@
         <w:t xml:space="preserve"> </w:t>
       </w:r>
       <w:r>
-        <w:t xml:space="preserve">both</w:t>
+        <w:t xml:space="preserve">each</w:t>
+      </w:r>
+      <w:r>
+        <w:t xml:space="preserve"> </w:t>
+      </w:r>
+      <w:r>
+        <w:t xml:space="preserve">target</w:t>
+      </w:r>
+      <w:r>
+        <w:t xml:space="preserve"> </w:t>
+      </w:r>
+      <w:r>
+        <w:t xml:space="preserve">with</w:t>
+      </w:r>
+      <w:r>
+        <w:t xml:space="preserve"> </w:t>
+      </w:r>
+      <w:r>
+        <w:t xml:space="preserve">marginal</w:t>
+      </w:r>
+      <w:r>
+        <w:t xml:space="preserve"> </w:t>
+      </w:r>
+      <w:r>
+        <w:t xml:space="preserve">95%</w:t>
+      </w:r>
+      <w:r>
+        <w:t xml:space="preserve"> </w:t>
+      </w:r>
+      <w:r>
+        <w:t xml:space="preserve">confidence</w:t>
+      </w:r>
+      <w:r>
+        <w:t xml:space="preserve"> </w:t>
+      </w:r>
+      <w:r>
+        <w:t xml:space="preserve">in</w:t>
+      </w:r>
+      <w:r>
+        <w:t xml:space="preserve"> </w:t>
+      </w:r>
+      <w:r>
+        <w:t xml:space="preserve">the</w:t>
+      </w:r>
+      <w:r>
+        <w:t xml:space="preserve"> </w:t>
+      </w:r>
+      <w:r>
+        <w:t xml:space="preserve">baseline</w:t>
+      </w:r>
+      <w:r>
+        <w:t xml:space="preserve"> </w:t>
+      </w:r>
+      <w:r>
+        <w:t xml:space="preserve">surrogate</w:t>
+      </w:r>
+      <w:r>
+        <w:t xml:space="preserve"> </w:t>
+      </w:r>
+      <w:r>
+        <w:t xml:space="preserve">model,</w:t>
+      </w:r>
+      <w:r>
+        <w:t xml:space="preserve"> </w:t>
+      </w:r>
+      <w:r>
+        <w:t xml:space="preserve">at</w:t>
+      </w:r>
+      <w:r>
+        <w:t xml:space="preserve"> </w:t>
+      </w:r>
+      <w:r>
+        <w:t xml:space="preserve">1.1–10.1%</w:t>
+      </w:r>
+      <w:r>
+        <w:t xml:space="preserve"> </w:t>
+      </w:r>
+      <w:r>
+        <w:t xml:space="preserve">more</w:t>
+      </w:r>
+      <w:r>
+        <w:t xml:space="preserve"> </w:t>
+      </w:r>
+      <w:r>
+        <w:t xml:space="preserve">steel.</w:t>
+      </w:r>
+      <w:r>
+        <w:t xml:space="preserve"> </w:t>
+      </w:r>
+      <w:r>
+        <w:t xml:space="preserve">With</w:t>
+      </w:r>
+      <w:r>
+        <w:t xml:space="preserve"> </w:t>
+      </w:r>
+      <w:r>
+        <w:t xml:space="preserve">confidence-bounded</w:t>
+      </w:r>
+      <w:r>
+        <w:t xml:space="preserve"> </w:t>
+      </w:r>
+      <w:r>
+        <w:t xml:space="preserve">constraints,</w:t>
+      </w:r>
+      <w:r>
+        <w:t xml:space="preserve"> </w:t>
+      </w:r>
+      <w:r>
+        <w:t xml:space="preserve">all</w:t>
+      </w:r>
+      <w:r>
+        <w:t xml:space="preserve"> </w:t>
+      </w:r>
+      <w:r>
+        <w:t xml:space="preserve">seven</w:t>
+      </w:r>
+      <w:r>
+        <w:t xml:space="preserve"> </w:t>
+      </w:r>
+      <w:r>
+        <w:t xml:space="preserve">did</w:t>
+      </w:r>
+      <w:r>
+        <w:t xml:space="preserve"> </w:t>
+      </w:r>
+      <w:r>
+        <w:t xml:space="preserve">so,</w:t>
+      </w:r>
+      <w:r>
+        <w:t xml:space="preserve"> </w:t>
+      </w:r>
+      <w:r>
+        <w:t xml:space="preserve">at</w:t>
+      </w:r>
+      <w:r>
+        <w:t xml:space="preserve"> </w:t>
+      </w:r>
+      <w:r>
+        <w:t xml:space="preserve">1.1–11.7%</w:t>
+      </w:r>
+      <w:r>
+        <w:t xml:space="preserve"> </w:t>
+      </w:r>
+      <w:r>
+        <w:t xml:space="preserve">more</w:t>
+      </w:r>
+      <w:r>
+        <w:t xml:space="preserve"> </w:t>
+      </w:r>
+      <w:r>
+        <w:t xml:space="preserve">steel;</w:t>
+      </w:r>
+      <w:r>
+        <w:t xml:space="preserve"> </w:t>
+      </w:r>
+      <w:r>
+        <w:t xml:space="preserve">each</w:t>
+      </w:r>
+      <w:r>
+        <w:t xml:space="preserve"> </w:t>
+      </w:r>
+      <w:r>
+        <w:t xml:space="preserve">design</w:t>
+      </w:r>
+      <w:r>
+        <w:t xml:space="preserve"> </w:t>
+      </w:r>
+      <w:r>
+        <w:t xml:space="preserve">also</w:t>
+      </w:r>
+      <w:r>
+        <w:t xml:space="preserve"> </w:t>
+      </w:r>
+      <w:r>
+        <w:t xml:space="preserve">met</w:t>
+      </w:r>
+      <w:r>
+        <w:t xml:space="preserve"> </w:t>
+      </w:r>
+      <w:r>
+        <w:t xml:space="preserve">its</w:t>
+      </w:r>
+      <w:r>
+        <w:t xml:space="preserve"> </w:t>
+      </w:r>
+      <w:r>
+        <w:t xml:space="preserve">three</w:t>
       </w:r>
       <w:r>
         <w:t xml:space="preserve"> </w:t>
@@ -1425,91 +1611,25 @@
         <w:t xml:space="preserve"> </w:t>
       </w:r>
       <w:r>
-        <w:t xml:space="preserve">with</w:t>
-      </w:r>
-      <w:r>
-        <w:t xml:space="preserve"> </w:t>
-      </w:r>
-      <w:r>
-        <w:t xml:space="preserve">95%</w:t>
-      </w:r>
-      <w:r>
-        <w:t xml:space="preserve"> </w:t>
-      </w:r>
-      <w:r>
-        <w:t xml:space="preserve">confidence</w:t>
-      </w:r>
-      <w:r>
-        <w:t xml:space="preserve"> </w:t>
-      </w:r>
-      <w:r>
-        <w:t xml:space="preserve">in</w:t>
-      </w:r>
-      <w:r>
-        <w:t xml:space="preserve"> </w:t>
-      </w:r>
-      <w:r>
-        <w:t xml:space="preserve">the</w:t>
-      </w:r>
-      <w:r>
-        <w:t xml:space="preserve"> </w:t>
-      </w:r>
-      <w:r>
-        <w:t xml:space="preserve">baseline</w:t>
-      </w:r>
-      <w:r>
-        <w:t xml:space="preserve"> </w:t>
-      </w:r>
-      <w:r>
-        <w:t xml:space="preserve">surrogate</w:t>
-      </w:r>
-      <w:r>
-        <w:t xml:space="preserve"> </w:t>
-      </w:r>
-      <w:r>
-        <w:t xml:space="preserve">model,</w:t>
-      </w:r>
-      <w:r>
-        <w:t xml:space="preserve"> </w:t>
-      </w:r>
-      <w:r>
-        <w:t xml:space="preserve">at</w:t>
-      </w:r>
-      <w:r>
-        <w:t xml:space="preserve"> </w:t>
-      </w:r>
-      <w:r>
-        <w:t xml:space="preserve">1.1–10.1%</w:t>
-      </w:r>
-      <w:r>
-        <w:t xml:space="preserve"> </w:t>
-      </w:r>
-      <w:r>
-        <w:t xml:space="preserve">more</w:t>
-      </w:r>
-      <w:r>
-        <w:t xml:space="preserve"> </w:t>
-      </w:r>
-      <w:r>
-        <w:t xml:space="preserve">steel.</w:t>
-      </w:r>
-      <w:r>
-        <w:t xml:space="preserve"> </w:t>
-      </w:r>
-      <w:r>
-        <w:t xml:space="preserve">With</w:t>
-      </w:r>
-      <w:r>
-        <w:t xml:space="preserve"> </w:t>
-      </w:r>
-      <w:r>
-        <w:t xml:space="preserve">confidence-bounded</w:t>
-      </w:r>
-      <w:r>
-        <w:t xml:space="preserve"> </w:t>
-      </w:r>
-      <w:r>
-        <w:t xml:space="preserve">constraints,</w:t>
+        <w:t xml:space="preserve">simultaneously</w:t>
+      </w:r>
+      <w:r>
+        <w:t xml:space="preserve"> </w:t>
+      </w:r>
+      <w:r>
+        <w:t xml:space="preserve">(Bonferroni),</w:t>
+      </w:r>
+      <w:r>
+        <w:t xml:space="preserve"> </w:t>
+      </w:r>
+      <w:r>
+        <w:t xml:space="preserve">but</w:t>
+      </w:r>
+      <w:r>
+        <w:t xml:space="preserve"> </w:t>
+      </w:r>
+      <w:r>
+        <w:t xml:space="preserve">not</w:t>
       </w:r>
       <w:r>
         <w:t xml:space="preserve"> </w:t>
@@ -1527,37 +1647,13 @@
         <w:t xml:space="preserve"> </w:t>
       </w:r>
       <w:r>
-        <w:t xml:space="preserve">did</w:t>
-      </w:r>
-      <w:r>
-        <w:t xml:space="preserve"> </w:t>
-      </w:r>
-      <w:r>
-        <w:t xml:space="preserve">so,</w:t>
-      </w:r>
-      <w:r>
-        <w:t xml:space="preserve"> </w:t>
-      </w:r>
-      <w:r>
-        <w:t xml:space="preserve">at</w:t>
-      </w:r>
-      <w:r>
-        <w:t xml:space="preserve"> </w:t>
-      </w:r>
-      <w:r>
-        <w:t xml:space="preserve">1.1–11.7%</w:t>
-      </w:r>
-      <w:r>
-        <w:t xml:space="preserve"> </w:t>
-      </w:r>
-      <w:r>
-        <w:t xml:space="preserve">more</w:t>
-      </w:r>
-      <w:r>
-        <w:t xml:space="preserve"> </w:t>
-      </w:r>
-      <w:r>
-        <w:t xml:space="preserve">steel.</w:t>
+        <w:t xml:space="preserve">designs</w:t>
+      </w:r>
+      <w:r>
+        <w:t xml:space="preserve"> </w:t>
+      </w:r>
+      <w:r>
+        <w:t xml:space="preserve">jointly.</w:t>
       </w:r>
       <w:r>
         <w:t xml:space="preserve"> </w:t>
@@ -11075,7 +11171,7 @@
         <w:t xml:space="preserve"> </w:t>
       </w:r>
       <w:r>
-        <w:t xml:space="preserve">final designs (Table 19). Second, for the base frame and the three-storey frame, the</w:t>
+        <w:t xml:space="preserve">final designs (Table 20). Second, for the base frame and the three-storey frame, the</w:t>
       </w:r>
       <w:r>
         <w:t xml:space="preserve"> </w:t>
@@ -14239,6 +14335,30 @@
       <w:r>
         <w:t xml:space="preserve">confidence.</w:t>
       </w:r>
+      <w:r>
+        <w:t xml:space="preserve"> </w:t>
+      </w:r>
+      <w:r>
+        <w:t xml:space="preserve">It is a marginal statement about one limit state of one design (see</w:t>
+      </w:r>
+      <w:r>
+        <w:t xml:space="preserve"> </w:t>
+      </w:r>
+      <w:r>
+        <w:t xml:space="preserve">“</w:t>
+      </w:r>
+      <w:r>
+        <w:t xml:space="preserve">Scope of confidence statements</w:t>
+      </w:r>
+      <w:r>
+        <w:t xml:space="preserve">”</w:t>
+      </w:r>
+      <w:r>
+        <w:t xml:space="preserve"> </w:t>
+      </w:r>
+      <w:r>
+        <w:t xml:space="preserve">below).</w:t>
+      </w:r>
     </w:p>
     <w:p>
       <w:pPr>
@@ -14497,6 +14617,215 @@
       </w:r>
       <w:r>
         <w:t xml:space="preserve">on the model under which it is computed.</w:t>
+      </w:r>
+    </w:p>
+    <w:p>
+      <w:pPr>
+        <w:pStyle w:val="BodyText"/>
+      </w:pPr>
+      <w:r>
+        <w:rPr>
+          <w:iCs/>
+          <w:i/>
+        </w:rPr>
+        <w:t xml:space="preserve">Scope of confidence statements.</w:t>
+      </w:r>
+      <w:r>
+        <w:t xml:space="preserve"> </w:t>
+      </w:r>
+      <w:r>
+        <w:t xml:space="preserve">The one-sided</w:t>
+      </w:r>
+      <w:r>
+        <w:t xml:space="preserve"> </w:t>
+      </w:r>
+      <m:oMath>
+        <m:r>
+          <m:t>95</m:t>
+        </m:r>
+        <m:r>
+          <m:rPr>
+            <m:sty m:val="p"/>
+          </m:rPr>
+          <m:t>%</m:t>
+        </m:r>
+      </m:oMath>
+      <w:r>
+        <w:t xml:space="preserve"> </w:t>
+      </w:r>
+      <w:r>
+        <w:t xml:space="preserve">lower confidence bounds reported for the</w:t>
+      </w:r>
+      <w:r>
+        <w:t xml:space="preserve"> </w:t>
+      </w:r>
+      <w:r>
+        <w:t xml:space="preserve">ULS, drift and deflection limit states are marginal bounds for the individual limit-state reliability</w:t>
+      </w:r>
+      <w:r>
+        <w:t xml:space="preserve"> </w:t>
+      </w:r>
+      <w:r>
+        <w:t xml:space="preserve">estimates, conditional on the adopted probabilistic and structural models. Satisfying each bound</w:t>
+      </w:r>
+      <w:r>
+        <w:t xml:space="preserve"> </w:t>
+      </w:r>
+      <w:r>
+        <w:t xml:space="preserve">separately does not, by itself, establish a simultaneous</w:t>
+      </w:r>
+      <w:r>
+        <w:t xml:space="preserve"> </w:t>
+      </w:r>
+      <m:oMath>
+        <m:r>
+          <m:t>95</m:t>
+        </m:r>
+        <m:r>
+          <m:rPr>
+            <m:sty m:val="p"/>
+          </m:rPr>
+          <m:t>%</m:t>
+        </m:r>
+      </m:oMath>
+      <w:r>
+        <w:t xml:space="preserve"> </w:t>
+      </w:r>
+      <w:r>
+        <w:t xml:space="preserve">confidence guarantee across all limit</w:t>
+      </w:r>
+      <w:r>
+        <w:t xml:space="preserve"> </w:t>
+      </w:r>
+      <w:r>
+        <w:t xml:space="preserve">states or across all frame configurations. Unless a simultaneous confidence procedure is applied,</w:t>
+      </w:r>
+      <w:r>
+        <w:t xml:space="preserve"> </w:t>
+      </w:r>
+      <w:r>
+        <w:t xml:space="preserve">statements that designs meet multiple reliability targets with</w:t>
+      </w:r>
+      <w:r>
+        <w:t xml:space="preserve"> </w:t>
+      </w:r>
+      <m:oMath>
+        <m:r>
+          <m:t>95</m:t>
+        </m:r>
+        <m:r>
+          <m:rPr>
+            <m:sty m:val="p"/>
+          </m:rPr>
+          <m:t>%</m:t>
+        </m:r>
+      </m:oMath>
+      <w:r>
+        <w:t xml:space="preserve"> </w:t>
+      </w:r>
+      <w:r>
+        <w:t xml:space="preserve">confidence should be</w:t>
+      </w:r>
+      <w:r>
+        <w:t xml:space="preserve"> </w:t>
+      </w:r>
+      <w:r>
+        <w:t xml:space="preserve">interpreted separately for each limit state and design. Where a simultaneous statement is made in</w:t>
+      </w:r>
+      <w:r>
+        <w:t xml:space="preserve"> </w:t>
+      </w:r>
+      <w:r>
+        <w:t xml:space="preserve">this paper, it uses the Bonferroni procedure: each of</w:t>
+      </w:r>
+      <w:r>
+        <w:t xml:space="preserve"> </w:t>
+      </w:r>
+      <m:oMath>
+        <m:r>
+          <m:t>m</m:t>
+        </m:r>
+      </m:oMath>
+      <w:r>
+        <w:t xml:space="preserve"> </w:t>
+      </w:r>
+      <w:r>
+        <w:t xml:space="preserve">bounds is computed at the one-sided level</w:t>
+      </w:r>
+      <w:r>
+        <w:t xml:space="preserve"> </w:t>
+      </w:r>
+      <m:oMath>
+        <m:r>
+          <m:t>1</m:t>
+        </m:r>
+        <m:r>
+          <m:rPr>
+            <m:sty m:val="p"/>
+          </m:rPr>
+          <m:t>−</m:t>
+        </m:r>
+        <m:r>
+          <m:t>0.05</m:t>
+        </m:r>
+        <m:r>
+          <m:rPr>
+            <m:sty m:val="p"/>
+          </m:rPr>
+          <m:t>/</m:t>
+        </m:r>
+        <m:r>
+          <m:t>m</m:t>
+        </m:r>
+      </m:oMath>
+      <w:r>
+        <w:t xml:space="preserve">, so that all</w:t>
+      </w:r>
+      <w:r>
+        <w:t xml:space="preserve"> </w:t>
+      </w:r>
+      <m:oMath>
+        <m:r>
+          <m:t>m</m:t>
+        </m:r>
+      </m:oMath>
+      <w:r>
+        <w:t xml:space="preserve"> </w:t>
+      </w:r>
+      <w:r>
+        <w:t xml:space="preserve">hold together with probability of at least</w:t>
+      </w:r>
+      <w:r>
+        <w:t xml:space="preserve"> </w:t>
+      </w:r>
+      <m:oMath>
+        <m:r>
+          <m:t>95</m:t>
+        </m:r>
+        <m:r>
+          <m:rPr>
+            <m:sty m:val="p"/>
+          </m:rPr>
+          <m:t>%</m:t>
+        </m:r>
+      </m:oMath>
+      <w:r>
+        <w:t xml:space="preserve"> </w:t>
+      </w:r>
+      <w:r>
+        <w:t xml:space="preserve">whatever the dependence</w:t>
+      </w:r>
+      <w:r>
+        <w:t xml:space="preserve"> </w:t>
+      </w:r>
+      <w:r>
+        <w:t xml:space="preserve">between the estimates (Section 4.6). These confidence statements address Monte Carlo</w:t>
+      </w:r>
+      <w:r>
+        <w:t xml:space="preserve"> </w:t>
+      </w:r>
+      <w:r>
+        <w:t xml:space="preserve">sampling uncertainty and do not eliminate model-form uncertainty or systematic approximation errors.</w:t>
       </w:r>
     </w:p>
     <w:p>
@@ -37572,13 +37901,13 @@
         </m:d>
       </m:oMath>
       <w:r>
-        <w:t xml:space="preserve">; both reliability constraints are active and both targets</w:t>
-      </w:r>
-      <w:r>
-        <w:t xml:space="preserve"> </w:t>
-      </w:r>
-      <w:r>
-        <w:t xml:space="preserve">are met with</w:t>
+        <w:t xml:space="preserve">; both reliability constraints are active and each target</w:t>
+      </w:r>
+      <w:r>
+        <w:t xml:space="preserve"> </w:t>
+      </w:r>
+      <w:r>
+        <w:t xml:space="preserve">is met with marginal</w:t>
       </w:r>
       <w:r>
         <w:t xml:space="preserve"> </w:t>
@@ -41048,7 +41377,7 @@
         <w:t xml:space="preserve"> </w:t>
       </w:r>
       <w:r>
-        <w:t xml:space="preserve">Among the deterministic designs that meet both targets with</w:t>
+        <w:t xml:space="preserve">Among the deterministic designs that meet each target with marginal</w:t>
       </w:r>
       <w:r>
         <w:t xml:space="preserve"> </w:t>
@@ -43140,7 +43469,7 @@
         <w:t xml:space="preserve"> </w:t>
       </w:r>
       <w:r>
-        <w:t xml:space="preserve">with</w:t>
+        <w:t xml:space="preserve">with marginal</w:t>
       </w:r>
       <w:r>
         <w:t xml:space="preserve"> </w:t>
@@ -43160,7 +43489,7 @@
         <w:t xml:space="preserve"> </w:t>
       </w:r>
       <w:r>
-        <w:t xml:space="preserve">confidence (claim L). Italic: neither interval below its target, but at least one target</w:t>
+        <w:t xml:space="preserve">confidence (claim L for each). Italic: neither interval below its target, but at least one target</w:t>
       </w:r>
       <w:r>
         <w:t xml:space="preserve"> </w:t>
@@ -43240,7 +43569,7 @@
         <w:tblStyle w:val="Table"/>
         <w:tblLook w:firstRow="1" w:lastRow="0" w:firstColumn="0" w:lastColumn="0" w:noHBand="0" w:noVBand="0" w:val="0020"/>
         <w:jc w:val="start"/>
-        <w:tblCaption w:val="Table 13. Optimum mass (kg) and verified \hat\beta_{ULS}/\hat\beta_{drift} of deterministic designs with four drift limits, of RBDO-C and of RBDO-C95 (10^6 samples). Bold: both targets met with 95\% confidence (claim L). Italic: neither interval below its target, but at least one target not met with 95\% confidence. \Delta m_1: RBDO-C relative to the lightest bold or italic design; \Delta m_2: RBDO-C95 relative to the lightest bold design."/>
+        <w:tblCaption w:val="Table 13. Optimum mass (kg) and verified \hat\beta_{ULS}/\hat\beta_{drift} of deterministic designs with four drift limits, of RBDO-C and of RBDO-C95 (10^6 samples). Bold: both targets met with marginal 95\% confidence (claim L for each). Italic: neither interval below its target, but at least one target not met with 95\% confidence. \Delta m_1: RBDO-C relative to the lightest bold or italic design; \Delta m_2: RBDO-C95 relative to the lightest bold design."/>
         <w:tblW w:w="9360" w:type="dxa"/>
         <w:tblLayout w:type="fixed"/>
         <w:tblBorders>
@@ -45197,7 +45526,7 @@
         <w:t xml:space="preserve"> </w:t>
       </w:r>
       <w:r>
-        <w:t xml:space="preserve">them meet both targets with</w:t>
+        <w:t xml:space="preserve">them meet each target with marginal</w:t>
       </w:r>
       <w:r>
         <w:t xml:space="preserve"> </w:t>
@@ -45540,7 +45869,7 @@
         <w:t xml:space="preserve"> </w:t>
       </w:r>
       <w:r>
-        <w:t xml:space="preserve">18). In the drift-governed frames (base, nine storeys, high wind) RBDO-C adds steel to</w:t>
+        <w:t xml:space="preserve">19). In the drift-governed frames (base, nine storeys, high wind) RBDO-C adds steel to</w:t>
       </w:r>
       <w:r>
         <w:t xml:space="preserve"> </w:t>
@@ -51829,7 +52158,7 @@
         <w:t xml:space="preserve"> </w:t>
       </w:r>
       <w:r>
-        <w:t xml:space="preserve">Table 16 compares the point-estimate designs</w:t>
+        <w:t xml:space="preserve">Table 17 compares the point-estimate designs</w:t>
       </w:r>
       <w:r>
         <w:t xml:space="preserve"> </w:t>
@@ -51847,7 +52176,7 @@
         <w:t xml:space="preserve"> </w:t>
       </w:r>
       <w:r>
-        <w:t xml:space="preserve">RBDO-C designs of six frames already meet both targets with</w:t>
+        <w:t xml:space="preserve">RBDO-C designs of six frames already meet each target with marginal</w:t>
       </w:r>
       <w:r>
         <w:t xml:space="preserve"> </w:t>
@@ -52030,13 +52359,13 @@
         <w:t xml:space="preserve"> </w:t>
       </w:r>
       <w:r>
-        <w:t xml:space="preserve">with a lower bound of 3.053. All RBDO-C95 designs therefore meet both targets</w:t>
-      </w:r>
-      <w:r>
-        <w:t xml:space="preserve"> </w:t>
-      </w:r>
-      <w:r>
-        <w:t xml:space="preserve">with</w:t>
+        <w:t xml:space="preserve">with a lower bound of 3.053. All RBDO-C95 designs therefore meet each target</w:t>
+      </w:r>
+      <w:r>
+        <w:t xml:space="preserve"> </w:t>
+      </w:r>
+      <w:r>
+        <w:t xml:space="preserve">with marginal</w:t>
       </w:r>
       <w:r>
         <w:t xml:space="preserve"> </w:t>
@@ -52056,19 +52385,13 @@
         <w:t xml:space="preserve"> </w:t>
       </w:r>
       <w:r>
-        <w:t xml:space="preserve">confidence in the baseline surrogate model, at 0 to 1.6% more steel than RBDO-C and 1.1 to</w:t>
-      </w:r>
-      <w:r>
-        <w:t xml:space="preserve"> </w:t>
-      </w:r>
-      <w:r>
-        <w:t xml:space="preserve">11.7% more than DDO. The confidence bound controls Monte Carlo sampling uncertainty only. It does not</w:t>
-      </w:r>
-      <w:r>
-        <w:t xml:space="preserve"> </w:t>
-      </w:r>
-      <w:r>
-        <w:t xml:space="preserve">remove systematic errors of the surrogate, which are examined next.</w:t>
+        <w:t xml:space="preserve">confidence in the baseline surrogate model, at 0 to 1.6% more steel than RBDO-C</w:t>
+      </w:r>
+      <w:r>
+        <w:t xml:space="preserve"> </w:t>
+      </w:r>
+      <w:r>
+        <w:t xml:space="preserve">and 1.1 to 11.7% more than DDO.</w:t>
       </w:r>
     </w:p>
     <w:p>
@@ -52080,70 +52403,76 @@
           <w:iCs/>
           <w:i/>
         </w:rPr>
-        <w:t xml:space="preserve">Drift bias of the surrogate.</w:t>
-      </w:r>
-      <w:r>
-        <w:t xml:space="preserve"> </w:t>
-      </w:r>
-      <w:r>
-        <w:t xml:space="preserve">The</w:t>
+        <w:t xml:space="preserve">Simultaneous confidence.</w:t>
+      </w:r>
+      <w:r>
+        <w:t xml:space="preserve"> </w:t>
+      </w:r>
+      <w:r>
+        <w:t xml:space="preserve">Table 16 gives the Bonferroni simultaneous lower</w:t>
+      </w:r>
+      <w:r>
+        <w:t xml:space="preserve"> </w:t>
+      </w:r>
+      <w:r>
+        <w:t xml:space="preserve">bounds for the RBDO-C95 designs, from the same</w:t>
       </w:r>
       <w:r>
         <w:t xml:space="preserve"> </w:t>
       </w:r>
       <m:oMath>
-        <m:sSub>
+        <m:sSup>
           <m:e>
             <m:r>
-              <m:t>B</m:t>
+              <m:t>10</m:t>
             </m:r>
           </m:e>
-          <m:sub>
-            <m:r>
-              <m:t>1</m:t>
-            </m:r>
-          </m:sub>
-        </m:sSub>
+          <m:sup>
+            <m:r>
+              <m:t>6</m:t>
+            </m:r>
+          </m:sup>
+        </m:sSup>
       </m:oMath>
       <w:r>
-        <w:t xml:space="preserve">–</w:t>
+        <w:t xml:space="preserve"> </w:t>
+      </w:r>
+      <w:r>
+        <w:t xml:space="preserve">verification samples. For each design taken on</w:t>
+      </w:r>
+      <w:r>
+        <w:t xml:space="preserve"> </w:t>
+      </w:r>
+      <w:r>
+        <w:t xml:space="preserve">its own (</w:t>
       </w:r>
       <m:oMath>
-        <m:sSub>
-          <m:e>
-            <m:r>
-              <m:t>B</m:t>
-            </m:r>
-          </m:e>
-          <m:sub>
-            <m:r>
-              <m:t>2</m:t>
-            </m:r>
-          </m:sub>
-        </m:sSub>
+        <m:r>
+          <m:t>m</m:t>
+        </m:r>
+        <m:r>
+          <m:rPr>
+            <m:sty m:val="p"/>
+          </m:rPr>
+          <m:t>=</m:t>
+        </m:r>
+        <m:r>
+          <m:t>3</m:t>
+        </m:r>
       </m:oMath>
       <w:r>
         <w:t xml:space="preserve"> </w:t>
       </w:r>
       <w:r>
-        <w:t xml:space="preserve">drifts are up to 1.0% lower than the</w:t>
-      </w:r>
-      <w:r>
-        <w:t xml:space="preserve"> </w:t>
-      </w:r>
-      <w:r>
-        <w:t xml:space="preserve">second-order drifts in some storeys (Section 3.2), and the random validation sets</w:t>
-      </w:r>
-      <w:r>
-        <w:t xml:space="preserve"> </w:t>
-      </w:r>
-      <w:r>
-        <w:t xml:space="preserve">show mean drift differences of</w:t>
+        <w:t xml:space="preserve">limit states, one-sided level</w:t>
       </w:r>
       <w:r>
         <w:t xml:space="preserve"> </w:t>
       </w:r>
       <m:oMath>
+        <m:r>
+          <m:t>1</m:t>
+        </m:r>
         <m:r>
           <m:rPr>
             <m:sty m:val="p"/>
@@ -52151,6 +52480,2129 @@
           <m:t>−</m:t>
         </m:r>
         <m:r>
+          <m:t>0.05</m:t>
+        </m:r>
+        <m:r>
+          <m:rPr>
+            <m:sty m:val="p"/>
+          </m:rPr>
+          <m:t>/</m:t>
+        </m:r>
+        <m:r>
+          <m:t>3</m:t>
+        </m:r>
+      </m:oMath>
+      <w:r>
+        <w:t xml:space="preserve">), every bound still exceeds its target, so</w:t>
+      </w:r>
+      <w:r>
+        <w:t xml:space="preserve"> </w:t>
+      </w:r>
+      <w:r>
+        <w:t xml:space="preserve">each design meets all three targets simultaneously with at least</w:t>
+      </w:r>
+      <w:r>
+        <w:t xml:space="preserve"> </w:t>
+      </w:r>
+      <m:oMath>
+        <m:r>
+          <m:t>95</m:t>
+        </m:r>
+        <m:r>
+          <m:rPr>
+            <m:sty m:val="p"/>
+          </m:rPr>
+          <m:t>%</m:t>
+        </m:r>
+      </m:oMath>
+      <w:r>
+        <w:t xml:space="preserve"> </w:t>
+      </w:r>
+      <w:r>
+        <w:t xml:space="preserve">confidence. For the family of</w:t>
+      </w:r>
+      <w:r>
+        <w:t xml:space="preserve"> </w:t>
+      </w:r>
+      <w:r>
+        <w:t xml:space="preserve">all seven designs (</w:t>
+      </w:r>
+      <m:oMath>
+        <m:r>
+          <m:t>m</m:t>
+        </m:r>
+        <m:r>
+          <m:rPr>
+            <m:sty m:val="p"/>
+          </m:rPr>
+          <m:t>=</m:t>
+        </m:r>
+        <m:r>
+          <m:t>21</m:t>
+        </m:r>
+      </m:oMath>
+      <w:r>
+        <w:t xml:space="preserve">, level</w:t>
+      </w:r>
+      <w:r>
+        <w:t xml:space="preserve"> </w:t>
+      </w:r>
+      <m:oMath>
+        <m:r>
+          <m:t>1</m:t>
+        </m:r>
+        <m:r>
+          <m:rPr>
+            <m:sty m:val="p"/>
+          </m:rPr>
+          <m:t>−</m:t>
+        </m:r>
+        <m:r>
+          <m:t>0.05</m:t>
+        </m:r>
+        <m:r>
+          <m:rPr>
+            <m:sty m:val="p"/>
+          </m:rPr>
+          <m:t>/</m:t>
+        </m:r>
+        <m:r>
+          <m:t>21</m:t>
+        </m:r>
+      </m:oMath>
+      <w:r>
+        <w:t xml:space="preserve">), all bounds exceed their targets except the ULS bound of</w:t>
+      </w:r>
+      <w:r>
+        <w:t xml:space="preserve"> </w:t>
+      </w:r>
+      <w:r>
+        <w:t xml:space="preserve">the low-wind frame, which falls to 2.995 against the target of 3.0. A simultaneous</w:t>
+      </w:r>
+      <w:r>
+        <w:t xml:space="preserve"> </w:t>
+      </w:r>
+      <m:oMath>
+        <m:r>
+          <m:t>95</m:t>
+        </m:r>
+        <m:r>
+          <m:rPr>
+            <m:sty m:val="p"/>
+          </m:rPr>
+          <m:t>%</m:t>
+        </m:r>
+      </m:oMath>
+      <w:r>
+        <w:t xml:space="preserve"> </w:t>
+      </w:r>
+      <w:r>
+        <w:t xml:space="preserve">statement</w:t>
+      </w:r>
+      <w:r>
+        <w:t xml:space="preserve"> </w:t>
+      </w:r>
+      <w:r>
+        <w:t xml:space="preserve">for all seven frames together therefore cannot be made; it holds for six frames, and for the</w:t>
+      </w:r>
+      <w:r>
+        <w:t xml:space="preserve"> </w:t>
+      </w:r>
+      <w:r>
+        <w:t xml:space="preserve">low-wind frame it fails by 0.005 in</w:t>
+      </w:r>
+      <w:r>
+        <w:t xml:space="preserve"> </w:t>
+      </w:r>
+      <m:oMath>
+        <m:sSub>
+          <m:e>
+            <m:r>
+              <m:t>β</m:t>
+            </m:r>
+          </m:e>
+          <m:sub>
+            <m:r>
+              <m:t>U</m:t>
+            </m:r>
+            <m:r>
+              <m:t>L</m:t>
+            </m:r>
+            <m:r>
+              <m:t>S</m:t>
+            </m:r>
+          </m:sub>
+        </m:sSub>
+      </m:oMath>
+      <w:r>
+        <w:t xml:space="preserve"> </w:t>
+      </w:r>
+      <w:r>
+        <w:t xml:space="preserve">because its marginal bound (3.005) is close to the</w:t>
+      </w:r>
+      <w:r>
+        <w:t xml:space="preserve"> </w:t>
+      </w:r>
+      <w:r>
+        <w:t xml:space="preserve">target. The marginal and simultaneous bounds differ by less than 0.03 in</w:t>
+      </w:r>
+      <w:r>
+        <w:t xml:space="preserve"> </w:t>
+      </w:r>
+      <m:oMath>
+        <m:sSub>
+          <m:e>
+            <m:r>
+              <m:t>β</m:t>
+            </m:r>
+          </m:e>
+          <m:sub>
+            <m:r>
+              <m:t>U</m:t>
+            </m:r>
+            <m:r>
+              <m:t>L</m:t>
+            </m:r>
+            <m:r>
+              <m:t>S</m:t>
+            </m:r>
+          </m:sub>
+        </m:sSub>
+      </m:oMath>
+      <w:r>
+        <w:t xml:space="preserve"> </w:t>
+      </w:r>
+      <w:r>
+        <w:t xml:space="preserve">and less than 0.01</w:t>
+      </w:r>
+      <w:r>
+        <w:t xml:space="preserve"> </w:t>
+      </w:r>
+      <w:r>
+        <w:t xml:space="preserve">in</w:t>
+      </w:r>
+      <w:r>
+        <w:t xml:space="preserve"> </w:t>
+      </w:r>
+      <m:oMath>
+        <m:sSub>
+          <m:e>
+            <m:r>
+              <m:t>β</m:t>
+            </m:r>
+          </m:e>
+          <m:sub>
+            <m:r>
+              <m:t>d</m:t>
+            </m:r>
+            <m:r>
+              <m:t>r</m:t>
+            </m:r>
+            <m:r>
+              <m:t>i</m:t>
+            </m:r>
+            <m:r>
+              <m:t>f</m:t>
+            </m:r>
+            <m:r>
+              <m:t>t</m:t>
+            </m:r>
+          </m:sub>
+        </m:sSub>
+      </m:oMath>
+      <w:r>
+        <w:t xml:space="preserve">, so the distinction is decisive only for designs within a few hundredths of a</w:t>
+      </w:r>
+      <w:r>
+        <w:t xml:space="preserve"> </w:t>
+      </w:r>
+      <w:r>
+        <w:t xml:space="preserve">target.</w:t>
+      </w:r>
+    </w:p>
+    <w:p>
+      <w:pPr>
+        <w:pStyle w:val="TableCaption"/>
+      </w:pPr>
+      <w:r>
+        <w:t xml:space="preserve">Table 16. RBDO-C95 designs: one-sided lower confidence bounds of the reliability indices (</w:t>
+      </w:r>
+      <m:oMath>
+        <m:sSup>
+          <m:e>
+            <m:r>
+              <m:t>10</m:t>
+            </m:r>
+          </m:e>
+          <m:sup>
+            <m:r>
+              <m:t>6</m:t>
+            </m:r>
+          </m:sup>
+        </m:sSup>
+      </m:oMath>
+      <w:r>
+        <w:t xml:space="preserve"> </w:t>
+      </w:r>
+      <w:r>
+        <w:t xml:space="preserve">independent samples, baseline surrogate model). Marginal:</w:t>
+      </w:r>
+      <w:r>
+        <w:t xml:space="preserve"> </w:t>
+      </w:r>
+      <m:oMath>
+        <m:r>
+          <m:t>95</m:t>
+        </m:r>
+        <m:r>
+          <m:rPr>
+            <m:sty m:val="p"/>
+          </m:rPr>
+          <m:t>%</m:t>
+        </m:r>
+      </m:oMath>
+      <w:r>
+        <w:t xml:space="preserve"> </w:t>
+      </w:r>
+      <w:r>
+        <w:t xml:space="preserve">bound for each limit state</w:t>
+      </w:r>
+      <w:r>
+        <w:t xml:space="preserve"> </w:t>
+      </w:r>
+      <w:r>
+        <w:t xml:space="preserve">separately.</w:t>
+      </w:r>
+      <w:r>
+        <w:t xml:space="preserve"> </w:t>
+      </w:r>
+      <m:oMath>
+        <m:r>
+          <m:t>m</m:t>
+        </m:r>
+        <m:r>
+          <m:rPr>
+            <m:sty m:val="p"/>
+          </m:rPr>
+          <m:t>=</m:t>
+        </m:r>
+        <m:r>
+          <m:t>3</m:t>
+        </m:r>
+      </m:oMath>
+      <w:r>
+        <w:t xml:space="preserve">: Bonferroni bounds that hold simultaneously for the three limit states of the design</w:t>
+      </w:r>
+      <w:r>
+        <w:t xml:space="preserve"> </w:t>
+      </w:r>
+      <w:r>
+        <w:t xml:space="preserve">with at least</w:t>
+      </w:r>
+      <w:r>
+        <w:t xml:space="preserve"> </w:t>
+      </w:r>
+      <m:oMath>
+        <m:r>
+          <m:t>95</m:t>
+        </m:r>
+        <m:r>
+          <m:rPr>
+            <m:sty m:val="p"/>
+          </m:rPr>
+          <m:t>%</m:t>
+        </m:r>
+      </m:oMath>
+      <w:r>
+        <w:t xml:space="preserve"> </w:t>
+      </w:r>
+      <w:r>
+        <w:t xml:space="preserve">confidence.</w:t>
+      </w:r>
+      <w:r>
+        <w:t xml:space="preserve"> </w:t>
+      </w:r>
+      <m:oMath>
+        <m:r>
+          <m:t>m</m:t>
+        </m:r>
+        <m:r>
+          <m:rPr>
+            <m:sty m:val="p"/>
+          </m:rPr>
+          <m:t>=</m:t>
+        </m:r>
+        <m:r>
+          <m:t>21</m:t>
+        </m:r>
+      </m:oMath>
+      <w:r>
+        <w:t xml:space="preserve">: Bonferroni bounds that hold simultaneously for all three limit</w:t>
+      </w:r>
+      <w:r>
+        <w:t xml:space="preserve"> </w:t>
+      </w:r>
+      <w:r>
+        <w:t xml:space="preserve">states of all seven designs. Bold: below the target. The deflection bounds come from zero observed</w:t>
+      </w:r>
+      <w:r>
+        <w:t xml:space="preserve"> </w:t>
+      </w:r>
+      <w:r>
+        <w:t xml:space="preserve">failures. The bounds address Monte Carlo sampling uncertainty only.</w:t>
+      </w:r>
+    </w:p>
+    <w:tbl>
+      <w:tblPr>
+        <w:tblStyle w:val="Table"/>
+        <w:tblLook w:firstRow="0" w:lastRow="0" w:firstColumn="0" w:lastColumn="0" w:noHBand="0" w:noVBand="0" w:val="0000"/>
+        <w:jc w:val="start"/>
+        <w:tblCaption w:val="Table 16. RBDO-C95 designs: one-sided lower confidence bounds of the reliability indices (10^6 independent samples, baseline surrogate model). Marginal: 95\% bound for each limit state separately. m=3: Bonferroni bounds that hold simultaneously for the three limit states of the design with at least 95\% confidence. m=21: Bonferroni bounds that hold simultaneously for all three limit states of all seven designs. Bold: below the target. The deflection bounds come from zero observed failures. The bounds address Monte Carlo sampling uncertainty only."/>
+        <w:tblW w:w="9360" w:type="dxa"/>
+        <w:tblLayout w:type="fixed"/>
+        <w:tblBorders>
+          <w:top w:val="single" w:sz="8" w:color="000000"/>
+          <w:bottom w:val="single" w:sz="8" w:color="000000"/>
+        </w:tblBorders>
+      </w:tblPr>
+      <w:tblGrid>
+        <w:gridCol w:w="905"/>
+        <w:gridCol w:w="1006"/>
+        <w:gridCol w:w="905"/>
+        <w:gridCol w:w="905"/>
+        <w:gridCol w:w="1006"/>
+        <w:gridCol w:w="905"/>
+        <w:gridCol w:w="905"/>
+        <w:gridCol w:w="1006"/>
+        <w:gridCol w:w="905"/>
+        <w:gridCol w:w="905"/>
+      </w:tblGrid>
+      <w:tr>
+        <w:tc>
+          <w:tcPr>
+            <w:tcW w:type="dxa" w:w="905"/>
+            <w:tcBorders>
+              <w:bottom w:val="single" w:sz="4" w:color="000000"/>
+            </w:tcBorders>
+          </w:tcPr>
+          <w:p>
+            <w:pPr>
+              <w:pStyle w:val="Compact"/>
+            </w:pPr>
+          </w:p>
+        </w:tc>
+        <w:tc>
+          <w:tcPr>
+            <w:tcW w:type="dxa" w:w="2816"/>
+            <w:gridSpan w:val="3"/>
+            <w:tcBorders>
+              <w:bottom w:val="single" w:sz="4" w:color="000000"/>
+            </w:tcBorders>
+          </w:tcPr>
+          <w:p>
+            <w:pPr>
+              <w:pStyle w:val="Compact"/>
+              <w:jc w:val="center"/>
+            </w:pPr>
+            <m:oMath>
+              <m:sSub>
+                <m:e>
+                  <m:r>
+                    <m:t>β</m:t>
+                  </m:r>
+                </m:e>
+                <m:sub>
+                  <m:r>
+                    <m:t>U</m:t>
+                  </m:r>
+                  <m:r>
+                    <m:t>L</m:t>
+                  </m:r>
+                  <m:r>
+                    <m:t>S</m:t>
+                  </m:r>
+                </m:sub>
+              </m:sSub>
+            </m:oMath>
+            <w:r>
+              <w:rPr>
+                <w:sz w:val="16"/>
+              </w:rPr>
+              <w:t xml:space="preserve"> </w:t>
+            </w:r>
+            <w:r>
+              <w:rPr>
+                <w:sz w:val="16"/>
+              </w:rPr>
+              <w:t xml:space="preserve">(target 3.0)</w:t>
+            </w:r>
+          </w:p>
+        </w:tc>
+        <w:tc>
+          <w:tcPr>
+            <w:tcW w:type="dxa" w:w="2816"/>
+            <w:gridSpan w:val="3"/>
+            <w:tcBorders>
+              <w:bottom w:val="single" w:sz="4" w:color="000000"/>
+            </w:tcBorders>
+          </w:tcPr>
+          <w:p>
+            <w:pPr>
+              <w:pStyle w:val="Compact"/>
+              <w:jc w:val="center"/>
+            </w:pPr>
+            <m:oMath>
+              <m:sSub>
+                <m:e>
+                  <m:r>
+                    <m:t>β</m:t>
+                  </m:r>
+                </m:e>
+                <m:sub>
+                  <m:r>
+                    <m:t>d</m:t>
+                  </m:r>
+                  <m:r>
+                    <m:t>r</m:t>
+                  </m:r>
+                  <m:r>
+                    <m:t>i</m:t>
+                  </m:r>
+                  <m:r>
+                    <m:t>f</m:t>
+                  </m:r>
+                  <m:r>
+                    <m:t>t</m:t>
+                  </m:r>
+                </m:sub>
+              </m:sSub>
+            </m:oMath>
+            <w:r>
+              <w:rPr>
+                <w:sz w:val="16"/>
+              </w:rPr>
+              <w:t xml:space="preserve"> </w:t>
+            </w:r>
+            <w:r>
+              <w:rPr>
+                <w:sz w:val="16"/>
+              </w:rPr>
+              <w:t xml:space="preserve">(target 1.5)</w:t>
+            </w:r>
+          </w:p>
+        </w:tc>
+        <w:tc>
+          <w:tcPr>
+            <w:tcW w:type="dxa" w:w="2816"/>
+            <w:gridSpan w:val="3"/>
+            <w:tcBorders>
+              <w:bottom w:val="single" w:sz="4" w:color="000000"/>
+            </w:tcBorders>
+          </w:tcPr>
+          <w:p>
+            <w:pPr>
+              <w:pStyle w:val="Compact"/>
+              <w:jc w:val="center"/>
+            </w:pPr>
+            <m:oMath>
+              <m:sSub>
+                <m:e>
+                  <m:r>
+                    <m:t>β</m:t>
+                  </m:r>
+                </m:e>
+                <m:sub>
+                  <m:r>
+                    <m:t>d</m:t>
+                  </m:r>
+                  <m:r>
+                    <m:t>e</m:t>
+                  </m:r>
+                  <m:r>
+                    <m:t>f</m:t>
+                  </m:r>
+                  <m:r>
+                    <m:t>l</m:t>
+                  </m:r>
+                </m:sub>
+              </m:sSub>
+            </m:oMath>
+            <w:r>
+              <w:rPr>
+                <w:sz w:val="16"/>
+              </w:rPr>
+              <w:t xml:space="preserve"> </w:t>
+            </w:r>
+            <w:r>
+              <w:rPr>
+                <w:sz w:val="16"/>
+              </w:rPr>
+              <w:t xml:space="preserve">(target 1.5)</w:t>
+            </w:r>
+          </w:p>
+        </w:tc>
+      </w:tr>
+      <w:tr>
+        <w:tc>
+          <w:tcPr>
+            <w:tcW w:type="dxa" w:w="905"/>
+          </w:tcPr>
+          <w:p>
+            <w:pPr>
+              <w:pStyle w:val="Compact"/>
+              <w:jc w:val="left"/>
+            </w:pPr>
+            <w:r>
+              <w:rPr>
+                <w:sz w:val="16"/>
+              </w:rPr>
+              <w:t xml:space="preserve">Frame</w:t>
+            </w:r>
+          </w:p>
+        </w:tc>
+        <w:tc>
+          <w:tcPr>
+            <w:tcW w:type="dxa" w:w="1006"/>
+          </w:tcPr>
+          <w:p>
+            <w:pPr>
+              <w:pStyle w:val="Compact"/>
+              <w:jc w:val="right"/>
+            </w:pPr>
+            <w:r>
+              <w:rPr>
+                <w:sz w:val="16"/>
+              </w:rPr>
+              <w:t xml:space="preserve">marginal</w:t>
+            </w:r>
+          </w:p>
+        </w:tc>
+        <w:tc>
+          <w:tcPr>
+            <w:tcW w:type="dxa" w:w="905"/>
+          </w:tcPr>
+          <w:p>
+            <w:pPr>
+              <w:pStyle w:val="Compact"/>
+              <w:jc w:val="right"/>
+            </w:pPr>
+            <m:oMath>
+              <m:r>
+                <m:t>m</m:t>
+              </m:r>
+              <m:r>
+                <m:rPr>
+                  <m:sty m:val="p"/>
+                </m:rPr>
+                <m:t>=</m:t>
+              </m:r>
+              <m:r>
+                <m:t>3</m:t>
+              </m:r>
+            </m:oMath>
+          </w:p>
+        </w:tc>
+        <w:tc>
+          <w:tcPr>
+            <w:tcW w:type="dxa" w:w="905"/>
+          </w:tcPr>
+          <w:p>
+            <w:pPr>
+              <w:pStyle w:val="Compact"/>
+              <w:jc w:val="right"/>
+            </w:pPr>
+            <m:oMath>
+              <m:r>
+                <m:t>m</m:t>
+              </m:r>
+              <m:r>
+                <m:rPr>
+                  <m:sty m:val="p"/>
+                </m:rPr>
+                <m:t>=</m:t>
+              </m:r>
+              <m:r>
+                <m:t>21</m:t>
+              </m:r>
+            </m:oMath>
+          </w:p>
+        </w:tc>
+        <w:tc>
+          <w:tcPr>
+            <w:tcW w:type="dxa" w:w="1006"/>
+          </w:tcPr>
+          <w:p>
+            <w:pPr>
+              <w:pStyle w:val="Compact"/>
+              <w:jc w:val="right"/>
+            </w:pPr>
+            <w:r>
+              <w:rPr>
+                <w:sz w:val="16"/>
+              </w:rPr>
+              <w:t xml:space="preserve">marginal</w:t>
+            </w:r>
+          </w:p>
+        </w:tc>
+        <w:tc>
+          <w:tcPr>
+            <w:tcW w:type="dxa" w:w="905"/>
+          </w:tcPr>
+          <w:p>
+            <w:pPr>
+              <w:pStyle w:val="Compact"/>
+              <w:jc w:val="right"/>
+            </w:pPr>
+            <m:oMath>
+              <m:r>
+                <m:t>m</m:t>
+              </m:r>
+              <m:r>
+                <m:rPr>
+                  <m:sty m:val="p"/>
+                </m:rPr>
+                <m:t>=</m:t>
+              </m:r>
+              <m:r>
+                <m:t>3</m:t>
+              </m:r>
+            </m:oMath>
+          </w:p>
+        </w:tc>
+        <w:tc>
+          <w:tcPr>
+            <w:tcW w:type="dxa" w:w="905"/>
+          </w:tcPr>
+          <w:p>
+            <w:pPr>
+              <w:pStyle w:val="Compact"/>
+              <w:jc w:val="right"/>
+            </w:pPr>
+            <m:oMath>
+              <m:r>
+                <m:t>m</m:t>
+              </m:r>
+              <m:r>
+                <m:rPr>
+                  <m:sty m:val="p"/>
+                </m:rPr>
+                <m:t>=</m:t>
+              </m:r>
+              <m:r>
+                <m:t>21</m:t>
+              </m:r>
+            </m:oMath>
+          </w:p>
+        </w:tc>
+        <w:tc>
+          <w:tcPr>
+            <w:tcW w:type="dxa" w:w="1006"/>
+          </w:tcPr>
+          <w:p>
+            <w:pPr>
+              <w:pStyle w:val="Compact"/>
+              <w:jc w:val="right"/>
+            </w:pPr>
+            <w:r>
+              <w:rPr>
+                <w:sz w:val="16"/>
+              </w:rPr>
+              <w:t xml:space="preserve">marginal</w:t>
+            </w:r>
+          </w:p>
+        </w:tc>
+        <w:tc>
+          <w:tcPr>
+            <w:tcW w:type="dxa" w:w="905"/>
+          </w:tcPr>
+          <w:p>
+            <w:pPr>
+              <w:pStyle w:val="Compact"/>
+              <w:jc w:val="right"/>
+            </w:pPr>
+            <m:oMath>
+              <m:r>
+                <m:t>m</m:t>
+              </m:r>
+              <m:r>
+                <m:rPr>
+                  <m:sty m:val="p"/>
+                </m:rPr>
+                <m:t>=</m:t>
+              </m:r>
+              <m:r>
+                <m:t>3</m:t>
+              </m:r>
+            </m:oMath>
+          </w:p>
+        </w:tc>
+        <w:tc>
+          <w:tcPr>
+            <w:tcW w:type="dxa" w:w="905"/>
+          </w:tcPr>
+          <w:p>
+            <w:pPr>
+              <w:pStyle w:val="Compact"/>
+              <w:jc w:val="right"/>
+            </w:pPr>
+            <m:oMath>
+              <m:r>
+                <m:t>m</m:t>
+              </m:r>
+              <m:r>
+                <m:rPr>
+                  <m:sty m:val="p"/>
+                </m:rPr>
+                <m:t>=</m:t>
+              </m:r>
+              <m:r>
+                <m:t>21</m:t>
+              </m:r>
+            </m:oMath>
+          </w:p>
+        </w:tc>
+      </w:tr>
+      <w:tr>
+        <w:tc>
+          <w:tcPr>
+            <w:tcW w:type="dxa" w:w="905"/>
+          </w:tcPr>
+          <w:p>
+            <w:pPr>
+              <w:pStyle w:val="Compact"/>
+              <w:jc w:val="left"/>
+            </w:pPr>
+            <w:r>
+              <w:rPr>
+                <w:sz w:val="16"/>
+              </w:rPr>
+              <w:t xml:space="preserve">3 storeys</w:t>
+            </w:r>
+          </w:p>
+        </w:tc>
+        <w:tc>
+          <w:tcPr>
+            <w:tcW w:type="dxa" w:w="1006"/>
+          </w:tcPr>
+          <w:p>
+            <w:pPr>
+              <w:pStyle w:val="Compact"/>
+              <w:jc w:val="right"/>
+            </w:pPr>
+            <w:r>
+              <w:rPr>
+                <w:sz w:val="16"/>
+              </w:rPr>
+              <w:t xml:space="preserve">3.053</w:t>
+            </w:r>
+          </w:p>
+        </w:tc>
+        <w:tc>
+          <w:tcPr>
+            <w:tcW w:type="dxa" w:w="905"/>
+          </w:tcPr>
+          <w:p>
+            <w:pPr>
+              <w:pStyle w:val="Compact"/>
+              <w:jc w:val="right"/>
+            </w:pPr>
+            <w:r>
+              <w:rPr>
+                <w:sz w:val="16"/>
+              </w:rPr>
+              <w:t xml:space="preserve">3.049</w:t>
+            </w:r>
+          </w:p>
+        </w:tc>
+        <w:tc>
+          <w:tcPr>
+            <w:tcW w:type="dxa" w:w="905"/>
+          </w:tcPr>
+          <w:p>
+            <w:pPr>
+              <w:pStyle w:val="Compact"/>
+              <w:jc w:val="right"/>
+            </w:pPr>
+            <w:r>
+              <w:rPr>
+                <w:sz w:val="16"/>
+              </w:rPr>
+              <w:t xml:space="preserve">3.043</w:t>
+            </w:r>
+          </w:p>
+        </w:tc>
+        <w:tc>
+          <w:tcPr>
+            <w:tcW w:type="dxa" w:w="1006"/>
+          </w:tcPr>
+          <w:p>
+            <w:pPr>
+              <w:pStyle w:val="Compact"/>
+              <w:jc w:val="right"/>
+            </w:pPr>
+            <w:r>
+              <w:rPr>
+                <w:sz w:val="16"/>
+              </w:rPr>
+              <w:t xml:space="preserve">2.542</w:t>
+            </w:r>
+          </w:p>
+        </w:tc>
+        <w:tc>
+          <w:tcPr>
+            <w:tcW w:type="dxa" w:w="905"/>
+          </w:tcPr>
+          <w:p>
+            <w:pPr>
+              <w:pStyle w:val="Compact"/>
+              <w:jc w:val="right"/>
+            </w:pPr>
+            <w:r>
+              <w:rPr>
+                <w:sz w:val="16"/>
+              </w:rPr>
+              <w:t xml:space="preserve">2.540</w:t>
+            </w:r>
+          </w:p>
+        </w:tc>
+        <w:tc>
+          <w:tcPr>
+            <w:tcW w:type="dxa" w:w="905"/>
+          </w:tcPr>
+          <w:p>
+            <w:pPr>
+              <w:pStyle w:val="Compact"/>
+              <w:jc w:val="right"/>
+            </w:pPr>
+            <w:r>
+              <w:rPr>
+                <w:sz w:val="16"/>
+              </w:rPr>
+              <w:t xml:space="preserve">2.536</w:t>
+            </w:r>
+          </w:p>
+        </w:tc>
+        <w:tc>
+          <w:tcPr>
+            <w:tcW w:type="dxa" w:w="1006"/>
+          </w:tcPr>
+          <w:p>
+            <w:pPr>
+              <w:pStyle w:val="Compact"/>
+              <w:jc w:val="right"/>
+            </w:pPr>
+            <w:r>
+              <w:rPr>
+                <w:sz w:val="16"/>
+              </w:rPr>
+              <w:t xml:space="preserve">4.527</w:t>
+            </w:r>
+          </w:p>
+        </w:tc>
+        <w:tc>
+          <w:tcPr>
+            <w:tcW w:type="dxa" w:w="905"/>
+          </w:tcPr>
+          <w:p>
+            <w:pPr>
+              <w:pStyle w:val="Compact"/>
+              <w:jc w:val="right"/>
+            </w:pPr>
+            <w:r>
+              <w:rPr>
+                <w:sz w:val="16"/>
+              </w:rPr>
+              <w:t xml:space="preserve">4.460</w:t>
+            </w:r>
+          </w:p>
+        </w:tc>
+        <w:tc>
+          <w:tcPr>
+            <w:tcW w:type="dxa" w:w="905"/>
+          </w:tcPr>
+          <w:p>
+            <w:pPr>
+              <w:pStyle w:val="Compact"/>
+              <w:jc w:val="right"/>
+            </w:pPr>
+            <w:r>
+              <w:rPr>
+                <w:sz w:val="16"/>
+              </w:rPr>
+              <w:t xml:space="preserve">4.376</w:t>
+            </w:r>
+          </w:p>
+        </w:tc>
+      </w:tr>
+      <w:tr>
+        <w:tc>
+          <w:tcPr>
+            <w:tcW w:type="dxa" w:w="905"/>
+          </w:tcPr>
+          <w:p>
+            <w:pPr>
+              <w:pStyle w:val="Compact"/>
+              <w:jc w:val="left"/>
+            </w:pPr>
+            <w:r>
+              <w:rPr>
+                <w:sz w:val="16"/>
+              </w:rPr>
+              <w:t xml:space="preserve">Base</w:t>
+            </w:r>
+          </w:p>
+        </w:tc>
+        <w:tc>
+          <w:tcPr>
+            <w:tcW w:type="dxa" w:w="1006"/>
+          </w:tcPr>
+          <w:p>
+            <w:pPr>
+              <w:pStyle w:val="Compact"/>
+              <w:jc w:val="right"/>
+            </w:pPr>
+            <w:r>
+              <w:rPr>
+                <w:sz w:val="16"/>
+              </w:rPr>
+              <w:t xml:space="preserve">3.109</w:t>
+            </w:r>
+          </w:p>
+        </w:tc>
+        <w:tc>
+          <w:tcPr>
+            <w:tcW w:type="dxa" w:w="905"/>
+          </w:tcPr>
+          <w:p>
+            <w:pPr>
+              <w:pStyle w:val="Compact"/>
+              <w:jc w:val="right"/>
+            </w:pPr>
+            <w:r>
+              <w:rPr>
+                <w:sz w:val="16"/>
+              </w:rPr>
+              <w:t xml:space="preserve">3.104</w:t>
+            </w:r>
+          </w:p>
+        </w:tc>
+        <w:tc>
+          <w:tcPr>
+            <w:tcW w:type="dxa" w:w="905"/>
+          </w:tcPr>
+          <w:p>
+            <w:pPr>
+              <w:pStyle w:val="Compact"/>
+              <w:jc w:val="right"/>
+            </w:pPr>
+            <w:r>
+              <w:rPr>
+                <w:sz w:val="16"/>
+              </w:rPr>
+              <w:t xml:space="preserve">3.098</w:t>
+            </w:r>
+          </w:p>
+        </w:tc>
+        <w:tc>
+          <w:tcPr>
+            <w:tcW w:type="dxa" w:w="1006"/>
+          </w:tcPr>
+          <w:p>
+            <w:pPr>
+              <w:pStyle w:val="Compact"/>
+              <w:jc w:val="right"/>
+            </w:pPr>
+            <w:r>
+              <w:rPr>
+                <w:sz w:val="16"/>
+              </w:rPr>
+              <w:t xml:space="preserve">1.547</w:t>
+            </w:r>
+          </w:p>
+        </w:tc>
+        <w:tc>
+          <w:tcPr>
+            <w:tcW w:type="dxa" w:w="905"/>
+          </w:tcPr>
+          <w:p>
+            <w:pPr>
+              <w:pStyle w:val="Compact"/>
+              <w:jc w:val="right"/>
+            </w:pPr>
+            <w:r>
+              <w:rPr>
+                <w:sz w:val="16"/>
+              </w:rPr>
+              <w:t xml:space="preserve">1.546</w:t>
+            </w:r>
+          </w:p>
+        </w:tc>
+        <w:tc>
+          <w:tcPr>
+            <w:tcW w:type="dxa" w:w="905"/>
+          </w:tcPr>
+          <w:p>
+            <w:pPr>
+              <w:pStyle w:val="Compact"/>
+              <w:jc w:val="right"/>
+            </w:pPr>
+            <w:r>
+              <w:rPr>
+                <w:sz w:val="16"/>
+              </w:rPr>
+              <w:t xml:space="preserve">1.545</w:t>
+            </w:r>
+          </w:p>
+        </w:tc>
+        <w:tc>
+          <w:tcPr>
+            <w:tcW w:type="dxa" w:w="1006"/>
+          </w:tcPr>
+          <w:p>
+            <w:pPr>
+              <w:pStyle w:val="Compact"/>
+              <w:jc w:val="right"/>
+            </w:pPr>
+            <w:r>
+              <w:rPr>
+                <w:sz w:val="16"/>
+              </w:rPr>
+              <w:t xml:space="preserve">4.527</w:t>
+            </w:r>
+          </w:p>
+        </w:tc>
+        <w:tc>
+          <w:tcPr>
+            <w:tcW w:type="dxa" w:w="905"/>
+          </w:tcPr>
+          <w:p>
+            <w:pPr>
+              <w:pStyle w:val="Compact"/>
+              <w:jc w:val="right"/>
+            </w:pPr>
+            <w:r>
+              <w:rPr>
+                <w:sz w:val="16"/>
+              </w:rPr>
+              <w:t xml:space="preserve">4.460</w:t>
+            </w:r>
+          </w:p>
+        </w:tc>
+        <w:tc>
+          <w:tcPr>
+            <w:tcW w:type="dxa" w:w="905"/>
+          </w:tcPr>
+          <w:p>
+            <w:pPr>
+              <w:pStyle w:val="Compact"/>
+              <w:jc w:val="right"/>
+            </w:pPr>
+            <w:r>
+              <w:rPr>
+                <w:sz w:val="16"/>
+              </w:rPr>
+              <w:t xml:space="preserve">4.376</w:t>
+            </w:r>
+          </w:p>
+        </w:tc>
+      </w:tr>
+      <w:tr>
+        <w:tc>
+          <w:tcPr>
+            <w:tcW w:type="dxa" w:w="905"/>
+          </w:tcPr>
+          <w:p>
+            <w:pPr>
+              <w:pStyle w:val="Compact"/>
+              <w:jc w:val="left"/>
+            </w:pPr>
+            <w:r>
+              <w:rPr>
+                <w:sz w:val="16"/>
+              </w:rPr>
+              <w:t xml:space="preserve">9 storeys</w:t>
+            </w:r>
+          </w:p>
+        </w:tc>
+        <w:tc>
+          <w:tcPr>
+            <w:tcW w:type="dxa" w:w="1006"/>
+          </w:tcPr>
+          <w:p>
+            <w:pPr>
+              <w:pStyle w:val="Compact"/>
+              <w:jc w:val="right"/>
+            </w:pPr>
+            <w:r>
+              <w:rPr>
+                <w:sz w:val="16"/>
+              </w:rPr>
+              <w:t xml:space="preserve">3.328</w:t>
+            </w:r>
+          </w:p>
+        </w:tc>
+        <w:tc>
+          <w:tcPr>
+            <w:tcW w:type="dxa" w:w="905"/>
+          </w:tcPr>
+          <w:p>
+            <w:pPr>
+              <w:pStyle w:val="Compact"/>
+              <w:jc w:val="right"/>
+            </w:pPr>
+            <w:r>
+              <w:rPr>
+                <w:sz w:val="16"/>
+              </w:rPr>
+              <w:t xml:space="preserve">3.321</w:t>
+            </w:r>
+          </w:p>
+        </w:tc>
+        <w:tc>
+          <w:tcPr>
+            <w:tcW w:type="dxa" w:w="905"/>
+          </w:tcPr>
+          <w:p>
+            <w:pPr>
+              <w:pStyle w:val="Compact"/>
+              <w:jc w:val="right"/>
+            </w:pPr>
+            <w:r>
+              <w:rPr>
+                <w:sz w:val="16"/>
+              </w:rPr>
+              <w:t xml:space="preserve">3.312</w:t>
+            </w:r>
+          </w:p>
+        </w:tc>
+        <w:tc>
+          <w:tcPr>
+            <w:tcW w:type="dxa" w:w="1006"/>
+          </w:tcPr>
+          <w:p>
+            <w:pPr>
+              <w:pStyle w:val="Compact"/>
+              <w:jc w:val="right"/>
+            </w:pPr>
+            <w:r>
+              <w:rPr>
+                <w:sz w:val="16"/>
+              </w:rPr>
+              <w:t xml:space="preserve">1.527</w:t>
+            </w:r>
+          </w:p>
+        </w:tc>
+        <w:tc>
+          <w:tcPr>
+            <w:tcW w:type="dxa" w:w="905"/>
+          </w:tcPr>
+          <w:p>
+            <w:pPr>
+              <w:pStyle w:val="Compact"/>
+              <w:jc w:val="right"/>
+            </w:pPr>
+            <w:r>
+              <w:rPr>
+                <w:sz w:val="16"/>
+              </w:rPr>
+              <w:t xml:space="preserve">1.526</w:t>
+            </w:r>
+          </w:p>
+        </w:tc>
+        <w:tc>
+          <w:tcPr>
+            <w:tcW w:type="dxa" w:w="905"/>
+          </w:tcPr>
+          <w:p>
+            <w:pPr>
+              <w:pStyle w:val="Compact"/>
+              <w:jc w:val="right"/>
+            </w:pPr>
+            <w:r>
+              <w:rPr>
+                <w:sz w:val="16"/>
+              </w:rPr>
+              <w:t xml:space="preserve">1.525</w:t>
+            </w:r>
+          </w:p>
+        </w:tc>
+        <w:tc>
+          <w:tcPr>
+            <w:tcW w:type="dxa" w:w="1006"/>
+          </w:tcPr>
+          <w:p>
+            <w:pPr>
+              <w:pStyle w:val="Compact"/>
+              <w:jc w:val="right"/>
+            </w:pPr>
+            <w:r>
+              <w:rPr>
+                <w:sz w:val="16"/>
+              </w:rPr>
+              <w:t xml:space="preserve">4.527</w:t>
+            </w:r>
+          </w:p>
+        </w:tc>
+        <w:tc>
+          <w:tcPr>
+            <w:tcW w:type="dxa" w:w="905"/>
+          </w:tcPr>
+          <w:p>
+            <w:pPr>
+              <w:pStyle w:val="Compact"/>
+              <w:jc w:val="right"/>
+            </w:pPr>
+            <w:r>
+              <w:rPr>
+                <w:sz w:val="16"/>
+              </w:rPr>
+              <w:t xml:space="preserve">4.460</w:t>
+            </w:r>
+          </w:p>
+        </w:tc>
+        <w:tc>
+          <w:tcPr>
+            <w:tcW w:type="dxa" w:w="905"/>
+          </w:tcPr>
+          <w:p>
+            <w:pPr>
+              <w:pStyle w:val="Compact"/>
+              <w:jc w:val="right"/>
+            </w:pPr>
+            <w:r>
+              <w:rPr>
+                <w:sz w:val="16"/>
+              </w:rPr>
+              <w:t xml:space="preserve">4.376</w:t>
+            </w:r>
+          </w:p>
+        </w:tc>
+      </w:tr>
+      <w:tr>
+        <w:tc>
+          <w:tcPr>
+            <w:tcW w:type="dxa" w:w="905"/>
+          </w:tcPr>
+          <w:p>
+            <w:pPr>
+              <w:pStyle w:val="Compact"/>
+              <w:jc w:val="left"/>
+            </w:pPr>
+            <w:r>
+              <w:rPr>
+                <w:sz w:val="16"/>
+              </w:rPr>
+              <w:t xml:space="preserve">Bay 6 m</w:t>
+            </w:r>
+          </w:p>
+        </w:tc>
+        <w:tc>
+          <w:tcPr>
+            <w:tcW w:type="dxa" w:w="1006"/>
+          </w:tcPr>
+          <w:p>
+            <w:pPr>
+              <w:pStyle w:val="Compact"/>
+              <w:jc w:val="right"/>
+            </w:pPr>
+            <w:r>
+              <w:rPr>
+                <w:sz w:val="16"/>
+              </w:rPr>
+              <w:t xml:space="preserve">3.709</w:t>
+            </w:r>
+          </w:p>
+        </w:tc>
+        <w:tc>
+          <w:tcPr>
+            <w:tcW w:type="dxa" w:w="905"/>
+          </w:tcPr>
+          <w:p>
+            <w:pPr>
+              <w:pStyle w:val="Compact"/>
+              <w:jc w:val="right"/>
+            </w:pPr>
+            <w:r>
+              <w:rPr>
+                <w:sz w:val="16"/>
+              </w:rPr>
+              <w:t xml:space="preserve">3.697</w:t>
+            </w:r>
+          </w:p>
+        </w:tc>
+        <w:tc>
+          <w:tcPr>
+            <w:tcW w:type="dxa" w:w="905"/>
+          </w:tcPr>
+          <w:p>
+            <w:pPr>
+              <w:pStyle w:val="Compact"/>
+              <w:jc w:val="right"/>
+            </w:pPr>
+            <w:r>
+              <w:rPr>
+                <w:sz w:val="16"/>
+              </w:rPr>
+              <w:t xml:space="preserve">3.680</w:t>
+            </w:r>
+          </w:p>
+        </w:tc>
+        <w:tc>
+          <w:tcPr>
+            <w:tcW w:type="dxa" w:w="1006"/>
+          </w:tcPr>
+          <w:p>
+            <w:pPr>
+              <w:pStyle w:val="Compact"/>
+              <w:jc w:val="right"/>
+            </w:pPr>
+            <w:r>
+              <w:rPr>
+                <w:sz w:val="16"/>
+              </w:rPr>
+              <w:t xml:space="preserve">1.542</w:t>
+            </w:r>
+          </w:p>
+        </w:tc>
+        <w:tc>
+          <w:tcPr>
+            <w:tcW w:type="dxa" w:w="905"/>
+          </w:tcPr>
+          <w:p>
+            <w:pPr>
+              <w:pStyle w:val="Compact"/>
+              <w:jc w:val="right"/>
+            </w:pPr>
+            <w:r>
+              <w:rPr>
+                <w:sz w:val="16"/>
+              </w:rPr>
+              <w:t xml:space="preserve">1.541</w:t>
+            </w:r>
+          </w:p>
+        </w:tc>
+        <w:tc>
+          <w:tcPr>
+            <w:tcW w:type="dxa" w:w="905"/>
+          </w:tcPr>
+          <w:p>
+            <w:pPr>
+              <w:pStyle w:val="Compact"/>
+              <w:jc w:val="right"/>
+            </w:pPr>
+            <w:r>
+              <w:rPr>
+                <w:sz w:val="16"/>
+              </w:rPr>
+              <w:t xml:space="preserve">1.540</w:t>
+            </w:r>
+          </w:p>
+        </w:tc>
+        <w:tc>
+          <w:tcPr>
+            <w:tcW w:type="dxa" w:w="1006"/>
+          </w:tcPr>
+          <w:p>
+            <w:pPr>
+              <w:pStyle w:val="Compact"/>
+              <w:jc w:val="right"/>
+            </w:pPr>
+            <w:r>
+              <w:rPr>
+                <w:sz w:val="16"/>
+              </w:rPr>
+              <w:t xml:space="preserve">4.527</w:t>
+            </w:r>
+          </w:p>
+        </w:tc>
+        <w:tc>
+          <w:tcPr>
+            <w:tcW w:type="dxa" w:w="905"/>
+          </w:tcPr>
+          <w:p>
+            <w:pPr>
+              <w:pStyle w:val="Compact"/>
+              <w:jc w:val="right"/>
+            </w:pPr>
+            <w:r>
+              <w:rPr>
+                <w:sz w:val="16"/>
+              </w:rPr>
+              <w:t xml:space="preserve">4.460</w:t>
+            </w:r>
+          </w:p>
+        </w:tc>
+        <w:tc>
+          <w:tcPr>
+            <w:tcW w:type="dxa" w:w="905"/>
+          </w:tcPr>
+          <w:p>
+            <w:pPr>
+              <w:pStyle w:val="Compact"/>
+              <w:jc w:val="right"/>
+            </w:pPr>
+            <w:r>
+              <w:rPr>
+                <w:sz w:val="16"/>
+              </w:rPr>
+              <w:t xml:space="preserve">4.376</w:t>
+            </w:r>
+          </w:p>
+        </w:tc>
+      </w:tr>
+      <w:tr>
+        <w:tc>
+          <w:tcPr>
+            <w:tcW w:type="dxa" w:w="905"/>
+          </w:tcPr>
+          <w:p>
+            <w:pPr>
+              <w:pStyle w:val="Compact"/>
+              <w:jc w:val="left"/>
+            </w:pPr>
+            <w:r>
+              <w:rPr>
+                <w:sz w:val="16"/>
+              </w:rPr>
+              <w:t xml:space="preserve">Bay 10 m</w:t>
+            </w:r>
+          </w:p>
+        </w:tc>
+        <w:tc>
+          <w:tcPr>
+            <w:tcW w:type="dxa" w:w="1006"/>
+          </w:tcPr>
+          <w:p>
+            <w:pPr>
+              <w:pStyle w:val="Compact"/>
+              <w:jc w:val="right"/>
+            </w:pPr>
+            <w:r>
+              <w:rPr>
+                <w:sz w:val="16"/>
+              </w:rPr>
+              <w:t xml:space="preserve">3.103</w:t>
+            </w:r>
+          </w:p>
+        </w:tc>
+        <w:tc>
+          <w:tcPr>
+            <w:tcW w:type="dxa" w:w="905"/>
+          </w:tcPr>
+          <w:p>
+            <w:pPr>
+              <w:pStyle w:val="Compact"/>
+              <w:jc w:val="right"/>
+            </w:pPr>
+            <w:r>
+              <w:rPr>
+                <w:sz w:val="16"/>
+              </w:rPr>
+              <w:t xml:space="preserve">3.099</w:t>
+            </w:r>
+          </w:p>
+        </w:tc>
+        <w:tc>
+          <w:tcPr>
+            <w:tcW w:type="dxa" w:w="905"/>
+          </w:tcPr>
+          <w:p>
+            <w:pPr>
+              <w:pStyle w:val="Compact"/>
+              <w:jc w:val="right"/>
+            </w:pPr>
+            <w:r>
+              <w:rPr>
+                <w:sz w:val="16"/>
+              </w:rPr>
+              <w:t xml:space="preserve">3.092</w:t>
+            </w:r>
+          </w:p>
+        </w:tc>
+        <w:tc>
+          <w:tcPr>
+            <w:tcW w:type="dxa" w:w="1006"/>
+          </w:tcPr>
+          <w:p>
+            <w:pPr>
+              <w:pStyle w:val="Compact"/>
+              <w:jc w:val="right"/>
+            </w:pPr>
+            <w:r>
+              <w:rPr>
+                <w:sz w:val="16"/>
+              </w:rPr>
+              <w:t xml:space="preserve">1.661</w:t>
+            </w:r>
+          </w:p>
+        </w:tc>
+        <w:tc>
+          <w:tcPr>
+            <w:tcW w:type="dxa" w:w="905"/>
+          </w:tcPr>
+          <w:p>
+            <w:pPr>
+              <w:pStyle w:val="Compact"/>
+              <w:jc w:val="right"/>
+            </w:pPr>
+            <w:r>
+              <w:rPr>
+                <w:sz w:val="16"/>
+              </w:rPr>
+              <w:t xml:space="preserve">1.660</w:t>
+            </w:r>
+          </w:p>
+        </w:tc>
+        <w:tc>
+          <w:tcPr>
+            <w:tcW w:type="dxa" w:w="905"/>
+          </w:tcPr>
+          <w:p>
+            <w:pPr>
+              <w:pStyle w:val="Compact"/>
+              <w:jc w:val="right"/>
+            </w:pPr>
+            <w:r>
+              <w:rPr>
+                <w:sz w:val="16"/>
+              </w:rPr>
+              <w:t xml:space="preserve">1.659</w:t>
+            </w:r>
+          </w:p>
+        </w:tc>
+        <w:tc>
+          <w:tcPr>
+            <w:tcW w:type="dxa" w:w="1006"/>
+          </w:tcPr>
+          <w:p>
+            <w:pPr>
+              <w:pStyle w:val="Compact"/>
+              <w:jc w:val="right"/>
+            </w:pPr>
+            <w:r>
+              <w:rPr>
+                <w:sz w:val="16"/>
+              </w:rPr>
+              <w:t xml:space="preserve">4.527</w:t>
+            </w:r>
+          </w:p>
+        </w:tc>
+        <w:tc>
+          <w:tcPr>
+            <w:tcW w:type="dxa" w:w="905"/>
+          </w:tcPr>
+          <w:p>
+            <w:pPr>
+              <w:pStyle w:val="Compact"/>
+              <w:jc w:val="right"/>
+            </w:pPr>
+            <w:r>
+              <w:rPr>
+                <w:sz w:val="16"/>
+              </w:rPr>
+              <w:t xml:space="preserve">4.460</w:t>
+            </w:r>
+          </w:p>
+        </w:tc>
+        <w:tc>
+          <w:tcPr>
+            <w:tcW w:type="dxa" w:w="905"/>
+          </w:tcPr>
+          <w:p>
+            <w:pPr>
+              <w:pStyle w:val="Compact"/>
+              <w:jc w:val="right"/>
+            </w:pPr>
+            <w:r>
+              <w:rPr>
+                <w:sz w:val="16"/>
+              </w:rPr>
+              <w:t xml:space="preserve">4.376</w:t>
+            </w:r>
+          </w:p>
+        </w:tc>
+      </w:tr>
+      <w:tr>
+        <w:tc>
+          <w:tcPr>
+            <w:tcW w:type="dxa" w:w="905"/>
+          </w:tcPr>
+          <w:p>
+            <w:pPr>
+              <w:pStyle w:val="Compact"/>
+              <w:jc w:val="left"/>
+            </w:pPr>
+            <m:oMath>
+              <m:sSub>
+                <m:e>
+                  <m:r>
+                    <m:t>p</m:t>
+                  </m:r>
+                </m:e>
+                <m:sub>
+                  <m:r>
+                    <m:t>w</m:t>
+                  </m:r>
+                </m:sub>
+              </m:sSub>
+            </m:oMath>
+            <w:r>
+              <w:rPr>
+                <w:sz w:val="16"/>
+              </w:rPr>
+              <w:t xml:space="preserve"> </w:t>
+            </w:r>
+            <w:r>
+              <w:rPr>
+                <w:sz w:val="16"/>
+              </w:rPr>
+              <w:t xml:space="preserve">= 0.8 kPa</w:t>
+            </w:r>
+          </w:p>
+        </w:tc>
+        <w:tc>
+          <w:tcPr>
+            <w:tcW w:type="dxa" w:w="1006"/>
+          </w:tcPr>
+          <w:p>
+            <w:pPr>
+              <w:pStyle w:val="Compact"/>
+              <w:jc w:val="right"/>
+            </w:pPr>
+            <w:r>
+              <w:rPr>
+                <w:sz w:val="16"/>
+              </w:rPr>
+              <w:t xml:space="preserve">3.005</w:t>
+            </w:r>
+          </w:p>
+        </w:tc>
+        <w:tc>
+          <w:tcPr>
+            <w:tcW w:type="dxa" w:w="905"/>
+          </w:tcPr>
+          <w:p>
+            <w:pPr>
+              <w:pStyle w:val="Compact"/>
+              <w:jc w:val="right"/>
+            </w:pPr>
+            <w:r>
+              <w:rPr>
+                <w:sz w:val="16"/>
+              </w:rPr>
+              <w:t xml:space="preserve">3.001</w:t>
+            </w:r>
+          </w:p>
+        </w:tc>
+        <w:tc>
+          <w:tcPr>
+            <w:tcW w:type="dxa" w:w="905"/>
+          </w:tcPr>
+          <w:p>
+            <w:pPr>
+              <w:pStyle w:val="Compact"/>
+              <w:jc w:val="right"/>
+            </w:pPr>
+            <w:r>
+              <w:rPr>
+                <w:bCs/>
+                <w:b/>
+                <w:sz w:val="16"/>
+              </w:rPr>
+              <w:t xml:space="preserve">2.995</w:t>
+            </w:r>
+          </w:p>
+        </w:tc>
+        <w:tc>
+          <w:tcPr>
+            <w:tcW w:type="dxa" w:w="1006"/>
+          </w:tcPr>
+          <w:p>
+            <w:pPr>
+              <w:pStyle w:val="Compact"/>
+              <w:jc w:val="right"/>
+            </w:pPr>
+            <w:r>
+              <w:rPr>
+                <w:sz w:val="16"/>
+              </w:rPr>
+              <w:t xml:space="preserve">1.605</w:t>
+            </w:r>
+          </w:p>
+        </w:tc>
+        <w:tc>
+          <w:tcPr>
+            <w:tcW w:type="dxa" w:w="905"/>
+          </w:tcPr>
+          <w:p>
+            <w:pPr>
+              <w:pStyle w:val="Compact"/>
+              <w:jc w:val="right"/>
+            </w:pPr>
+            <w:r>
+              <w:rPr>
+                <w:sz w:val="16"/>
+              </w:rPr>
+              <w:t xml:space="preserve">1.604</w:t>
+            </w:r>
+          </w:p>
+        </w:tc>
+        <w:tc>
+          <w:tcPr>
+            <w:tcW w:type="dxa" w:w="905"/>
+          </w:tcPr>
+          <w:p>
+            <w:pPr>
+              <w:pStyle w:val="Compact"/>
+              <w:jc w:val="right"/>
+            </w:pPr>
+            <w:r>
+              <w:rPr>
+                <w:sz w:val="16"/>
+              </w:rPr>
+              <w:t xml:space="preserve">1.603</w:t>
+            </w:r>
+          </w:p>
+        </w:tc>
+        <w:tc>
+          <w:tcPr>
+            <w:tcW w:type="dxa" w:w="1006"/>
+          </w:tcPr>
+          <w:p>
+            <w:pPr>
+              <w:pStyle w:val="Compact"/>
+              <w:jc w:val="right"/>
+            </w:pPr>
+            <w:r>
+              <w:rPr>
+                <w:sz w:val="16"/>
+              </w:rPr>
+              <w:t xml:space="preserve">4.527</w:t>
+            </w:r>
+          </w:p>
+        </w:tc>
+        <w:tc>
+          <w:tcPr>
+            <w:tcW w:type="dxa" w:w="905"/>
+          </w:tcPr>
+          <w:p>
+            <w:pPr>
+              <w:pStyle w:val="Compact"/>
+              <w:jc w:val="right"/>
+            </w:pPr>
+            <w:r>
+              <w:rPr>
+                <w:sz w:val="16"/>
+              </w:rPr>
+              <w:t xml:space="preserve">4.460</w:t>
+            </w:r>
+          </w:p>
+        </w:tc>
+        <w:tc>
+          <w:tcPr>
+            <w:tcW w:type="dxa" w:w="905"/>
+          </w:tcPr>
+          <w:p>
+            <w:pPr>
+              <w:pStyle w:val="Compact"/>
+              <w:jc w:val="right"/>
+            </w:pPr>
+            <w:r>
+              <w:rPr>
+                <w:sz w:val="16"/>
+              </w:rPr>
+              <w:t xml:space="preserve">4.376</w:t>
+            </w:r>
+          </w:p>
+        </w:tc>
+      </w:tr>
+      <w:tr>
+        <w:tc>
+          <w:tcPr>
+            <w:tcW w:type="dxa" w:w="905"/>
+          </w:tcPr>
+          <w:p>
+            <w:pPr>
+              <w:pStyle w:val="Compact"/>
+              <w:jc w:val="left"/>
+            </w:pPr>
+            <m:oMath>
+              <m:sSub>
+                <m:e>
+                  <m:r>
+                    <m:t>p</m:t>
+                  </m:r>
+                </m:e>
+                <m:sub>
+                  <m:r>
+                    <m:t>w</m:t>
+                  </m:r>
+                </m:sub>
+              </m:sSub>
+            </m:oMath>
+            <w:r>
+              <w:rPr>
+                <w:sz w:val="16"/>
+              </w:rPr>
+              <w:t xml:space="preserve"> </w:t>
+            </w:r>
+            <w:r>
+              <w:rPr>
+                <w:sz w:val="16"/>
+              </w:rPr>
+              <w:t xml:space="preserve">= 1.6 kPa</w:t>
+            </w:r>
+          </w:p>
+        </w:tc>
+        <w:tc>
+          <w:tcPr>
+            <w:tcW w:type="dxa" w:w="1006"/>
+          </w:tcPr>
+          <w:p>
+            <w:pPr>
+              <w:pStyle w:val="Compact"/>
+              <w:jc w:val="right"/>
+            </w:pPr>
+            <w:r>
+              <w:rPr>
+                <w:sz w:val="16"/>
+              </w:rPr>
+              <w:t xml:space="preserve">3.154</w:t>
+            </w:r>
+          </w:p>
+        </w:tc>
+        <w:tc>
+          <w:tcPr>
+            <w:tcW w:type="dxa" w:w="905"/>
+          </w:tcPr>
+          <w:p>
+            <w:pPr>
+              <w:pStyle w:val="Compact"/>
+              <w:jc w:val="right"/>
+            </w:pPr>
+            <w:r>
+              <w:rPr>
+                <w:sz w:val="16"/>
+              </w:rPr>
+              <w:t xml:space="preserve">3.149</w:t>
+            </w:r>
+          </w:p>
+        </w:tc>
+        <w:tc>
+          <w:tcPr>
+            <w:tcW w:type="dxa" w:w="905"/>
+          </w:tcPr>
+          <w:p>
+            <w:pPr>
+              <w:pStyle w:val="Compact"/>
+              <w:jc w:val="right"/>
+            </w:pPr>
+            <w:r>
+              <w:rPr>
+                <w:sz w:val="16"/>
+              </w:rPr>
+              <w:t xml:space="preserve">3.142</w:t>
+            </w:r>
+          </w:p>
+        </w:tc>
+        <w:tc>
+          <w:tcPr>
+            <w:tcW w:type="dxa" w:w="1006"/>
+          </w:tcPr>
+          <w:p>
+            <w:pPr>
+              <w:pStyle w:val="Compact"/>
+              <w:jc w:val="right"/>
+            </w:pPr>
+            <w:r>
+              <w:rPr>
+                <w:sz w:val="16"/>
+              </w:rPr>
+              <w:t xml:space="preserve">1.530</w:t>
+            </w:r>
+          </w:p>
+        </w:tc>
+        <w:tc>
+          <w:tcPr>
+            <w:tcW w:type="dxa" w:w="905"/>
+          </w:tcPr>
+          <w:p>
+            <w:pPr>
+              <w:pStyle w:val="Compact"/>
+              <w:jc w:val="right"/>
+            </w:pPr>
+            <w:r>
+              <w:rPr>
+                <w:sz w:val="16"/>
+              </w:rPr>
+              <w:t xml:space="preserve">1.529</w:t>
+            </w:r>
+          </w:p>
+        </w:tc>
+        <w:tc>
+          <w:tcPr>
+            <w:tcW w:type="dxa" w:w="905"/>
+          </w:tcPr>
+          <w:p>
+            <w:pPr>
+              <w:pStyle w:val="Compact"/>
+              <w:jc w:val="right"/>
+            </w:pPr>
+            <w:r>
+              <w:rPr>
+                <w:sz w:val="16"/>
+              </w:rPr>
+              <w:t xml:space="preserve">1.528</w:t>
+            </w:r>
+          </w:p>
+        </w:tc>
+        <w:tc>
+          <w:tcPr>
+            <w:tcW w:type="dxa" w:w="1006"/>
+          </w:tcPr>
+          <w:p>
+            <w:pPr>
+              <w:pStyle w:val="Compact"/>
+              <w:jc w:val="right"/>
+            </w:pPr>
+            <w:r>
+              <w:rPr>
+                <w:sz w:val="16"/>
+              </w:rPr>
+              <w:t xml:space="preserve">4.527</w:t>
+            </w:r>
+          </w:p>
+        </w:tc>
+        <w:tc>
+          <w:tcPr>
+            <w:tcW w:type="dxa" w:w="905"/>
+          </w:tcPr>
+          <w:p>
+            <w:pPr>
+              <w:pStyle w:val="Compact"/>
+              <w:jc w:val="right"/>
+            </w:pPr>
+            <w:r>
+              <w:rPr>
+                <w:sz w:val="16"/>
+              </w:rPr>
+              <w:t xml:space="preserve">4.460</w:t>
+            </w:r>
+          </w:p>
+        </w:tc>
+        <w:tc>
+          <w:tcPr>
+            <w:tcW w:type="dxa" w:w="905"/>
+          </w:tcPr>
+          <w:p>
+            <w:pPr>
+              <w:pStyle w:val="Compact"/>
+              <w:jc w:val="right"/>
+            </w:pPr>
+            <w:r>
+              <w:rPr>
+                <w:sz w:val="16"/>
+              </w:rPr>
+              <w:t xml:space="preserve">4.376</w:t>
+            </w:r>
+          </w:p>
+        </w:tc>
+      </w:tr>
+    </w:tbl>
+    <w:p>
+      <w:pPr>
+        <w:pStyle w:val="BodyText"/>
+      </w:pPr>
+      <w:r>
+        <w:t xml:space="preserve">The confidence bound controls Monte Carlo sampling uncertainty only. It does not</w:t>
+      </w:r>
+      <w:r>
+        <w:t xml:space="preserve"> </w:t>
+      </w:r>
+      <w:r>
+        <w:t xml:space="preserve">remove systematic errors of the surrogate, which are examined next.</w:t>
+      </w:r>
+    </w:p>
+    <w:p>
+      <w:pPr>
+        <w:pStyle w:val="BodyText"/>
+      </w:pPr>
+      <w:r>
+        <w:rPr>
+          <w:iCs/>
+          <w:i/>
+        </w:rPr>
+        <w:t xml:space="preserve">Drift bias of the surrogate.</w:t>
+      </w:r>
+      <w:r>
+        <w:t xml:space="preserve"> </w:t>
+      </w:r>
+      <w:r>
+        <w:t xml:space="preserve">The</w:t>
+      </w:r>
+      <w:r>
+        <w:t xml:space="preserve"> </w:t>
+      </w:r>
+      <m:oMath>
+        <m:sSub>
+          <m:e>
+            <m:r>
+              <m:t>B</m:t>
+            </m:r>
+          </m:e>
+          <m:sub>
+            <m:r>
+              <m:t>1</m:t>
+            </m:r>
+          </m:sub>
+        </m:sSub>
+      </m:oMath>
+      <w:r>
+        <w:t xml:space="preserve">–</w:t>
+      </w:r>
+      <m:oMath>
+        <m:sSub>
+          <m:e>
+            <m:r>
+              <m:t>B</m:t>
+            </m:r>
+          </m:e>
+          <m:sub>
+            <m:r>
+              <m:t>2</m:t>
+            </m:r>
+          </m:sub>
+        </m:sSub>
+      </m:oMath>
+      <w:r>
+        <w:t xml:space="preserve"> </w:t>
+      </w:r>
+      <w:r>
+        <w:t xml:space="preserve">drifts are up to 1.0% lower than the</w:t>
+      </w:r>
+      <w:r>
+        <w:t xml:space="preserve"> </w:t>
+      </w:r>
+      <w:r>
+        <w:t xml:space="preserve">second-order drifts in some storeys (Section 3.2), and the random validation sets</w:t>
+      </w:r>
+      <w:r>
+        <w:t xml:space="preserve"> </w:t>
+      </w:r>
+      <w:r>
+        <w:t xml:space="preserve">show mean drift differences of</w:t>
+      </w:r>
+      <w:r>
+        <w:t xml:space="preserve"> </w:t>
+      </w:r>
+      <m:oMath>
+        <m:r>
+          <m:rPr>
+            <m:sty m:val="p"/>
+          </m:rPr>
+          <m:t>−</m:t>
+        </m:r>
+        <m:r>
           <m:t>1.0</m:t>
         </m:r>
       </m:oMath>
@@ -52228,7 +54680,7 @@
         <w:t xml:space="preserve"> </w:t>
       </w:r>
       <w:r>
-        <w:t xml:space="preserve">(Table 16, last columns). The base and high-wind RBDO-C designs, whose drift indices are</w:t>
+        <w:t xml:space="preserve">(Table 17, last columns). The base and high-wind RBDO-C designs, whose drift indices are</w:t>
       </w:r>
       <w:r>
         <w:t xml:space="preserve"> </w:t>
@@ -53302,7 +55754,7 @@
         <w:t xml:space="preserve"> </w:t>
       </w:r>
       <w:r>
-        <w:t xml:space="preserve">Table 17 gives the designs obtained when the</w:t>
+        <w:t xml:space="preserve">Table 18 gives the designs obtained when the</w:t>
       </w:r>
       <w:r>
         <w:t xml:space="preserve"> </w:t>
@@ -53475,7 +55927,7 @@
         <w:pStyle w:val="TableCaption"/>
       </w:pPr>
       <w:r>
-        <w:t xml:space="preserve">Table 16. Point-estimate (RBDO-C) and confidence-bounded (RBDO-C95) designs (</w:t>
+        <w:t xml:space="preserve">Table 17. Point-estimate (RBDO-C) and confidence-bounded (RBDO-C95) designs (</w:t>
       </w:r>
       <m:oMath>
         <m:sSup>
@@ -53687,7 +56139,7 @@
         <w:tblStyle w:val="Table"/>
         <w:tblLook w:firstRow="1" w:lastRow="0" w:firstColumn="0" w:lastColumn="0" w:noHBand="0" w:noVBand="0" w:val="0020"/>
         <w:jc w:val="start"/>
-        <w:tblCaption w:val="Table 16. Point-estimate (RBDO-C) and confidence-bounded (RBDO-C95) designs (10^6 independent samples). \beta^{lcb}: one-sided 95\% lower confidence bound. Claim: L = lower bound \ge target (95\% confidence); P, I = point estimate \ge target, interval contains it; I = point estimate &lt; target, interval contains it; below = interval below the target. Last columns: drift index if all surrogate drifts are increased by 1%; a claim other than L there (base and high-wind RBDO-C: below; nine storeys, both formulations: P, I) marks a result that is sensitive to the B_1–B_2 drift approximation. The lower bounds address Monte Carlo sampling uncertainty only."/>
+        <w:tblCaption w:val="Table 17. Point-estimate (RBDO-C) and confidence-bounded (RBDO-C95) designs (10^6 independent samples). \beta^{lcb}: one-sided 95\% lower confidence bound. Claim: L = lower bound \ge target (95\% confidence); P, I = point estimate \ge target, interval contains it; I = point estimate &lt; target, interval contains it; below = interval below the target. Last columns: drift index if all surrogate drifts are increased by 1%; a claim other than L there (base and high-wind RBDO-C: below; nine storeys, both formulations: P, I) marks a result that is sensitive to the B_1–B_2 drift approximation. The lower bounds address Monte Carlo sampling uncertainty only."/>
         <w:tblW w:w="9360" w:type="dxa"/>
         <w:tblLayout w:type="fixed"/>
         <w:tblBorders>
@@ -56744,7 +59196,7 @@
         <w:pStyle w:val="TableCaption"/>
       </w:pPr>
       <w:r>
-        <w:t xml:space="preserve">Table 17. Model-uncertainty-aware designs (RBDO-C-MU), optimised for two frames only (three storeys and</w:t>
+        <w:t xml:space="preserve">Table 18. Model-uncertainty-aware designs (RBDO-C-MU), optimised for two frames only (three storeys and</w:t>
       </w:r>
       <w:r>
         <w:t xml:space="preserve"> </w:t>
@@ -56843,7 +59295,7 @@
         <w:tblStyle w:val="Table"/>
         <w:tblLook w:firstRow="1" w:lastRow="0" w:firstColumn="0" w:lastColumn="0" w:noHBand="0" w:noVBand="0" w:val="0020"/>
         <w:jc w:val="start"/>
-        <w:tblCaption w:val="Table 17. Model-uncertainty-aware designs (RBDO-C-MU), optimised for two frames only (three storeys and base): the reliability constraints include the model factors \theta_R,\theta_E,\theta_\delta with c.o.v. 0.05 (10^6 independent samples). Designs for c.o.v. 0.10 were not optimised. Last column: indices of the same designs without model factors."/>
+        <w:tblCaption w:val="Table 18. Model-uncertainty-aware designs (RBDO-C-MU), optimised for two frames only (three storeys and base): the reliability constraints include the model factors \theta_R,\theta_E,\theta_\delta with c.o.v. 0.05 (10^6 independent samples). Designs for c.o.v. 0.10 were not optimised. Last column: indices of the same designs without model factors."/>
         <w:tblW w:w="9360" w:type="dxa"/>
         <w:tblLayout w:type="fixed"/>
         <w:tblBorders>
@@ -57701,7 +60153,7 @@
         <w:pStyle w:val="FirstParagraph"/>
       </w:pPr>
       <w:r>
-        <w:t xml:space="preserve">Table 18 lists the number of distinct sections of the DDO and RBDO-C designs, the</w:t>
+        <w:t xml:space="preserve">Table 19 lists the number of distinct sections of the DDO and RBDO-C designs, the</w:t>
       </w:r>
       <w:r>
         <w:t xml:space="preserve"> </w:t>
@@ -57874,7 +60326,7 @@
         <w:pStyle w:val="TableCaption"/>
       </w:pPr>
       <w:r>
-        <w:t xml:space="preserve">Table 18. Distinct sections, change of column and beam mass, and cost premium of RBDO-C over DDO</w:t>
+        <w:t xml:space="preserve">Table 19. Distinct sections, change of column and beam mass, and cost premium of RBDO-C over DDO</w:t>
       </w:r>
       <w:r>
         <w:t xml:space="preserve"> </w:t>
@@ -57985,7 +60437,7 @@
         <w:tblStyle w:val="Table"/>
         <w:tblLook w:firstRow="0" w:lastRow="0" w:firstColumn="0" w:lastColumn="0" w:noHBand="0" w:noVBand="0" w:val="0000"/>
         <w:jc w:val="start"/>
-        <w:tblCaption w:val="Table 18. Distinct sections, change of column and beam mass, and cost premium of RBDO-C over DDO under the illustrative cost index C = m + \tau n_{sec} + \kappa m_{beam} (\tau in tonnes of steel per distinct section)."/>
+        <w:tblCaption w:val="Table 19. Distinct sections, change of column and beam mass, and cost premium of RBDO-C over DDO under the illustrative cost index C = m + \tau n_{sec} + \kappa m_{beam} (\tau in tonnes of steel per distinct section)."/>
         <w:tblW w:w="9360" w:type="dxa"/>
         <w:tblLayout w:type="fixed"/>
         <w:tblBorders>
@@ -60089,7 +62541,7 @@
         <w:pStyle w:val="BodyText"/>
       </w:pPr>
       <w:r>
-        <w:t xml:space="preserve">Model uncertainty has a larger effect on the absolute ULS indices (Table 19).</w:t>
+        <w:t xml:space="preserve">Model uncertainty has a larger effect on the absolute ULS indices (Table 20).</w:t>
       </w:r>
       <w:r>
         <w:t xml:space="preserve"> </w:t>
@@ -60265,7 +62717,7 @@
         <w:t xml:space="preserve"> </w:t>
       </w:r>
       <w:r>
-        <w:t xml:space="preserve">Section 4.6 (Table 17).</w:t>
+        <w:t xml:space="preserve">Section 4.6 (Table 18).</w:t>
       </w:r>
     </w:p>
     <w:p>
@@ -60340,7 +62792,7 @@
         <w:pStyle w:val="TableCaption"/>
       </w:pPr>
       <w:r>
-        <w:t xml:space="preserve">Table 19. Verified reliability indices of the final designs without and with frame-wide model</w:t>
+        <w:t xml:space="preserve">Table 20. Verified reliability indices of the final designs without and with frame-wide model</w:t>
       </w:r>
       <w:r>
         <w:t xml:space="preserve"> </w:t>
@@ -60443,7 +62895,7 @@
         <w:tblStyle w:val="Table"/>
         <w:tblLook w:firstRow="0" w:lastRow="0" w:firstColumn="0" w:lastColumn="0" w:noHBand="0" w:noVBand="0" w:val="0000"/>
         <w:jc w:val="start"/>
-        <w:tblCaption w:val="Table 19. Verified reliability indices of the final designs without and with frame-wide model uncertainty factors \theta_R, \theta_E and \theta_\delta (lognormal, unit mean, common c.o.v. 0.05 or 0.10; 10^6 samples)."/>
+        <w:tblCaption w:val="Table 20. Verified reliability indices of the final designs without and with frame-wide model uncertainty factors \theta_R, \theta_E and \theta_\delta (lognormal, unit mean, common c.o.v. 0.05 or 0.10; 10^6 samples)."/>
         <w:tblW w:w="9360" w:type="dxa"/>
         <w:tblLayout w:type="fixed"/>
         <w:tblBorders>
@@ -62876,7 +65328,7 @@
         <w:t xml:space="preserve"> </w:t>
       </w:r>
       <w:r>
-        <w:t xml:space="preserve">Against those that meet both targets with</w:t>
+        <w:t xml:space="preserve">Against those that meet each target with marginal</w:t>
       </w:r>
       <w:r>
         <w:t xml:space="preserve"> </w:t>
@@ -63027,7 +65479,7 @@
         <w:t xml:space="preserve"> </w:t>
       </w:r>
       <w:r>
-        <w:t xml:space="preserve">the indices by up to about 0.9 for a c.o.v. of 0.10 (Table 19). The validation</w:t>
+        <w:t xml:space="preserve">the indices by up to about 0.9 for a c.o.v. of 0.10 (Table 20). The validation</w:t>
       </w:r>
       <w:r>
         <w:t xml:space="preserve"> </w:t>
@@ -63367,7 +65819,7 @@
         <w:t xml:space="preserve"> </w:t>
       </w:r>
       <w:r>
-        <w:t xml:space="preserve">designs meet both targets with</w:t>
+        <w:t xml:space="preserve">designs meet each target with marginal</w:t>
       </w:r>
       <w:r>
         <w:t xml:space="preserve"> </w:t>
@@ -63387,7 +65839,45 @@
         <w:t xml:space="preserve"> </w:t>
       </w:r>
       <w:r>
-        <w:t xml:space="preserve">confidence (claim L) in the baseline surrogate model. It does not</w:t>
+        <w:t xml:space="preserve">confidence (claim L) in the baseline surrogate model,</w:t>
+      </w:r>
+      <w:r>
+        <w:t xml:space="preserve"> </w:t>
+      </w:r>
+      <w:r>
+        <w:t xml:space="preserve">and each design meets its three targets simultaneously with</w:t>
+      </w:r>
+      <w:r>
+        <w:t xml:space="preserve"> </w:t>
+      </w:r>
+      <m:oMath>
+        <m:r>
+          <m:t>95</m:t>
+        </m:r>
+        <m:r>
+          <m:rPr>
+            <m:sty m:val="p"/>
+          </m:rPr>
+          <m:t>%</m:t>
+        </m:r>
+      </m:oMath>
+      <w:r>
+        <w:t xml:space="preserve"> </w:t>
+      </w:r>
+      <w:r>
+        <w:t xml:space="preserve">confidence (Bonferroni,</w:t>
+      </w:r>
+      <w:r>
+        <w:t xml:space="preserve"> </w:t>
+      </w:r>
+      <w:r>
+        <w:t xml:space="preserve">Table 16). A simultaneous statement for all seven designs together fails</w:t>
+      </w:r>
+      <w:r>
+        <w:t xml:space="preserve"> </w:t>
+      </w:r>
+      <w:r>
+        <w:t xml:space="preserve">marginally for the ULS of the low-wind frame (2.995 against 3.0). It does not</w:t>
       </w:r>
       <w:r>
         <w:t xml:space="preserve"> </w:t>
@@ -63417,7 +65907,7 @@
         <w:t xml:space="preserve"> </w:t>
       </w:r>
       <w:r>
-        <w:t xml:space="preserve">lighter than the best RBDO-C run (Table 16). We therefore recommend RBDO-C95 whenever</w:t>
+        <w:t xml:space="preserve">lighter than the best RBDO-C run (Table 17). We therefore recommend RBDO-C95 whenever</w:t>
       </w:r>
       <w:r>
         <w:t xml:space="preserve"> </w:t>
@@ -64209,7 +66699,7 @@
         <w:t xml:space="preserve"> </w:t>
       </w:r>
       <w:r>
-        <w:t xml:space="preserve">seven met both targets with</w:t>
+        <w:t xml:space="preserve">seven met each target with marginal</w:t>
       </w:r>
       <w:r>
         <w:t xml:space="preserve"> </w:t>
@@ -64272,7 +66762,7 @@
         <w:t xml:space="preserve"> </w:t>
       </w:r>
       <w:r>
-        <w:t xml:space="preserve">designs met both targets with</w:t>
+        <w:t xml:space="preserve">designs met each target with marginal</w:t>
       </w:r>
       <w:r>
         <w:t xml:space="preserve"> </w:t>
@@ -64292,7 +66782,45 @@
         <w:t xml:space="preserve"> </w:t>
       </w:r>
       <w:r>
-        <w:t xml:space="preserve">confidence in the baseline surrogate model. They were 1.1–11.7%</w:t>
+        <w:t xml:space="preserve">confidence in the baseline surrogate model. Each design</w:t>
+      </w:r>
+      <w:r>
+        <w:t xml:space="preserve"> </w:t>
+      </w:r>
+      <w:r>
+        <w:t xml:space="preserve">also met its three targets simultaneously with</w:t>
+      </w:r>
+      <w:r>
+        <w:t xml:space="preserve"> </w:t>
+      </w:r>
+      <m:oMath>
+        <m:r>
+          <m:t>95</m:t>
+        </m:r>
+        <m:r>
+          <m:rPr>
+            <m:sty m:val="p"/>
+          </m:rPr>
+          <m:t>%</m:t>
+        </m:r>
+      </m:oMath>
+      <w:r>
+        <w:t xml:space="preserve"> </w:t>
+      </w:r>
+      <w:r>
+        <w:t xml:space="preserve">confidence (Bonferroni). A simultaneous statement</w:t>
+      </w:r>
+      <w:r>
+        <w:t xml:space="preserve"> </w:t>
+      </w:r>
+      <w:r>
+        <w:t xml:space="preserve">for all seven designs together holds except for the ULS of the low-wind frame, whose simultaneous</w:t>
+      </w:r>
+      <w:r>
+        <w:t xml:space="preserve"> </w:t>
+      </w:r>
+      <w:r>
+        <w:t xml:space="preserve">bound is 2.995 against a target of 3.0. They were 1.1–11.7%</w:t>
       </w:r>
       <w:r>
         <w:t xml:space="preserve"> </w:t>
@@ -64758,7 +67286,7 @@
         <w:rPr>
           <w:rStyle w:val="VerbatimChar"/>
         </w:rPr>
-        <w:t xml:space="preserve">ccfd4ce7c014</w:t>
+        <w:t xml:space="preserve">c66d4fd3a8ae</w:t>
       </w:r>
       <w:r>
         <w:t xml:space="preserve"> </w:t>

</xml_diff>